<commit_message>
Changes in AWATAR from 12.08.25 documented in Manual and Quickstart guide... pictures have still to be adapted.
</commit_message>
<xml_diff>
--- a/UserManual_AWATAR.docx
+++ b/UserManual_AWATAR.docx
@@ -29,6 +29,7 @@
         <w:t xml:space="preserve"> F</w:t>
       </w:r>
       <w:commentRangeStart w:id="1"/>
+      <w:commentRangeStart w:id="2"/>
       <w:r>
         <w:t>OR</w:t>
       </w:r>
@@ -43,6 +44,17 @@
         </w:rPr>
         <w:commentReference w:id="1"/>
       </w:r>
+      <w:commentRangeEnd w:id="2"/>
+      <w:r>
+        <w:rPr>
+          <w:rStyle w:val="Kommentarzeichen"/>
+          <w:rFonts w:eastAsiaTheme="minorHAnsi" w:cstheme="minorBidi"/>
+          <w:b w:val="0"/>
+          <w:spacing w:val="0"/>
+          <w:kern w:val="0"/>
+        </w:rPr>
+        <w:commentReference w:id="2"/>
+      </w:r>
       <w:r>
         <w:t xml:space="preserve"> </w:t>
       </w:r>
@@ -87,7 +99,23 @@
           <w:i/>
           <w:iCs/>
         </w:rPr>
-        <w:t>Milan Ončák, and Martin K. Beyer*</w:t>
+        <w:t xml:space="preserve">Milan </w:t>
+      </w:r>
+      <w:proofErr w:type="spellStart"/>
+      <w:r>
+        <w:rPr>
+          <w:i/>
+          <w:iCs/>
+        </w:rPr>
+        <w:t>Ončák</w:t>
+      </w:r>
+      <w:proofErr w:type="spellEnd"/>
+      <w:r>
+        <w:rPr>
+          <w:i/>
+          <w:iCs/>
+        </w:rPr>
+        <w:t>, and Martin K. Beyer*</w:t>
       </w:r>
     </w:p>
     <w:p>
@@ -190,7 +218,7 @@
       <w:r>
         <w:fldChar w:fldCharType="separate"/>
       </w:r>
-      <w:hyperlink w:anchor="_Toc195989090" w:history="1">
+      <w:hyperlink w:anchor="_Toc206019392" w:history="1">
         <w:r>
           <w:rPr>
             <w:rStyle w:val="Hyperlink"/>
@@ -217,7 +245,7 @@
             <w:noProof/>
             <w:webHidden/>
           </w:rPr>
-          <w:instrText xml:space="preserve"> PAGEREF _Toc195989090 \h </w:instrText>
+          <w:instrText xml:space="preserve"> PAGEREF _Toc206019392 \h </w:instrText>
         </w:r>
         <w:r>
           <w:rPr>
@@ -265,7 +293,7 @@
           <w14:ligatures w14:val="standardContextual"/>
         </w:rPr>
       </w:pPr>
-      <w:hyperlink w:anchor="_Toc195989091" w:history="1">
+      <w:hyperlink w:anchor="_Toc206019393" w:history="1">
         <w:r>
           <w:rPr>
             <w:rStyle w:val="Hyperlink"/>
@@ -292,7 +320,7 @@
             <w:noProof/>
             <w:webHidden/>
           </w:rPr>
-          <w:instrText xml:space="preserve"> PAGEREF _Toc195989091 \h </w:instrText>
+          <w:instrText xml:space="preserve"> PAGEREF _Toc206019393 \h </w:instrText>
         </w:r>
         <w:r>
           <w:rPr>
@@ -340,7 +368,7 @@
           <w14:ligatures w14:val="standardContextual"/>
         </w:rPr>
       </w:pPr>
-      <w:hyperlink w:anchor="_Toc195989092" w:history="1">
+      <w:hyperlink w:anchor="_Toc206019394" w:history="1">
         <w:r>
           <w:rPr>
             <w:rStyle w:val="Hyperlink"/>
@@ -367,7 +395,7 @@
             <w:noProof/>
             <w:webHidden/>
           </w:rPr>
-          <w:instrText xml:space="preserve"> PAGEREF _Toc195989092 \h </w:instrText>
+          <w:instrText xml:space="preserve"> PAGEREF _Toc206019394 \h </w:instrText>
         </w:r>
         <w:r>
           <w:rPr>
@@ -415,7 +443,7 @@
           <w14:ligatures w14:val="standardContextual"/>
         </w:rPr>
       </w:pPr>
-      <w:hyperlink w:anchor="_Toc195989093" w:history="1">
+      <w:hyperlink w:anchor="_Toc206019395" w:history="1">
         <w:r>
           <w:rPr>
             <w:rStyle w:val="Hyperlink"/>
@@ -442,7 +470,7 @@
             <w:noProof/>
             <w:webHidden/>
           </w:rPr>
-          <w:instrText xml:space="preserve"> PAGEREF _Toc195989093 \h </w:instrText>
+          <w:instrText xml:space="preserve"> PAGEREF _Toc206019395 \h </w:instrText>
         </w:r>
         <w:r>
           <w:rPr>
@@ -490,7 +518,7 @@
           <w14:ligatures w14:val="standardContextual"/>
         </w:rPr>
       </w:pPr>
-      <w:hyperlink w:anchor="_Toc195989094" w:history="1">
+      <w:hyperlink w:anchor="_Toc206019396" w:history="1">
         <w:r>
           <w:rPr>
             <w:rStyle w:val="Hyperlink"/>
@@ -517,7 +545,7 @@
             <w:noProof/>
             <w:webHidden/>
           </w:rPr>
-          <w:instrText xml:space="preserve"> PAGEREF _Toc195989094 \h </w:instrText>
+          <w:instrText xml:space="preserve"> PAGEREF _Toc206019396 \h </w:instrText>
         </w:r>
         <w:r>
           <w:rPr>
@@ -565,7 +593,7 @@
           <w14:ligatures w14:val="standardContextual"/>
         </w:rPr>
       </w:pPr>
-      <w:hyperlink w:anchor="_Toc195989095" w:history="1">
+      <w:hyperlink w:anchor="_Toc206019397" w:history="1">
         <w:r>
           <w:rPr>
             <w:rStyle w:val="Hyperlink"/>
@@ -592,7 +620,7 @@
             <w:noProof/>
             <w:webHidden/>
           </w:rPr>
-          <w:instrText xml:space="preserve"> PAGEREF _Toc195989095 \h </w:instrText>
+          <w:instrText xml:space="preserve"> PAGEREF _Toc206019397 \h </w:instrText>
         </w:r>
         <w:r>
           <w:rPr>
@@ -640,7 +668,7 @@
           <w14:ligatures w14:val="standardContextual"/>
         </w:rPr>
       </w:pPr>
-      <w:hyperlink w:anchor="_Toc195989096" w:history="1">
+      <w:hyperlink w:anchor="_Toc206019398" w:history="1">
         <w:r>
           <w:rPr>
             <w:rStyle w:val="Hyperlink"/>
@@ -667,7 +695,7 @@
             <w:noProof/>
             <w:webHidden/>
           </w:rPr>
-          <w:instrText xml:space="preserve"> PAGEREF _Toc195989096 \h </w:instrText>
+          <w:instrText xml:space="preserve"> PAGEREF _Toc206019398 \h </w:instrText>
         </w:r>
         <w:r>
           <w:rPr>
@@ -715,7 +743,7 @@
           <w14:ligatures w14:val="standardContextual"/>
         </w:rPr>
       </w:pPr>
-      <w:hyperlink w:anchor="_Toc195989097" w:history="1">
+      <w:hyperlink w:anchor="_Toc206019399" w:history="1">
         <w:r>
           <w:rPr>
             <w:rStyle w:val="Hyperlink"/>
@@ -742,7 +770,7 @@
             <w:noProof/>
             <w:webHidden/>
           </w:rPr>
-          <w:instrText xml:space="preserve"> PAGEREF _Toc195989097 \h </w:instrText>
+          <w:instrText xml:space="preserve"> PAGEREF _Toc206019399 \h </w:instrText>
         </w:r>
         <w:r>
           <w:rPr>
@@ -790,7 +818,7 @@
           <w14:ligatures w14:val="standardContextual"/>
         </w:rPr>
       </w:pPr>
-      <w:hyperlink w:anchor="_Toc195989098" w:history="1">
+      <w:hyperlink w:anchor="_Toc206019400" w:history="1">
         <w:r>
           <w:rPr>
             <w:rStyle w:val="Hyperlink"/>
@@ -817,7 +845,7 @@
             <w:noProof/>
             <w:webHidden/>
           </w:rPr>
-          <w:instrText xml:space="preserve"> PAGEREF _Toc195989098 \h </w:instrText>
+          <w:instrText xml:space="preserve"> PAGEREF _Toc206019400 \h </w:instrText>
         </w:r>
         <w:r>
           <w:rPr>
@@ -837,7 +865,7 @@
             <w:noProof/>
             <w:webHidden/>
           </w:rPr>
-          <w:t>14</w:t>
+          <w:t>13</w:t>
         </w:r>
         <w:r>
           <w:rPr>
@@ -865,27 +893,13 @@
           <w14:ligatures w14:val="standardContextual"/>
         </w:rPr>
       </w:pPr>
-      <w:hyperlink w:anchor="_Toc195989099" w:history="1">
+      <w:hyperlink w:anchor="_Toc206019401" w:history="1">
         <w:r>
           <w:rPr>
             <w:rStyle w:val="Hyperlink"/>
             <w:noProof/>
           </w:rPr>
-          <w:t xml:space="preserve">Perform master equation </w:t>
-        </w:r>
-        <w:r>
-          <w:rPr>
-            <w:rStyle w:val="Hyperlink"/>
-            <w:noProof/>
-          </w:rPr>
-          <w:t>m</w:t>
-        </w:r>
-        <w:r>
-          <w:rPr>
-            <w:rStyle w:val="Hyperlink"/>
-            <w:noProof/>
-          </w:rPr>
-          <w:t>odeling (MEM)</w:t>
+          <w:t>Perform master equation modeling (MEM)</w:t>
         </w:r>
         <w:r>
           <w:rPr>
@@ -906,7 +920,7 @@
             <w:noProof/>
             <w:webHidden/>
           </w:rPr>
-          <w:instrText xml:space="preserve"> PAGEREF _Toc195989099 \h </w:instrText>
+          <w:instrText xml:space="preserve"> PAGEREF _Toc206019401 \h </w:instrText>
         </w:r>
         <w:r>
           <w:rPr>
@@ -954,7 +968,7 @@
           <w14:ligatures w14:val="standardContextual"/>
         </w:rPr>
       </w:pPr>
-      <w:hyperlink w:anchor="_Toc195989100" w:history="1">
+      <w:hyperlink w:anchor="_Toc206019402" w:history="1">
         <w:r>
           <w:rPr>
             <w:rStyle w:val="Hyperlink"/>
@@ -981,7 +995,7 @@
             <w:noProof/>
             <w:webHidden/>
           </w:rPr>
-          <w:instrText xml:space="preserve"> PAGEREF _Toc195989100 \h </w:instrText>
+          <w:instrText xml:space="preserve"> PAGEREF _Toc206019402 \h </w:instrText>
         </w:r>
         <w:r>
           <w:rPr>
@@ -1029,7 +1043,7 @@
           <w14:ligatures w14:val="standardContextual"/>
         </w:rPr>
       </w:pPr>
-      <w:hyperlink w:anchor="_Toc195989101" w:history="1">
+      <w:hyperlink w:anchor="_Toc206019403" w:history="1">
         <w:r>
           <w:rPr>
             <w:rStyle w:val="Hyperlink"/>
@@ -1056,7 +1070,7 @@
             <w:noProof/>
             <w:webHidden/>
           </w:rPr>
-          <w:instrText xml:space="preserve"> PAGEREF _Toc195989101 \h </w:instrText>
+          <w:instrText xml:space="preserve"> PAGEREF _Toc206019403 \h </w:instrText>
         </w:r>
         <w:r>
           <w:rPr>
@@ -1104,7 +1118,7 @@
           <w14:ligatures w14:val="standardContextual"/>
         </w:rPr>
       </w:pPr>
-      <w:hyperlink w:anchor="_Toc195989102" w:history="1">
+      <w:hyperlink w:anchor="_Toc206019404" w:history="1">
         <w:r>
           <w:rPr>
             <w:rStyle w:val="Hyperlink"/>
@@ -1131,7 +1145,157 @@
             <w:noProof/>
             <w:webHidden/>
           </w:rPr>
-          <w:instrText xml:space="preserve"> PAGEREF _Toc195989102 \h </w:instrText>
+          <w:instrText xml:space="preserve"> PAGEREF _Toc206019404 \h </w:instrText>
+        </w:r>
+        <w:r>
+          <w:rPr>
+            <w:noProof/>
+            <w:webHidden/>
+          </w:rPr>
+        </w:r>
+        <w:r>
+          <w:rPr>
+            <w:noProof/>
+            <w:webHidden/>
+          </w:rPr>
+          <w:fldChar w:fldCharType="separate"/>
+        </w:r>
+        <w:r>
+          <w:rPr>
+            <w:noProof/>
+            <w:webHidden/>
+          </w:rPr>
+          <w:t>24</w:t>
+        </w:r>
+        <w:r>
+          <w:rPr>
+            <w:noProof/>
+            <w:webHidden/>
+          </w:rPr>
+          <w:fldChar w:fldCharType="end"/>
+        </w:r>
+      </w:hyperlink>
+    </w:p>
+    <w:p>
+      <w:pPr>
+        <w:pStyle w:val="Verzeichnis2"/>
+        <w:tabs>
+          <w:tab w:val="right" w:leader="dot" w:pos="9062"/>
+        </w:tabs>
+        <w:rPr>
+          <w:rFonts w:eastAsiaTheme="minorEastAsia"/>
+          <w:noProof/>
+          <w:color w:val="auto"/>
+          <w:kern w:val="2"/>
+          <w:sz w:val="24"/>
+          <w:szCs w:val="24"/>
+          <w:lang w:val="de-AT" w:eastAsia="de-AT"/>
+          <w14:ligatures w14:val="standardContextual"/>
+        </w:rPr>
+      </w:pPr>
+      <w:hyperlink w:anchor="_Toc206019405" w:history="1">
+        <w:r>
+          <w:rPr>
+            <w:rStyle w:val="Hyperlink"/>
+            <w:noProof/>
+          </w:rPr>
+          <w:t>General parameters</w:t>
+        </w:r>
+        <w:r>
+          <w:rPr>
+            <w:noProof/>
+            <w:webHidden/>
+          </w:rPr>
+          <w:tab/>
+        </w:r>
+        <w:r>
+          <w:rPr>
+            <w:noProof/>
+            <w:webHidden/>
+          </w:rPr>
+          <w:fldChar w:fldCharType="begin"/>
+        </w:r>
+        <w:r>
+          <w:rPr>
+            <w:noProof/>
+            <w:webHidden/>
+          </w:rPr>
+          <w:instrText xml:space="preserve"> PAGEREF _Toc206019405 \h </w:instrText>
+        </w:r>
+        <w:r>
+          <w:rPr>
+            <w:noProof/>
+            <w:webHidden/>
+          </w:rPr>
+        </w:r>
+        <w:r>
+          <w:rPr>
+            <w:noProof/>
+            <w:webHidden/>
+          </w:rPr>
+          <w:fldChar w:fldCharType="separate"/>
+        </w:r>
+        <w:r>
+          <w:rPr>
+            <w:noProof/>
+            <w:webHidden/>
+          </w:rPr>
+          <w:t>24</w:t>
+        </w:r>
+        <w:r>
+          <w:rPr>
+            <w:noProof/>
+            <w:webHidden/>
+          </w:rPr>
+          <w:fldChar w:fldCharType="end"/>
+        </w:r>
+      </w:hyperlink>
+    </w:p>
+    <w:p>
+      <w:pPr>
+        <w:pStyle w:val="Verzeichnis2"/>
+        <w:tabs>
+          <w:tab w:val="right" w:leader="dot" w:pos="9062"/>
+        </w:tabs>
+        <w:rPr>
+          <w:rFonts w:eastAsiaTheme="minorEastAsia"/>
+          <w:noProof/>
+          <w:color w:val="auto"/>
+          <w:kern w:val="2"/>
+          <w:sz w:val="24"/>
+          <w:szCs w:val="24"/>
+          <w:lang w:val="de-AT" w:eastAsia="de-AT"/>
+          <w14:ligatures w14:val="standardContextual"/>
+        </w:rPr>
+      </w:pPr>
+      <w:hyperlink w:anchor="_Toc206019406" w:history="1">
+        <w:r>
+          <w:rPr>
+            <w:rStyle w:val="Hyperlink"/>
+            <w:noProof/>
+          </w:rPr>
+          <w:t>Reaction channels</w:t>
+        </w:r>
+        <w:r>
+          <w:rPr>
+            <w:noProof/>
+            <w:webHidden/>
+          </w:rPr>
+          <w:tab/>
+        </w:r>
+        <w:r>
+          <w:rPr>
+            <w:noProof/>
+            <w:webHidden/>
+          </w:rPr>
+          <w:fldChar w:fldCharType="begin"/>
+        </w:r>
+        <w:r>
+          <w:rPr>
+            <w:noProof/>
+            <w:webHidden/>
+          </w:rPr>
+          <w:instrText xml:space="preserve"> PAGEREF _Toc206019406 \h </w:instrText>
         </w:r>
         <w:r>
           <w:rPr>
@@ -1179,157 +1343,7 @@
           <w14:ligatures w14:val="standardContextual"/>
         </w:rPr>
       </w:pPr>
-      <w:hyperlink w:anchor="_Toc195989103" w:history="1">
-        <w:r>
-          <w:rPr>
-            <w:rStyle w:val="Hyperlink"/>
-            <w:noProof/>
-          </w:rPr>
-          <w:t>General parameters</w:t>
-        </w:r>
-        <w:r>
-          <w:rPr>
-            <w:noProof/>
-            <w:webHidden/>
-          </w:rPr>
-          <w:tab/>
-        </w:r>
-        <w:r>
-          <w:rPr>
-            <w:noProof/>
-            <w:webHidden/>
-          </w:rPr>
-          <w:fldChar w:fldCharType="begin"/>
-        </w:r>
-        <w:r>
-          <w:rPr>
-            <w:noProof/>
-            <w:webHidden/>
-          </w:rPr>
-          <w:instrText xml:space="preserve"> PAGEREF _Toc195989103 \h </w:instrText>
-        </w:r>
-        <w:r>
-          <w:rPr>
-            <w:noProof/>
-            <w:webHidden/>
-          </w:rPr>
-        </w:r>
-        <w:r>
-          <w:rPr>
-            <w:noProof/>
-            <w:webHidden/>
-          </w:rPr>
-          <w:fldChar w:fldCharType="separate"/>
-        </w:r>
-        <w:r>
-          <w:rPr>
-            <w:noProof/>
-            <w:webHidden/>
-          </w:rPr>
-          <w:t>25</w:t>
-        </w:r>
-        <w:r>
-          <w:rPr>
-            <w:noProof/>
-            <w:webHidden/>
-          </w:rPr>
-          <w:fldChar w:fldCharType="end"/>
-        </w:r>
-      </w:hyperlink>
-    </w:p>
-    <w:p>
-      <w:pPr>
-        <w:pStyle w:val="Verzeichnis2"/>
-        <w:tabs>
-          <w:tab w:val="right" w:leader="dot" w:pos="9062"/>
-        </w:tabs>
-        <w:rPr>
-          <w:rFonts w:eastAsiaTheme="minorEastAsia"/>
-          <w:noProof/>
-          <w:color w:val="auto"/>
-          <w:kern w:val="2"/>
-          <w:sz w:val="24"/>
-          <w:szCs w:val="24"/>
-          <w:lang w:val="de-AT" w:eastAsia="de-AT"/>
-          <w14:ligatures w14:val="standardContextual"/>
-        </w:rPr>
-      </w:pPr>
-      <w:hyperlink w:anchor="_Toc195989104" w:history="1">
-        <w:r>
-          <w:rPr>
-            <w:rStyle w:val="Hyperlink"/>
-            <w:noProof/>
-          </w:rPr>
-          <w:t>Reaction channels</w:t>
-        </w:r>
-        <w:r>
-          <w:rPr>
-            <w:noProof/>
-            <w:webHidden/>
-          </w:rPr>
-          <w:tab/>
-        </w:r>
-        <w:r>
-          <w:rPr>
-            <w:noProof/>
-            <w:webHidden/>
-          </w:rPr>
-          <w:fldChar w:fldCharType="begin"/>
-        </w:r>
-        <w:r>
-          <w:rPr>
-            <w:noProof/>
-            <w:webHidden/>
-          </w:rPr>
-          <w:instrText xml:space="preserve"> PAGEREF _Toc195989104 \h </w:instrText>
-        </w:r>
-        <w:r>
-          <w:rPr>
-            <w:noProof/>
-            <w:webHidden/>
-          </w:rPr>
-        </w:r>
-        <w:r>
-          <w:rPr>
-            <w:noProof/>
-            <w:webHidden/>
-          </w:rPr>
-          <w:fldChar w:fldCharType="separate"/>
-        </w:r>
-        <w:r>
-          <w:rPr>
-            <w:noProof/>
-            <w:webHidden/>
-          </w:rPr>
-          <w:t>25</w:t>
-        </w:r>
-        <w:r>
-          <w:rPr>
-            <w:noProof/>
-            <w:webHidden/>
-          </w:rPr>
-          <w:fldChar w:fldCharType="end"/>
-        </w:r>
-      </w:hyperlink>
-    </w:p>
-    <w:p>
-      <w:pPr>
-        <w:pStyle w:val="Verzeichnis2"/>
-        <w:tabs>
-          <w:tab w:val="right" w:leader="dot" w:pos="9062"/>
-        </w:tabs>
-        <w:rPr>
-          <w:rFonts w:eastAsiaTheme="minorEastAsia"/>
-          <w:noProof/>
-          <w:color w:val="auto"/>
-          <w:kern w:val="2"/>
-          <w:sz w:val="24"/>
-          <w:szCs w:val="24"/>
-          <w:lang w:val="de-AT" w:eastAsia="de-AT"/>
-          <w14:ligatures w14:val="standardContextual"/>
-        </w:rPr>
-      </w:pPr>
-      <w:hyperlink w:anchor="_Toc195989105" w:history="1">
+      <w:hyperlink w:anchor="_Toc206019407" w:history="1">
         <w:r>
           <w:rPr>
             <w:rStyle w:val="Hyperlink"/>
@@ -1356,7 +1370,7 @@
             <w:noProof/>
             <w:webHidden/>
           </w:rPr>
-          <w:instrText xml:space="preserve"> PAGEREF _Toc195989105 \h </w:instrText>
+          <w:instrText xml:space="preserve"> PAGEREF _Toc206019407 \h </w:instrText>
         </w:r>
         <w:r>
           <w:rPr>
@@ -1404,7 +1418,7 @@
           <w14:ligatures w14:val="standardContextual"/>
         </w:rPr>
       </w:pPr>
-      <w:hyperlink w:anchor="_Toc195989106" w:history="1">
+      <w:hyperlink w:anchor="_Toc206019408" w:history="1">
         <w:r>
           <w:rPr>
             <w:rStyle w:val="Hyperlink"/>
@@ -1431,7 +1445,7 @@
             <w:noProof/>
             <w:webHidden/>
           </w:rPr>
-          <w:instrText xml:space="preserve"> PAGEREF _Toc195989106 \h </w:instrText>
+          <w:instrText xml:space="preserve"> PAGEREF _Toc206019408 \h </w:instrText>
         </w:r>
         <w:r>
           <w:rPr>
@@ -1451,7 +1465,7 @@
             <w:noProof/>
             <w:webHidden/>
           </w:rPr>
-          <w:t>30</w:t>
+          <w:t>29</w:t>
         </w:r>
         <w:r>
           <w:rPr>
@@ -1479,13 +1493,13 @@
           <w14:ligatures w14:val="standardContextual"/>
         </w:rPr>
       </w:pPr>
-      <w:hyperlink w:anchor="_Toc195989107" w:history="1">
+      <w:hyperlink w:anchor="_Toc206019409" w:history="1">
         <w:r>
           <w:rPr>
             <w:rStyle w:val="Hyperlink"/>
             <w:noProof/>
           </w:rPr>
-          <w:t>References:</w:t>
+          <w:t>Acknowledgements</w:t>
         </w:r>
         <w:r>
           <w:rPr>
@@ -1506,7 +1520,7 @@
             <w:noProof/>
             <w:webHidden/>
           </w:rPr>
-          <w:instrText xml:space="preserve"> PAGEREF _Toc195989107 \h </w:instrText>
+          <w:instrText xml:space="preserve"> PAGEREF _Toc206019409 \h </w:instrText>
         </w:r>
         <w:r>
           <w:rPr>
@@ -1554,7 +1568,7 @@
           <w14:ligatures w14:val="standardContextual"/>
         </w:rPr>
       </w:pPr>
-      <w:hyperlink w:anchor="_Toc195989108" w:history="1">
+      <w:hyperlink w:anchor="_Toc206019410" w:history="1">
         <w:r>
           <w:rPr>
             <w:rStyle w:val="Hyperlink"/>
@@ -1581,7 +1595,7 @@
             <w:noProof/>
             <w:webHidden/>
           </w:rPr>
-          <w:instrText xml:space="preserve"> PAGEREF _Toc195989108 \h </w:instrText>
+          <w:instrText xml:space="preserve"> PAGEREF _Toc206019410 \h </w:instrText>
         </w:r>
         <w:r>
           <w:rPr>
@@ -1627,12 +1641,12 @@
       <w:r>
         <w:br w:type="column"/>
       </w:r>
-      <w:bookmarkStart w:id="2" w:name="_Toc195989090"/>
+      <w:bookmarkStart w:id="3" w:name="_Toc206019392"/>
       <w:r>
         <w:lastRenderedPageBreak/>
         <w:t>Introduction:</w:t>
       </w:r>
-      <w:bookmarkEnd w:id="2"/>
+      <w:bookmarkEnd w:id="3"/>
     </w:p>
     <w:p>
       <w:pPr>
@@ -1669,13 +1683,29 @@
         <w:t>running on Windows</w:t>
       </w:r>
       <w:r>
-        <w:t>, to perform master equation modeling or related calculations.</w:t>
+        <w:t xml:space="preserve">, to perform master equation </w:t>
+      </w:r>
+      <w:proofErr w:type="spellStart"/>
+      <w:r>
+        <w:t>modeling</w:t>
+      </w:r>
+      <w:proofErr w:type="spellEnd"/>
+      <w:r>
+        <w:t xml:space="preserve"> or related calculations.</w:t>
       </w:r>
       <w:r>
         <w:t xml:space="preserve"> </w:t>
       </w:r>
       <w:r>
-        <w:t xml:space="preserve">AWATAR is written with the programming language PureBasics and was used already for several publications. </w:t>
+        <w:t xml:space="preserve">AWATAR is written with the programming language </w:t>
+      </w:r>
+      <w:proofErr w:type="spellStart"/>
+      <w:r>
+        <w:t>PureBasics</w:t>
+      </w:r>
+      <w:proofErr w:type="spellEnd"/>
+      <w:r>
+        <w:t xml:space="preserve"> and was used already for several publications. </w:t>
       </w:r>
       <w:sdt>
         <w:sdtPr>
@@ -1860,6 +1890,7 @@
         </w:rPr>
         <w:t xml:space="preserve">quation </w:t>
       </w:r>
+      <w:proofErr w:type="spellStart"/>
       <w:r>
         <w:rPr>
           <w:b/>
@@ -1874,6 +1905,7 @@
         </w:rPr>
         <w:t>odeling</w:t>
       </w:r>
+      <w:proofErr w:type="spellEnd"/>
       <w:r>
         <w:t>, simulating</w:t>
       </w:r>
@@ -1887,7 +1919,15 @@
         <w:t>. Thereby,</w:t>
       </w:r>
       <w:r>
-        <w:t xml:space="preserve"> the evolution of a population can be modeled (real time MEM)</w:t>
+        <w:t xml:space="preserve"> the evolution of a population can be </w:t>
+      </w:r>
+      <w:proofErr w:type="spellStart"/>
+      <w:r>
+        <w:t>modeled</w:t>
+      </w:r>
+      <w:proofErr w:type="spellEnd"/>
+      <w:r>
+        <w:t xml:space="preserve"> (real time MEM)</w:t>
       </w:r>
       <w:r>
         <w:t xml:space="preserve"> as well as the </w:t>
@@ -1955,7 +1995,7 @@
           <w:rStyle w:val="berschrift1Zchn"/>
         </w:rPr>
       </w:pPr>
-      <w:bookmarkStart w:id="3" w:name="_Toc195989091"/>
+      <w:bookmarkStart w:id="4" w:name="_Toc206019393"/>
       <w:r>
         <w:rPr>
           <w:rStyle w:val="berschrift1Zchn"/>
@@ -2010,7 +2050,7 @@
         </w:rPr>
         <w:t>nformation</w:t>
       </w:r>
-      <w:bookmarkEnd w:id="3"/>
+      <w:bookmarkEnd w:id="4"/>
     </w:p>
     <w:p>
       <w:pPr>
@@ -2159,6 +2199,7 @@
       <w:r>
         <w:t xml:space="preserve">the program can be saved in the format </w:t>
       </w:r>
+      <w:proofErr w:type="spellStart"/>
       <w:r>
         <w:rPr>
           <w:i/>
@@ -2166,7 +2207,11 @@
         <w:t>filename</w:t>
       </w:r>
       <w:r>
-        <w:t xml:space="preserve">.rrk. Thereby all the text written in any of the panels is saved </w:t>
+        <w:t>.rrk</w:t>
+      </w:r>
+      <w:proofErr w:type="spellEnd"/>
+      <w:r>
+        <w:t xml:space="preserve">. Thereby all the text written in any of the panels is saved </w:t>
       </w:r>
       <w:r>
         <w:t>along with the content of all arrays.</w:t>
@@ -2225,6 +2270,7 @@
       <w:r>
         <w:t xml:space="preserve">”. After choosing the respective file </w:t>
       </w:r>
+      <w:proofErr w:type="spellStart"/>
       <w:r>
         <w:rPr>
           <w:i/>
@@ -2232,7 +2278,11 @@
         <w:t>filename</w:t>
       </w:r>
       <w:r>
-        <w:t xml:space="preserve">.rrk, the stored panels </w:t>
+        <w:t>.rrk</w:t>
+      </w:r>
+      <w:proofErr w:type="spellEnd"/>
+      <w:r>
+        <w:t xml:space="preserve">, the stored panels </w:t>
       </w:r>
       <w:r>
         <w:t xml:space="preserve">and arrays </w:t>
@@ -2284,15 +2334,15 @@
         <w:pStyle w:val="berschrift1"/>
         <w:spacing w:before="100" w:beforeAutospacing="1" w:after="100" w:afterAutospacing="1"/>
       </w:pPr>
-      <w:bookmarkStart w:id="4" w:name="_Ref193816451"/>
-      <w:bookmarkStart w:id="5" w:name="_Ref193816866"/>
-      <w:bookmarkStart w:id="6" w:name="_Ref193816920"/>
-      <w:bookmarkStart w:id="7" w:name="_Ref193817151"/>
-      <w:bookmarkStart w:id="8" w:name="_Ref193817801"/>
-      <w:bookmarkStart w:id="9" w:name="_Ref193817882"/>
-      <w:bookmarkStart w:id="10" w:name="_Ref193818507"/>
-      <w:bookmarkStart w:id="11" w:name="_Ref193819379"/>
-      <w:bookmarkStart w:id="12" w:name="_Toc195989092"/>
+      <w:bookmarkStart w:id="5" w:name="_Ref193816451"/>
+      <w:bookmarkStart w:id="6" w:name="_Ref193816866"/>
+      <w:bookmarkStart w:id="7" w:name="_Ref193816920"/>
+      <w:bookmarkStart w:id="8" w:name="_Ref193817151"/>
+      <w:bookmarkStart w:id="9" w:name="_Ref193817801"/>
+      <w:bookmarkStart w:id="10" w:name="_Ref193817882"/>
+      <w:bookmarkStart w:id="11" w:name="_Ref193818507"/>
+      <w:bookmarkStart w:id="12" w:name="_Ref193819379"/>
+      <w:bookmarkStart w:id="13" w:name="_Toc206019394"/>
       <w:r>
         <w:t xml:space="preserve">Definition of </w:t>
       </w:r>
@@ -2302,7 +2352,6 @@
       <w:r>
         <w:t>ells</w:t>
       </w:r>
-      <w:bookmarkEnd w:id="4"/>
       <w:bookmarkEnd w:id="5"/>
       <w:bookmarkEnd w:id="6"/>
       <w:bookmarkEnd w:id="7"/>
@@ -2311,6 +2360,7 @@
       <w:bookmarkEnd w:id="10"/>
       <w:bookmarkEnd w:id="11"/>
       <w:bookmarkEnd w:id="12"/>
+      <w:bookmarkEnd w:id="13"/>
     </w:p>
     <w:p>
       <w:pPr>
@@ -2472,8 +2522,21 @@
         <w:t xml:space="preserve"> For example</w:t>
       </w:r>
       <w:r>
-        <w:t xml:space="preserve"> for CCSD/aug-cc-pVDZ</w:t>
-      </w:r>
+        <w:t xml:space="preserve"> for CCSD/</w:t>
+      </w:r>
+      <w:proofErr w:type="spellStart"/>
+      <w:r>
+        <w:t>aug</w:t>
+      </w:r>
+      <w:proofErr w:type="spellEnd"/>
+      <w:r>
+        <w:t>-cc-</w:t>
+      </w:r>
+      <w:proofErr w:type="spellStart"/>
+      <w:r>
+        <w:t>pVDZ</w:t>
+      </w:r>
+      <w:proofErr w:type="spellEnd"/>
       <w:r>
         <w:t>:</w:t>
       </w:r>
@@ -2636,6 +2699,9 @@
         <w:t>Frequency Scale Factor</w:t>
       </w:r>
       <w:r>
+        <w:t xml:space="preserve"> </w:t>
+      </w:r>
+      <w:r>
         <w:fldChar w:fldCharType="end"/>
       </w:r>
       <w:r>
@@ -2661,6 +2727,7 @@
       <w:r>
         <w:t>The following lines containing the word “</w:t>
       </w:r>
+      <w:proofErr w:type="spellStart"/>
       <w:r>
         <w:rPr>
           <w:i/>
@@ -2668,6 +2735,7 @@
         </w:rPr>
         <w:t>vib</w:t>
       </w:r>
+      <w:proofErr w:type="spellEnd"/>
       <w:r>
         <w:t>” give the vibrational frequencies of the molecule (first number of each line) along with the infrared intensities (second and fourth number of each line). The third number is the vibrational frequency scaled by the used Frequency Scale Factor.</w:t>
       </w:r>
@@ -2765,102 +2833,72 @@
           <w:i/>
           <w:iCs/>
         </w:rPr>
-        <w:t>1D-rot symm</w:t>
-      </w:r>
-      <w:r>
-        <w:t>”)</w:t>
-      </w:r>
-      <w:r>
-        <w:t>, w</w:t>
-      </w:r>
-      <w:r>
-        <w:t>hi</w:t>
-      </w:r>
-      <w:r>
-        <w:t>le the other two are inactive.</w:t>
-      </w:r>
-      <w:r>
-        <w:t xml:space="preserve"> If the molecule is linear, </w:t>
-      </w:r>
-      <w:r>
-        <w:t xml:space="preserve">the rotation </w:t>
-      </w:r>
-      <w:r>
-        <w:t xml:space="preserve">does not </w:t>
-      </w:r>
-      <w:r>
-        <w:t xml:space="preserve">contribute with </w:t>
-      </w:r>
-      <w:r>
-        <w:t>any</w:t>
-      </w:r>
-      <w:r>
-        <w:t xml:space="preserve"> degrees of freedom. Otherwise, </w:t>
-      </w:r>
-      <w:r>
-        <w:t xml:space="preserve">the molecule </w:t>
-      </w:r>
-      <w:r>
-        <w:t xml:space="preserve">is </w:t>
-      </w:r>
-      <w:r>
-        <w:t xml:space="preserve">approximated as prolate or oblate symmetric top, </w:t>
-      </w:r>
-      <w:r>
-        <w:t xml:space="preserve">and </w:t>
-      </w:r>
-      <w:r>
-        <w:t xml:space="preserve">there is one active </w:t>
-      </w:r>
-      <w:r>
-        <w:t>rotational mode</w:t>
-      </w:r>
-      <w:r>
-        <w:t>.</w:t>
-      </w:r>
-    </w:p>
-    <w:p>
-      <w:pPr>
-        <w:spacing w:before="100" w:beforeAutospacing="1" w:after="100" w:afterAutospacing="1"/>
-      </w:pPr>
-      <w:r>
-        <w:t>The line containing the word “</w:t>
-      </w:r>
+        <w:t xml:space="preserve">1D-rot </w:t>
+      </w:r>
+      <w:proofErr w:type="spellStart"/>
       <w:r>
         <w:rPr>
           <w:i/>
           <w:iCs/>
         </w:rPr>
-        <w:t>energy</w:t>
-      </w:r>
-      <w:r>
-        <w:t xml:space="preserve">” gives the </w:t>
-      </w:r>
-      <w:r>
-        <w:t xml:space="preserve">electronic </w:t>
-      </w:r>
-      <w:r>
-        <w:t xml:space="preserve">energy </w:t>
-      </w:r>
-      <w:r>
-        <w:t xml:space="preserve">without zero point </w:t>
-      </w:r>
-      <w:r>
-        <w:t>energy</w:t>
-      </w:r>
-      <w:r>
-        <w:t xml:space="preserve"> in</w:t>
-      </w:r>
-      <w:r>
-        <w:t xml:space="preserve"> atomic units.</w:t>
+        <w:t>symm</w:t>
+      </w:r>
+      <w:proofErr w:type="spellEnd"/>
+      <w:r>
+        <w:t>”)</w:t>
+      </w:r>
+      <w:r>
+        <w:t>, w</w:t>
+      </w:r>
+      <w:r>
+        <w:t>hi</w:t>
+      </w:r>
+      <w:r>
+        <w:t>le the other two are inactive.</w:t>
+      </w:r>
+      <w:r>
+        <w:t xml:space="preserve"> If the molecule is linear, </w:t>
+      </w:r>
+      <w:r>
+        <w:t xml:space="preserve">the rotation </w:t>
+      </w:r>
+      <w:r>
+        <w:t xml:space="preserve">does not </w:t>
+      </w:r>
+      <w:r>
+        <w:t xml:space="preserve">contribute with </w:t>
+      </w:r>
+      <w:r>
+        <w:t>any</w:t>
+      </w:r>
+      <w:r>
+        <w:t xml:space="preserve"> degrees of freedom. Otherwise, </w:t>
+      </w:r>
+      <w:r>
+        <w:t xml:space="preserve">the molecule </w:t>
+      </w:r>
+      <w:r>
+        <w:t xml:space="preserve">is </w:t>
+      </w:r>
+      <w:r>
+        <w:t xml:space="preserve">approximated as prolate or oblate symmetric top, </w:t>
+      </w:r>
+      <w:r>
+        <w:t xml:space="preserve">and </w:t>
+      </w:r>
+      <w:r>
+        <w:t xml:space="preserve">there is one active </w:t>
+      </w:r>
+      <w:r>
+        <w:t>rotational mode</w:t>
+      </w:r>
+      <w:r>
+        <w:t>.</w:t>
       </w:r>
     </w:p>
     <w:p>
       <w:pPr>
         <w:spacing w:before="100" w:beforeAutospacing="1" w:after="100" w:afterAutospacing="1"/>
-        <w:rPr>
-          <w:color w:val="FF0000"/>
-        </w:rPr>
       </w:pPr>
       <w:r>
         <w:t>The line containing the word “</w:t>
@@ -2870,13 +2908,52 @@
           <w:i/>
           <w:iCs/>
         </w:rPr>
-        <w:t>d</w:t>
+        <w:t>energy</w:t>
+      </w:r>
+      <w:r>
+        <w:t xml:space="preserve">” gives the </w:t>
+      </w:r>
+      <w:r>
+        <w:t xml:space="preserve">electronic </w:t>
+      </w:r>
+      <w:r>
+        <w:t xml:space="preserve">energy </w:t>
+      </w:r>
+      <w:r>
+        <w:t xml:space="preserve">without zero point </w:t>
+      </w:r>
+      <w:r>
+        <w:t>energy</w:t>
+      </w:r>
+      <w:r>
+        <w:t xml:space="preserve"> in</w:t>
+      </w:r>
+      <w:r>
+        <w:t xml:space="preserve"> atomic units.</w:t>
+      </w:r>
+    </w:p>
+    <w:p>
+      <w:pPr>
+        <w:spacing w:before="100" w:beforeAutospacing="1" w:after="100" w:afterAutospacing="1"/>
+        <w:rPr>
+          <w:color w:val="FF0000"/>
+        </w:rPr>
+      </w:pPr>
+      <w:r>
+        <w:t>The line containing the word “</w:t>
       </w:r>
       <w:r>
         <w:rPr>
           <w:i/>
           <w:iCs/>
         </w:rPr>
+        <w:t>d</w:t>
+      </w:r>
+      <w:r>
+        <w:rPr>
+          <w:i/>
+          <w:iCs/>
+        </w:rPr>
         <w:t>egeneracy</w:t>
       </w:r>
       <w:r>
@@ -2927,7 +3004,7 @@
         <w:pStyle w:val="berschrift3"/>
         <w:spacing w:before="100" w:beforeAutospacing="1" w:after="100" w:afterAutospacing="1"/>
       </w:pPr>
-      <w:bookmarkStart w:id="13" w:name="_Ref193816044"/>
+      <w:bookmarkStart w:id="14" w:name="_Ref193816044"/>
       <w:r>
         <w:t xml:space="preserve">Delete </w:t>
       </w:r>
@@ -2937,7 +3014,7 @@
       <w:r>
         <w:t>ells</w:t>
       </w:r>
-      <w:bookmarkEnd w:id="13"/>
+      <w:bookmarkEnd w:id="14"/>
     </w:p>
     <w:p>
       <w:pPr>
@@ -3131,14 +3208,14 @@
         <w:pStyle w:val="berschrift1"/>
         <w:spacing w:before="100" w:beforeAutospacing="1" w:after="100" w:afterAutospacing="1"/>
       </w:pPr>
-      <w:bookmarkStart w:id="14" w:name="_Ref193816935"/>
-      <w:bookmarkStart w:id="15" w:name="_Ref193817069"/>
-      <w:bookmarkStart w:id="16" w:name="_Ref193817164"/>
-      <w:bookmarkStart w:id="17" w:name="_Ref193817812"/>
-      <w:bookmarkStart w:id="18" w:name="_Ref193817896"/>
-      <w:bookmarkStart w:id="19" w:name="_Ref193818518"/>
-      <w:bookmarkStart w:id="20" w:name="_Ref193819390"/>
-      <w:bookmarkStart w:id="21" w:name="_Toc195989093"/>
+      <w:bookmarkStart w:id="15" w:name="_Ref193816935"/>
+      <w:bookmarkStart w:id="16" w:name="_Ref193817069"/>
+      <w:bookmarkStart w:id="17" w:name="_Ref193817164"/>
+      <w:bookmarkStart w:id="18" w:name="_Ref193817812"/>
+      <w:bookmarkStart w:id="19" w:name="_Ref193817896"/>
+      <w:bookmarkStart w:id="20" w:name="_Ref193818518"/>
+      <w:bookmarkStart w:id="21" w:name="_Ref193819390"/>
+      <w:bookmarkStart w:id="22" w:name="_Toc206019395"/>
       <w:r>
         <w:t xml:space="preserve">Definition of </w:t>
       </w:r>
@@ -3157,7 +3234,6 @@
       <w:r>
         <w:t xml:space="preserve"> (TS)</w:t>
       </w:r>
-      <w:bookmarkEnd w:id="14"/>
       <w:bookmarkEnd w:id="15"/>
       <w:bookmarkEnd w:id="16"/>
       <w:bookmarkEnd w:id="17"/>
@@ -3165,6 +3241,7 @@
       <w:bookmarkEnd w:id="19"/>
       <w:bookmarkEnd w:id="20"/>
       <w:bookmarkEnd w:id="21"/>
+      <w:bookmarkEnd w:id="22"/>
     </w:p>
     <w:p>
       <w:pPr>
@@ -3382,7 +3459,31 @@
         <w:t>I</w:t>
       </w:r>
       <w:r>
-        <w:t xml:space="preserve">n the lines containing the word “vib” the vibrational modes are defined, whereby the number before “vib” is the unscaled vibrational frequency and the number after “vib” is the scaled vibrational frequency. </w:t>
+        <w:t>n the lines containing the word “</w:t>
+      </w:r>
+      <w:proofErr w:type="spellStart"/>
+      <w:r>
+        <w:t>vib</w:t>
+      </w:r>
+      <w:proofErr w:type="spellEnd"/>
+      <w:r>
+        <w:t>” the vibrational modes are defined, whereby the number before “</w:t>
+      </w:r>
+      <w:proofErr w:type="spellStart"/>
+      <w:r>
+        <w:t>vib</w:t>
+      </w:r>
+      <w:proofErr w:type="spellEnd"/>
+      <w:r>
+        <w:t>” is the unscaled vibrational frequency and the number after “</w:t>
+      </w:r>
+      <w:proofErr w:type="spellStart"/>
+      <w:r>
+        <w:t>vib</w:t>
+      </w:r>
+      <w:proofErr w:type="spellEnd"/>
+      <w:r>
+        <w:t xml:space="preserve">” is the scaled vibrational frequency. </w:t>
       </w:r>
     </w:p>
     <w:p>
@@ -3498,7 +3599,21 @@
         <w:rPr>
           <w:color w:val="auto"/>
         </w:rPr>
-        <w:t xml:space="preserve"> are modeled as an active 1D rotor</w:t>
+        <w:t xml:space="preserve"> are </w:t>
+      </w:r>
+      <w:proofErr w:type="spellStart"/>
+      <w:r>
+        <w:rPr>
+          <w:color w:val="auto"/>
+        </w:rPr>
+        <w:t>modeled</w:t>
+      </w:r>
+      <w:proofErr w:type="spellEnd"/>
+      <w:r>
+        <w:rPr>
+          <w:color w:val="auto"/>
+        </w:rPr>
+        <w:t xml:space="preserve"> as an active 1D rotor</w:t>
       </w:r>
       <w:r>
         <w:rPr>
@@ -3510,7 +3625,21 @@
         <w:rPr>
           <w:color w:val="auto"/>
         </w:rPr>
-        <w:t>(noted with 1D-rot symm)</w:t>
+        <w:t xml:space="preserve">(noted with 1D-rot </w:t>
+      </w:r>
+      <w:proofErr w:type="spellStart"/>
+      <w:r>
+        <w:rPr>
+          <w:color w:val="auto"/>
+        </w:rPr>
+        <w:t>symm</w:t>
+      </w:r>
+      <w:proofErr w:type="spellEnd"/>
+      <w:r>
+        <w:rPr>
+          <w:color w:val="auto"/>
+        </w:rPr>
+        <w:t>)</w:t>
       </w:r>
       <w:r>
         <w:rPr>
@@ -3540,7 +3669,21 @@
         <w:rPr>
           <w:color w:val="auto"/>
         </w:rPr>
-        <w:t>D-rot symm)</w:t>
+        <w:t xml:space="preserve">D-rot </w:t>
+      </w:r>
+      <w:proofErr w:type="spellStart"/>
+      <w:r>
+        <w:rPr>
+          <w:color w:val="auto"/>
+        </w:rPr>
+        <w:t>symm</w:t>
+      </w:r>
+      <w:proofErr w:type="spellEnd"/>
+      <w:r>
+        <w:rPr>
+          <w:color w:val="auto"/>
+        </w:rPr>
+        <w:t>)</w:t>
       </w:r>
       <w:r>
         <w:rPr>
@@ -3571,7 +3714,21 @@
         <w:rPr>
           <w:color w:val="auto"/>
         </w:rPr>
-        <w:t xml:space="preserve"> the rotation contributes with two degrees of freedom, modeled as a two dimensional rotor.</w:t>
+        <w:t xml:space="preserve"> the rotation contributes with two degrees of freedom, </w:t>
+      </w:r>
+      <w:proofErr w:type="spellStart"/>
+      <w:r>
+        <w:rPr>
+          <w:color w:val="auto"/>
+        </w:rPr>
+        <w:t>modeled</w:t>
+      </w:r>
+      <w:proofErr w:type="spellEnd"/>
+      <w:r>
+        <w:rPr>
+          <w:color w:val="auto"/>
+        </w:rPr>
+        <w:t xml:space="preserve"> as a two dimensional rotor.</w:t>
       </w:r>
     </w:p>
     <w:p>
@@ -3590,7 +3747,63 @@
         <w:rPr>
           <w:color w:val="auto"/>
         </w:rPr>
-        <w:t>All other molecules are approximated as prolate or oblate symmetric top. One of the rotational modes is modeled as a one dimensional rotor (noted with 1D-rot symm), while the other two rotational modes are modeled as a two dimensional rotor (noted with 2D-rot symm). Thereby, instead of two inactive external rotors, there is one active 2</w:t>
+        <w:t xml:space="preserve">All other molecules are approximated as prolate or oblate symmetric top. One of the rotational modes is </w:t>
+      </w:r>
+      <w:proofErr w:type="spellStart"/>
+      <w:r>
+        <w:rPr>
+          <w:color w:val="auto"/>
+        </w:rPr>
+        <w:t>modeled</w:t>
+      </w:r>
+      <w:proofErr w:type="spellEnd"/>
+      <w:r>
+        <w:rPr>
+          <w:color w:val="auto"/>
+        </w:rPr>
+        <w:t xml:space="preserve"> as a one dimensional rotor (noted with 1D-rot </w:t>
+      </w:r>
+      <w:proofErr w:type="spellStart"/>
+      <w:r>
+        <w:rPr>
+          <w:color w:val="auto"/>
+        </w:rPr>
+        <w:t>symm</w:t>
+      </w:r>
+      <w:proofErr w:type="spellEnd"/>
+      <w:r>
+        <w:rPr>
+          <w:color w:val="auto"/>
+        </w:rPr>
+        <w:t xml:space="preserve">), while the other two rotational modes are </w:t>
+      </w:r>
+      <w:proofErr w:type="spellStart"/>
+      <w:r>
+        <w:rPr>
+          <w:color w:val="auto"/>
+        </w:rPr>
+        <w:t>modeled</w:t>
+      </w:r>
+      <w:proofErr w:type="spellEnd"/>
+      <w:r>
+        <w:rPr>
+          <w:color w:val="auto"/>
+        </w:rPr>
+        <w:t xml:space="preserve"> as a two dimensional rotor (noted with 2D-rot </w:t>
+      </w:r>
+      <w:proofErr w:type="spellStart"/>
+      <w:r>
+        <w:rPr>
+          <w:color w:val="auto"/>
+        </w:rPr>
+        <w:t>symm</w:t>
+      </w:r>
+      <w:proofErr w:type="spellEnd"/>
+      <w:r>
+        <w:rPr>
+          <w:color w:val="auto"/>
+        </w:rPr>
+        <w:t>). Thereby, instead of two inactive external rotors, there is one active 2</w:t>
       </w:r>
       <w:r>
         <w:t>D</w:t>
@@ -3890,7 +4103,7 @@
       <w:pPr>
         <w:pStyle w:val="berschrift3"/>
       </w:pPr>
-      <w:bookmarkStart w:id="22" w:name="_Toc190338970"/>
+      <w:bookmarkStart w:id="23" w:name="_Toc190338970"/>
       <w:r>
         <w:t>Definition of tight TS</w:t>
       </w:r>
@@ -4076,16 +4289,16 @@
       <w:pPr>
         <w:pStyle w:val="berschrift3"/>
       </w:pPr>
-      <w:bookmarkStart w:id="23" w:name="_Ref193807524"/>
+      <w:bookmarkStart w:id="24" w:name="_Ref193807524"/>
       <w:r>
         <w:lastRenderedPageBreak/>
         <w:t>Definition of tight TS</w:t>
       </w:r>
-      <w:bookmarkEnd w:id="22"/>
+      <w:bookmarkEnd w:id="23"/>
       <w:r>
         <w:t xml:space="preserve"> using the log-file of a well</w:t>
       </w:r>
-      <w:bookmarkEnd w:id="23"/>
+      <w:bookmarkEnd w:id="24"/>
     </w:p>
     <w:p>
       <w:pPr>
@@ -4539,8 +4752,8 @@
         <w:pStyle w:val="berschrift1"/>
         <w:spacing w:before="100" w:beforeAutospacing="1" w:after="100" w:afterAutospacing="1"/>
       </w:pPr>
-      <w:bookmarkStart w:id="24" w:name="_Ref193816014"/>
-      <w:bookmarkStart w:id="25" w:name="_Toc195989094"/>
+      <w:bookmarkStart w:id="25" w:name="_Ref193816014"/>
+      <w:bookmarkStart w:id="26" w:name="_Toc206019396"/>
       <w:r>
         <w:t xml:space="preserve">Adapting the </w:t>
       </w:r>
@@ -4568,8 +4781,8 @@
       <w:r>
         <w:t>tates</w:t>
       </w:r>
-      <w:bookmarkEnd w:id="24"/>
       <w:bookmarkEnd w:id="25"/>
+      <w:bookmarkEnd w:id="26"/>
     </w:p>
     <w:p>
       <w:pPr>
@@ -4966,9 +5179,9 @@
         <w:pStyle w:val="berschrift1"/>
         <w:spacing w:before="100" w:beforeAutospacing="1" w:after="100" w:afterAutospacing="1"/>
       </w:pPr>
-      <w:bookmarkStart w:id="26" w:name="_Ref193806480"/>
-      <w:bookmarkStart w:id="27" w:name="_Ref193807321"/>
-      <w:bookmarkStart w:id="28" w:name="_Toc195989095"/>
+      <w:bookmarkStart w:id="27" w:name="_Ref193806480"/>
+      <w:bookmarkStart w:id="28" w:name="_Ref193807321"/>
+      <w:bookmarkStart w:id="29" w:name="_Toc206019397"/>
       <w:r>
         <w:t xml:space="preserve">Adapting the </w:t>
       </w:r>
@@ -4996,9 +5209,9 @@
       <w:r>
         <w:t>tates</w:t>
       </w:r>
-      <w:bookmarkEnd w:id="26"/>
       <w:bookmarkEnd w:id="27"/>
       <w:bookmarkEnd w:id="28"/>
+      <w:bookmarkEnd w:id="29"/>
     </w:p>
     <w:p>
       <w:pPr>
@@ -5135,7 +5348,7 @@
         </w:numPr>
         <w:spacing w:before="100" w:beforeAutospacing="1" w:after="100" w:afterAutospacing="1"/>
       </w:pPr>
-      <w:commentRangeStart w:id="29"/>
+      <w:commentRangeStart w:id="30"/>
       <w:r>
         <w:rPr>
           <w:u w:val="single"/>
@@ -5145,12 +5358,12 @@
       <w:r>
         <w:t xml:space="preserve"> If a transition state has a higher probability due to several possible pathways, this can also be considered for the total degeneracy.</w:t>
       </w:r>
-      <w:commentRangeEnd w:id="29"/>
+      <w:commentRangeEnd w:id="30"/>
       <w:r>
         <w:rPr>
           <w:rStyle w:val="Kommentarzeichen"/>
         </w:rPr>
-        <w:commentReference w:id="29"/>
+        <w:commentReference w:id="30"/>
       </w:r>
     </w:p>
     <w:p>
@@ -5375,7 +5588,7 @@
         <w:pStyle w:val="berschrift1"/>
         <w:spacing w:before="100" w:beforeAutospacing="1" w:after="100" w:afterAutospacing="1"/>
       </w:pPr>
-      <w:bookmarkStart w:id="30" w:name="_Toc195989096"/>
+      <w:bookmarkStart w:id="31" w:name="_Toc206019398"/>
       <w:r>
         <w:t xml:space="preserve">Calculate </w:t>
       </w:r>
@@ -5394,7 +5607,7 @@
       <w:r>
         <w:t xml:space="preserve"> (DoS)</w:t>
       </w:r>
-      <w:bookmarkEnd w:id="30"/>
+      <w:bookmarkEnd w:id="31"/>
     </w:p>
     <w:p>
       <w:pPr>
@@ -5730,13 +5943,7 @@
         <w:rPr>
           <w:rFonts w:ascii="Courier New" w:hAnsi="Courier New" w:cs="Courier New"/>
         </w:rPr>
-        <w:t>Size of finite energy element</w:t>
-      </w:r>
-      <w:r>
-        <w:rPr>
-          <w:rFonts w:ascii="Courier New" w:hAnsi="Courier New" w:cs="Courier New"/>
-        </w:rPr>
-        <w:t xml:space="preserve"> in cm-1</w:t>
+        <w:t>Bin size in cm-1</w:t>
       </w:r>
       <w:r>
         <w:rPr>
@@ -6101,7 +6308,7 @@
         <w:pStyle w:val="berschrift1"/>
         <w:spacing w:before="100" w:beforeAutospacing="1" w:after="100" w:afterAutospacing="1"/>
       </w:pPr>
-      <w:bookmarkStart w:id="31" w:name="_Toc195989097"/>
+      <w:bookmarkStart w:id="32" w:name="_Toc206019399"/>
       <w:r>
         <w:t xml:space="preserve">Calculate </w:t>
       </w:r>
@@ -6120,7 +6327,7 @@
       <w:r>
         <w:t xml:space="preserve"> (SoS)</w:t>
       </w:r>
-      <w:bookmarkEnd w:id="31"/>
+      <w:bookmarkEnd w:id="32"/>
     </w:p>
     <w:p>
       <w:pPr>
@@ -6306,7 +6513,7 @@
         </w:rPr>
         <w:t xml:space="preserve"> </w:t>
       </w:r>
-      <w:bookmarkStart w:id="32" w:name="_Hlk190338552"/>
+      <w:bookmarkStart w:id="33" w:name="_Hlk190338552"/>
       <w:r>
         <w:rPr>
           <w:color w:val="auto"/>
@@ -6350,7 +6557,7 @@
         <w:t>mum.</w:t>
       </w:r>
     </w:p>
-    <w:bookmarkEnd w:id="32"/>
+    <w:bookmarkEnd w:id="33"/>
     <w:p/>
     <w:p>
       <w:pPr>
@@ -6481,13 +6688,7 @@
         <w:rPr>
           <w:rFonts w:ascii="Courier New" w:hAnsi="Courier New" w:cs="Courier New"/>
         </w:rPr>
-        <w:t>Size of finite energy element</w:t>
-      </w:r>
-      <w:r>
-        <w:rPr>
-          <w:rFonts w:ascii="Courier New" w:hAnsi="Courier New" w:cs="Courier New"/>
-        </w:rPr>
-        <w:t xml:space="preserve"> in cm-1</w:t>
+        <w:t>Bin size in cm-1</w:t>
       </w:r>
       <w:r>
         <w:rPr>
@@ -6847,7 +7048,7 @@
         <w:pStyle w:val="berschrift1"/>
         <w:spacing w:before="100" w:beforeAutospacing="1" w:after="100" w:afterAutospacing="1"/>
       </w:pPr>
-      <w:bookmarkStart w:id="33" w:name="_Toc195989098"/>
+      <w:bookmarkStart w:id="34" w:name="_Toc206019400"/>
       <w:r>
         <w:t>Calculate RRKM</w:t>
       </w:r>
@@ -6866,7 +7067,7 @@
       <w:r>
         <w:t>s</w:t>
       </w:r>
-      <w:bookmarkEnd w:id="33"/>
+      <w:bookmarkEnd w:id="34"/>
     </w:p>
     <w:p>
       <w:pPr>
@@ -7455,13 +7656,7 @@
         <w:rPr>
           <w:rFonts w:ascii="Courier New" w:hAnsi="Courier New" w:cs="Courier New"/>
         </w:rPr>
-        <w:t>Size of finite energy element</w:t>
-      </w:r>
-      <w:r>
-        <w:rPr>
-          <w:rFonts w:ascii="Courier New" w:hAnsi="Courier New" w:cs="Courier New"/>
-        </w:rPr>
-        <w:t xml:space="preserve"> in cm-1</w:t>
+        <w:t>Bin size in cm-1</w:t>
       </w:r>
       <w:r>
         <w:rPr>
@@ -7886,8 +8081,8 @@
         <w:pStyle w:val="berschrift1"/>
         <w:spacing w:before="100" w:beforeAutospacing="1" w:after="100" w:afterAutospacing="1"/>
       </w:pPr>
-      <w:bookmarkStart w:id="34" w:name="_Ref194665170"/>
-      <w:bookmarkStart w:id="35" w:name="_Toc195989099"/>
+      <w:bookmarkStart w:id="35" w:name="_Ref194665170"/>
+      <w:bookmarkStart w:id="36" w:name="_Toc206019401"/>
       <w:r>
         <w:t xml:space="preserve">Perform </w:t>
       </w:r>
@@ -7903,17 +8098,19 @@
       <w:r>
         <w:t xml:space="preserve">quation </w:t>
       </w:r>
+      <w:proofErr w:type="spellStart"/>
       <w:r>
         <w:t>m</w:t>
       </w:r>
       <w:r>
         <w:t>odeling</w:t>
       </w:r>
+      <w:proofErr w:type="spellEnd"/>
       <w:r>
         <w:t xml:space="preserve"> (MEM)</w:t>
       </w:r>
-      <w:bookmarkEnd w:id="34"/>
       <w:bookmarkEnd w:id="35"/>
+      <w:bookmarkEnd w:id="36"/>
     </w:p>
     <w:p>
       <w:r>
@@ -7934,7 +8131,15 @@
         <w:t>are</w:t>
       </w:r>
       <w:r>
-        <w:t xml:space="preserve"> modeled. There are two possible options to perform MEM in AWATAR: Real time MEM, to simulate how a population evolves in time, and </w:t>
+        <w:t xml:space="preserve"> </w:t>
+      </w:r>
+      <w:proofErr w:type="spellStart"/>
+      <w:r>
+        <w:t>modeled</w:t>
+      </w:r>
+      <w:proofErr w:type="spellEnd"/>
+      <w:r>
+        <w:t xml:space="preserve">. There are two possible options to perform MEM in AWATAR: Real time MEM, to simulate how a population evolves in time, and </w:t>
       </w:r>
       <w:r>
         <w:t>steady state</w:t>
@@ -8303,7 +8508,15 @@
         <w:fldChar w:fldCharType="separate"/>
       </w:r>
       <w:r>
-        <w:t>Definitions for master equation modeling (MEM)</w:t>
+        <w:t xml:space="preserve">Definitions for master equation </w:t>
+      </w:r>
+      <w:proofErr w:type="spellStart"/>
+      <w:r>
+        <w:t>modeling</w:t>
+      </w:r>
+      <w:proofErr w:type="spellEnd"/>
+      <w:r>
+        <w:t xml:space="preserve"> (MEM)</w:t>
       </w:r>
       <w:r>
         <w:fldChar w:fldCharType="end"/>
@@ -8390,14 +8603,14 @@
         <w:pStyle w:val="berschrift2"/>
         <w:spacing w:before="100" w:beforeAutospacing="1" w:after="100" w:afterAutospacing="1"/>
       </w:pPr>
-      <w:bookmarkStart w:id="36" w:name="_Ref193818083"/>
-      <w:bookmarkStart w:id="37" w:name="_Toc195989100"/>
+      <w:bookmarkStart w:id="37" w:name="_Ref193818083"/>
+      <w:bookmarkStart w:id="38" w:name="_Toc206019402"/>
       <w:r>
         <w:lastRenderedPageBreak/>
         <w:t>Real time MEM</w:t>
       </w:r>
-      <w:bookmarkEnd w:id="36"/>
       <w:bookmarkEnd w:id="37"/>
+      <w:bookmarkEnd w:id="38"/>
     </w:p>
     <w:p>
       <w:pPr>
@@ -8431,11 +8644,16 @@
       <w:r>
         <w:t xml:space="preserve">quation </w:t>
       </w:r>
+      <w:proofErr w:type="spellStart"/>
       <w:r>
         <w:t>m</w:t>
       </w:r>
       <w:r>
-        <w:t>odeling (MEM)</w:t>
+        <w:t>odeling</w:t>
+      </w:r>
+      <w:proofErr w:type="spellEnd"/>
+      <w:r>
+        <w:t xml:space="preserve"> (MEM)</w:t>
       </w:r>
       <w:r>
         <w:fldChar w:fldCharType="end"/>
@@ -8513,7 +8731,15 @@
         <w:fldChar w:fldCharType="separate"/>
       </w:r>
       <w:r>
-        <w:t>Definitions for master equation modeling (MEM)</w:t>
+        <w:t xml:space="preserve">Definitions for master equation </w:t>
+      </w:r>
+      <w:proofErr w:type="spellStart"/>
+      <w:r>
+        <w:t>modeling</w:t>
+      </w:r>
+      <w:proofErr w:type="spellEnd"/>
+      <w:r>
+        <w:t xml:space="preserve"> (MEM)</w:t>
       </w:r>
       <w:r>
         <w:fldChar w:fldCharType="end"/>
@@ -8562,7 +8788,7 @@
       <w:r>
         <w:t xml:space="preserve">”, </w:t>
       </w:r>
-      <w:commentRangeStart w:id="38"/>
+      <w:commentRangeStart w:id="39"/>
       <w:r>
         <w:t>because AWATAR may crash once the calculation is started, if there are unexpected errors in the input panels. Also, depending on the used parameters</w:t>
       </w:r>
@@ -8578,12 +8804,12 @@
       <w:r>
         <w:t xml:space="preserve"> not finish on a reasonable time scale, and the execution of AWATAR has to be interrupted manually.</w:t>
       </w:r>
-      <w:commentRangeEnd w:id="38"/>
+      <w:commentRangeEnd w:id="39"/>
       <w:r>
         <w:rPr>
           <w:rStyle w:val="Kommentarzeichen"/>
         </w:rPr>
-        <w:commentReference w:id="38"/>
+        <w:commentReference w:id="39"/>
       </w:r>
     </w:p>
     <w:p>
@@ -8687,7 +8913,7 @@
           <w:color w:val="auto"/>
         </w:rPr>
       </w:pPr>
-      <w:commentRangeStart w:id="39"/>
+      <w:commentRangeStart w:id="40"/>
       <w:r>
         <w:rPr>
           <w:color w:val="FF0000"/>
@@ -8700,12 +8926,12 @@
         </w:rPr>
         <w:t xml:space="preserve"> </w:t>
       </w:r>
-      <w:commentRangeEnd w:id="39"/>
+      <w:commentRangeEnd w:id="40"/>
       <w:r>
         <w:rPr>
           <w:rStyle w:val="Kommentarzeichen"/>
         </w:rPr>
-        <w:commentReference w:id="39"/>
+        <w:commentReference w:id="40"/>
       </w:r>
       <w:r>
         <w:rPr>
@@ -8838,7 +9064,25 @@
           <w:color w:val="auto"/>
         </w:rPr>
         <w:lastRenderedPageBreak/>
-        <w:t>may be some numerical problems. This occurs usually for small systems and may be solved by adapting the parameter “</w:t>
+        <w:t>could</w:t>
+      </w:r>
+      <w:r>
+        <w:rPr>
+          <w:color w:val="auto"/>
+        </w:rPr>
+        <w:t xml:space="preserve"> be some numerical problems</w:t>
+      </w:r>
+      <w:r>
+        <w:rPr>
+          <w:color w:val="auto"/>
+        </w:rPr>
+        <w:t xml:space="preserve"> and results should be interpreted with caution</w:t>
+      </w:r>
+      <w:r>
+        <w:rPr>
+          <w:color w:val="auto"/>
+        </w:rPr>
+        <w:t>. This occurs usually for small systems and may be solved by adapting the parameter “</w:t>
       </w:r>
       <w:r>
         <w:rPr>
@@ -8870,13 +9114,7 @@
         <w:rPr>
           <w:rFonts w:ascii="Courier New" w:hAnsi="Courier New" w:cs="Courier New"/>
         </w:rPr>
-        <w:t>Size of finite energy element</w:t>
-      </w:r>
-      <w:r>
-        <w:rPr>
-          <w:rFonts w:ascii="Courier New" w:hAnsi="Courier New" w:cs="Courier New"/>
-        </w:rPr>
-        <w:t xml:space="preserve"> in cm-1</w:t>
+        <w:t>Bin size in cm-1</w:t>
       </w:r>
       <w:r>
         <w:rPr>
@@ -9125,13 +9363,7 @@
         <w:t>first row gives the time in seconds. The second row is the amount of reactant still intact at the given time. The following rows are the amount of product formed in the respective channel</w:t>
       </w:r>
       <w:r>
-        <w:t xml:space="preserve"> in s</w:t>
-      </w:r>
-      <w:r>
-        <w:rPr>
-          <w:vertAlign w:val="superscript"/>
-        </w:rPr>
-        <w:t>-1</w:t>
+        <w:t xml:space="preserve"> (if there is only one channel, this is (1 – Reactant))</w:t>
       </w:r>
       <w:r>
         <w:t>,</w:t>
@@ -9816,10 +10048,10 @@
         <w:pStyle w:val="berschrift2"/>
         <w:spacing w:before="100" w:beforeAutospacing="1" w:after="100" w:afterAutospacing="1"/>
       </w:pPr>
-      <w:bookmarkStart w:id="40" w:name="_Ref193818105"/>
-      <w:bookmarkStart w:id="41" w:name="_Ref193825729"/>
-      <w:bookmarkStart w:id="42" w:name="_Ref193825941"/>
-      <w:bookmarkStart w:id="43" w:name="_Toc195989101"/>
+      <w:bookmarkStart w:id="41" w:name="_Ref193818105"/>
+      <w:bookmarkStart w:id="42" w:name="_Ref193825729"/>
+      <w:bookmarkStart w:id="43" w:name="_Ref193825941"/>
+      <w:bookmarkStart w:id="44" w:name="_Toc206019403"/>
       <w:r>
         <w:lastRenderedPageBreak/>
         <w:t>Steady state</w:t>
@@ -9827,10 +10059,10 @@
       <w:r>
         <w:t xml:space="preserve"> MEM</w:t>
       </w:r>
-      <w:bookmarkEnd w:id="40"/>
       <w:bookmarkEnd w:id="41"/>
       <w:bookmarkEnd w:id="42"/>
       <w:bookmarkEnd w:id="43"/>
+      <w:bookmarkEnd w:id="44"/>
     </w:p>
     <w:p>
       <w:pPr>
@@ -9870,11 +10102,16 @@
       <w:r>
         <w:t xml:space="preserve">quation </w:t>
       </w:r>
+      <w:proofErr w:type="spellStart"/>
       <w:r>
         <w:t>m</w:t>
       </w:r>
       <w:r>
-        <w:t>odeling (MEM)</w:t>
+        <w:t>odeling</w:t>
+      </w:r>
+      <w:proofErr w:type="spellEnd"/>
+      <w:r>
+        <w:t xml:space="preserve"> (MEM)</w:t>
       </w:r>
       <w:r>
         <w:fldChar w:fldCharType="end"/>
@@ -10124,7 +10361,15 @@
         <w:fldChar w:fldCharType="separate"/>
       </w:r>
       <w:r>
-        <w:t>Definitions for master equation modeling (MEM)</w:t>
+        <w:t xml:space="preserve">Definitions for master equation </w:t>
+      </w:r>
+      <w:proofErr w:type="spellStart"/>
+      <w:r>
+        <w:t>modeling</w:t>
+      </w:r>
+      <w:proofErr w:type="spellEnd"/>
+      <w:r>
+        <w:t xml:space="preserve"> (MEM)</w:t>
       </w:r>
       <w:r>
         <w:fldChar w:fldCharType="end"/>
@@ -10167,7 +10412,7 @@
       <w:r>
         <w:t xml:space="preserve">”, </w:t>
       </w:r>
-      <w:commentRangeStart w:id="44"/>
+      <w:commentRangeStart w:id="45"/>
       <w:r>
         <w:t xml:space="preserve">because AWATAR may crash once the calculation is started, if there are </w:t>
       </w:r>
@@ -10189,12 +10434,12 @@
       <w:r>
         <w:t xml:space="preserve"> not finish on a reasonable time scale, and the execution of AWATAR has to be interrupted manually.</w:t>
       </w:r>
-      <w:commentRangeEnd w:id="44"/>
+      <w:commentRangeEnd w:id="45"/>
       <w:r>
         <w:rPr>
           <w:rStyle w:val="Kommentarzeichen"/>
         </w:rPr>
-        <w:commentReference w:id="44"/>
+        <w:commentReference w:id="45"/>
       </w:r>
     </w:p>
     <w:p>
@@ -10368,6 +10613,7 @@
         </w:rPr>
         <w:t xml:space="preserve"> Each time a new finite time step is reached during the iteration, the current status of the calculation (including the current population) is saved into a file called </w:t>
       </w:r>
+      <w:proofErr w:type="spellStart"/>
       <w:r>
         <w:rPr>
           <w:i/>
@@ -10386,7 +10632,14 @@
         <w:rPr>
           <w:color w:val="auto"/>
         </w:rPr>
-        <w:t>checkpoint.rrk.</w:t>
+        <w:t>checkpoint.rrk</w:t>
+      </w:r>
+      <w:proofErr w:type="spellEnd"/>
+      <w:r>
+        <w:rPr>
+          <w:color w:val="auto"/>
+        </w:rPr>
+        <w:t>.</w:t>
       </w:r>
       <w:r>
         <w:rPr>
@@ -10742,7 +10995,14 @@
           <w:rFonts w:ascii="Courier New" w:hAnsi="Courier New" w:cs="Courier New"/>
           <w:color w:val="auto"/>
         </w:rPr>
-        <w:t>Finite time step at 300 K</w:t>
+        <w:t>Finite time step</w:t>
+      </w:r>
+      <w:r>
+        <w:rPr>
+          <w:rFonts w:ascii="Courier New" w:hAnsi="Courier New" w:cs="Courier New"/>
+          <w:color w:val="auto"/>
+        </w:rPr>
+        <w:t xml:space="preserve"> parameter</w:t>
       </w:r>
       <w:r>
         <w:rPr>
@@ -10910,13 +11170,7 @@
         <w:rPr>
           <w:rFonts w:ascii="Courier New" w:hAnsi="Courier New" w:cs="Courier New"/>
         </w:rPr>
-        <w:t>Size of finite energy element</w:t>
-      </w:r>
-      <w:r>
-        <w:rPr>
-          <w:rFonts w:ascii="Courier New" w:hAnsi="Courier New" w:cs="Courier New"/>
-        </w:rPr>
-        <w:t xml:space="preserve"> in cm-1</w:t>
+        <w:t>Bin size in cm-1</w:t>
       </w:r>
       <w:r>
         <w:rPr>
@@ -11366,7 +11620,21 @@
         <w:rPr>
           <w:color w:val="auto"/>
         </w:rPr>
-        <w:t xml:space="preserve">Are there any “NaN” (Not a Number) instead of an actual number? This means that there are some problems in </w:t>
+        <w:t>Are there any “</w:t>
+      </w:r>
+      <w:proofErr w:type="spellStart"/>
+      <w:r>
+        <w:rPr>
+          <w:color w:val="auto"/>
+        </w:rPr>
+        <w:t>NaN</w:t>
+      </w:r>
+      <w:proofErr w:type="spellEnd"/>
+      <w:r>
+        <w:rPr>
+          <w:color w:val="auto"/>
+        </w:rPr>
+        <w:t xml:space="preserve">” (Not a Number) instead of an actual number? This means that there are some problems in </w:t>
       </w:r>
       <w:r>
         <w:rPr>
@@ -11594,7 +11862,7 @@
           <w:rFonts w:ascii="Courier New" w:hAnsi="Courier New" w:cs="Courier New"/>
           <w:color w:val="auto"/>
         </w:rPr>
-        <w:t>Size of finite energy element in cm-1</w:t>
+        <w:t>Bin size in cm-1</w:t>
       </w:r>
       <w:r>
         <w:rPr>
@@ -11697,8 +11965,10 @@
         <w:rPr>
           <w:color w:val="auto"/>
         </w:rPr>
+        <w:lastRenderedPageBreak/>
         <w:t xml:space="preserve">Explanation of the file </w:t>
       </w:r>
+      <w:proofErr w:type="spellStart"/>
       <w:r>
         <w:rPr>
           <w:i/>
@@ -11713,6 +11983,7 @@
         </w:rPr>
         <w:t>_checkpoint.rrk</w:t>
       </w:r>
+      <w:proofErr w:type="spellEnd"/>
     </w:p>
     <w:p/>
     <w:p>
@@ -11727,6 +11998,7 @@
         </w:rPr>
         <w:t xml:space="preserve">Each time a new finite time step is reached during the iteration, the current status of the calculation (including the current population) is saved into a file called </w:t>
       </w:r>
+      <w:proofErr w:type="spellStart"/>
       <w:r>
         <w:rPr>
           <w:i/>
@@ -11739,7 +12011,14 @@
         <w:rPr>
           <w:color w:val="auto"/>
         </w:rPr>
-        <w:t>_checkpoint.rrk, in the folder where AWARAR is executed or in the provided path</w:t>
+        <w:t>_checkpoint.rrk</w:t>
+      </w:r>
+      <w:proofErr w:type="spellEnd"/>
+      <w:r>
+        <w:rPr>
+          <w:color w:val="auto"/>
+        </w:rPr>
+        <w:t>, in the folder where AWARAR is executed or in the provided path</w:t>
       </w:r>
       <w:r>
         <w:rPr>
@@ -11751,13 +12030,7 @@
         <w:rPr>
           <w:rFonts w:cstheme="minorHAnsi"/>
         </w:rPr>
-        <w:t>(See</w:t>
-      </w:r>
-      <w:r>
-        <w:rPr>
-          <w:rFonts w:cstheme="minorHAnsi"/>
-        </w:rPr>
-        <w:t xml:space="preserve"> </w:t>
+        <w:t xml:space="preserve">(See </w:t>
       </w:r>
       <w:r>
         <w:rPr>
@@ -11799,13 +12072,7 @@
         <w:rPr>
           <w:rFonts w:cstheme="minorHAnsi"/>
         </w:rPr>
-        <w:t xml:space="preserve"> in</w:t>
-      </w:r>
-      <w:r>
-        <w:rPr>
-          <w:rFonts w:cstheme="minorHAnsi"/>
-        </w:rPr>
-        <w:t xml:space="preserve"> chapter “</w:t>
+        <w:t xml:space="preserve"> in chapter “</w:t>
       </w:r>
       <w:r>
         <w:rPr>
@@ -11865,6 +12132,7 @@
         </w:rPr>
         <w:t xml:space="preserve">The file </w:t>
       </w:r>
+      <w:proofErr w:type="spellStart"/>
       <w:r>
         <w:rPr>
           <w:i/>
@@ -11877,7 +12145,14 @@
         <w:rPr>
           <w:color w:val="auto"/>
         </w:rPr>
-        <w:t>_checkpoint.rrk can be opened by AWATAR using the button “Load All”. This can be useful if the calculation was interrupted manually, because it allows to retrieve the information calculated before the interruption.</w:t>
+        <w:t>_checkpoint.rrk</w:t>
+      </w:r>
+      <w:proofErr w:type="spellEnd"/>
+      <w:r>
+        <w:rPr>
+          <w:color w:val="auto"/>
+        </w:rPr>
+        <w:t xml:space="preserve"> can be opened by AWATAR using the button “Load All”. This can be useful if the calculation was interrupted manually, because it allows to retrieve the information calculated before the interruption.</w:t>
       </w:r>
     </w:p>
     <w:p/>
@@ -12038,7 +12313,6 @@
         </w:numPr>
       </w:pPr>
       <w:r>
-        <w:lastRenderedPageBreak/>
         <w:t>Degeneracies and energies of the used wells and TS</w:t>
       </w:r>
     </w:p>
@@ -12087,6 +12361,7 @@
         </w:numPr>
       </w:pPr>
       <w:r>
+        <w:lastRenderedPageBreak/>
         <w:t>DoS for each well</w:t>
       </w:r>
     </w:p>
@@ -12421,7 +12696,23 @@
           <w:rFonts w:cstheme="minorHAnsi"/>
           <w:color w:val="auto"/>
         </w:rPr>
-        <w:t xml:space="preserve">”. If the reached convergence </w:t>
+        <w:t xml:space="preserve">”. If </w:t>
+      </w:r>
+      <w:proofErr w:type="spellStart"/>
+      <w:r>
+        <w:rPr>
+          <w:rFonts w:cstheme="minorHAnsi"/>
+          <w:color w:val="auto"/>
+        </w:rPr>
+        <w:t>the</w:t>
+      </w:r>
+      <w:proofErr w:type="spellEnd"/>
+      <w:r>
+        <w:rPr>
+          <w:rFonts w:cstheme="minorHAnsi"/>
+          <w:color w:val="auto"/>
+        </w:rPr>
+        <w:t xml:space="preserve"> reached convergence </w:t>
       </w:r>
       <w:r>
         <w:rPr>
@@ -12879,7 +13170,6 @@
         <w:rPr>
           <w:color w:val="auto"/>
         </w:rPr>
-        <w:lastRenderedPageBreak/>
         <w:t xml:space="preserve">The populations at the bottom of the file </w:t>
       </w:r>
       <w:r>
@@ -12939,6 +13229,7 @@
         <w:pStyle w:val="berschrift3"/>
       </w:pPr>
       <w:r>
+        <w:lastRenderedPageBreak/>
         <w:t>Using the button “</w:t>
       </w:r>
       <w:r>
@@ -13033,8 +13324,17 @@
           <w:rFonts w:ascii="Courier New" w:hAnsi="Courier New" w:cs="Courier New"/>
           <w:lang w:val="it-IT"/>
         </w:rPr>
-        <w:t xml:space="preserve">         0       0.000000e+000  0.000000e+000</w:t>
-      </w:r>
+        <w:t xml:space="preserve">         0       0.000000e+000  </w:t>
+      </w:r>
+      <w:proofErr w:type="spellStart"/>
+      <w:r>
+        <w:rPr>
+          <w:rFonts w:ascii="Courier New" w:hAnsi="Courier New" w:cs="Courier New"/>
+          <w:lang w:val="it-IT"/>
+        </w:rPr>
+        <w:t>0.000000e+000</w:t>
+      </w:r>
+      <w:proofErr w:type="spellEnd"/>
     </w:p>
     <w:p>
       <w:pPr>
@@ -13200,11 +13500,11 @@
       <w:pPr>
         <w:pStyle w:val="berschrift3"/>
       </w:pPr>
-      <w:bookmarkStart w:id="45" w:name="_Ref193819108"/>
+      <w:bookmarkStart w:id="46" w:name="_Ref193819108"/>
       <w:r>
         <w:t>Options</w:t>
       </w:r>
-      <w:bookmarkEnd w:id="45"/>
+      <w:bookmarkEnd w:id="46"/>
     </w:p>
     <w:p/>
     <w:p>
@@ -13654,7 +13954,14 @@
           <w:rFonts w:ascii="Courier New" w:hAnsi="Courier New" w:cs="Courier New"/>
           <w:color w:val="auto"/>
         </w:rPr>
-        <w:t>Finite time step at 300 K</w:t>
+        <w:t>Finite time step</w:t>
+      </w:r>
+      <w:r>
+        <w:rPr>
+          <w:rFonts w:ascii="Courier New" w:hAnsi="Courier New" w:cs="Courier New"/>
+          <w:color w:val="auto"/>
+        </w:rPr>
+        <w:t xml:space="preserve"> parameter</w:t>
       </w:r>
       <w:r>
         <w:rPr>
@@ -13885,14 +14192,7 @@
         <w:rPr>
           <w:color w:val="auto"/>
         </w:rPr>
-        <w:t xml:space="preserve"> Once the calculation is finished, the results are printed to the panel “Results” and the population can be exported using the button </w:t>
-      </w:r>
-      <w:r>
-        <w:rPr>
-          <w:color w:val="auto"/>
-        </w:rPr>
-        <w:lastRenderedPageBreak/>
-        <w:t>“</w:t>
+        <w:t xml:space="preserve"> Once the calculation is finished, the results are printed to the panel “Results” and the population can be exported using the button “</w:t>
       </w:r>
       <w:r>
         <w:rPr>
@@ -13983,7 +14283,14 @@
           <w:rFonts w:ascii="Courier New" w:hAnsi="Courier New" w:cs="Courier New"/>
           <w:color w:val="auto"/>
         </w:rPr>
-        <w:t>Finite time step at 300 K</w:t>
+        <w:t>Finite time step</w:t>
+      </w:r>
+      <w:r>
+        <w:rPr>
+          <w:rFonts w:ascii="Courier New" w:hAnsi="Courier New" w:cs="Courier New"/>
+          <w:color w:val="auto"/>
+        </w:rPr>
+        <w:t xml:space="preserve"> parameter</w:t>
       </w:r>
       <w:r>
         <w:rPr>
@@ -14050,7 +14357,14 @@
         <w:rPr>
           <w:color w:val="auto"/>
         </w:rPr>
-        <w:t>”. With this button, the new MEM simulation is initialized with the population calculated before.</w:t>
+        <w:t xml:space="preserve">”. With this button, the </w:t>
+      </w:r>
+      <w:r>
+        <w:rPr>
+          <w:color w:val="auto"/>
+        </w:rPr>
+        <w:lastRenderedPageBreak/>
+        <w:t>new MEM simulation is initialized with the population calculated before.</w:t>
       </w:r>
       <w:r>
         <w:rPr>
@@ -14141,17 +14455,17 @@
         <w:pStyle w:val="berschrift1"/>
         <w:spacing w:before="100" w:beforeAutospacing="1" w:after="100" w:afterAutospacing="1"/>
       </w:pPr>
-      <w:bookmarkStart w:id="46" w:name="_Ref193816224"/>
-      <w:bookmarkStart w:id="47" w:name="_Ref193816414"/>
-      <w:bookmarkStart w:id="48" w:name="_Ref193816850"/>
-      <w:bookmarkStart w:id="49" w:name="_Ref193817054"/>
-      <w:bookmarkStart w:id="50" w:name="_Ref193817222"/>
-      <w:bookmarkStart w:id="51" w:name="_Ref193817224"/>
-      <w:bookmarkStart w:id="52" w:name="_Ref193817295"/>
-      <w:bookmarkStart w:id="53" w:name="_Ref193817446"/>
-      <w:bookmarkStart w:id="54" w:name="_Ref193818571"/>
-      <w:bookmarkStart w:id="55" w:name="_Ref193819440"/>
-      <w:bookmarkStart w:id="56" w:name="_Toc195989102"/>
+      <w:bookmarkStart w:id="47" w:name="_Ref193816224"/>
+      <w:bookmarkStart w:id="48" w:name="_Ref193816414"/>
+      <w:bookmarkStart w:id="49" w:name="_Ref193816850"/>
+      <w:bookmarkStart w:id="50" w:name="_Ref193817054"/>
+      <w:bookmarkStart w:id="51" w:name="_Ref193817222"/>
+      <w:bookmarkStart w:id="52" w:name="_Ref193817224"/>
+      <w:bookmarkStart w:id="53" w:name="_Ref193817295"/>
+      <w:bookmarkStart w:id="54" w:name="_Ref193817446"/>
+      <w:bookmarkStart w:id="55" w:name="_Ref193818571"/>
+      <w:bookmarkStart w:id="56" w:name="_Ref193819440"/>
+      <w:bookmarkStart w:id="57" w:name="_Toc206019404"/>
       <w:r>
         <w:t xml:space="preserve">Detailed </w:t>
       </w:r>
@@ -14179,7 +14493,6 @@
       <w:r>
         <w:t>anel</w:t>
       </w:r>
-      <w:bookmarkEnd w:id="46"/>
       <w:bookmarkEnd w:id="47"/>
       <w:bookmarkEnd w:id="48"/>
       <w:bookmarkEnd w:id="49"/>
@@ -14190,6 +14503,7 @@
       <w:bookmarkEnd w:id="54"/>
       <w:bookmarkEnd w:id="55"/>
       <w:bookmarkEnd w:id="56"/>
+      <w:bookmarkEnd w:id="57"/>
     </w:p>
     <w:p>
       <w:pPr>
@@ -14210,7 +14524,21 @@
         <w:rPr>
           <w:rFonts w:ascii="Courier New" w:hAnsi="Courier New" w:cs="Courier New"/>
         </w:rPr>
-        <w:t>;ProgramVersion AWATAR_1.0</w:t>
+        <w:t>;</w:t>
+      </w:r>
+      <w:proofErr w:type="spellStart"/>
+      <w:r>
+        <w:rPr>
+          <w:rFonts w:ascii="Courier New" w:hAnsi="Courier New" w:cs="Courier New"/>
+        </w:rPr>
+        <w:t>ProgramVersion</w:t>
+      </w:r>
+      <w:proofErr w:type="spellEnd"/>
+      <w:r>
+        <w:rPr>
+          <w:rFonts w:ascii="Courier New" w:hAnsi="Courier New" w:cs="Courier New"/>
+        </w:rPr>
+        <w:t xml:space="preserve"> AWATAR_1.0</w:t>
       </w:r>
     </w:p>
     <w:p>
@@ -14225,13 +14553,13 @@
       <w:pPr>
         <w:pStyle w:val="berschrift2"/>
       </w:pPr>
-      <w:bookmarkStart w:id="57" w:name="_Ref193816823"/>
-      <w:bookmarkStart w:id="58" w:name="_Ref193817029"/>
-      <w:bookmarkStart w:id="59" w:name="_Ref193817425"/>
-      <w:bookmarkStart w:id="60" w:name="_Ref193817544"/>
-      <w:bookmarkStart w:id="61" w:name="_Ref193817587"/>
-      <w:bookmarkStart w:id="62" w:name="_Ref193817784"/>
-      <w:bookmarkStart w:id="63" w:name="_Toc195989103"/>
+      <w:bookmarkStart w:id="58" w:name="_Ref193816823"/>
+      <w:bookmarkStart w:id="59" w:name="_Ref193817029"/>
+      <w:bookmarkStart w:id="60" w:name="_Ref193817425"/>
+      <w:bookmarkStart w:id="61" w:name="_Ref193817544"/>
+      <w:bookmarkStart w:id="62" w:name="_Ref193817587"/>
+      <w:bookmarkStart w:id="63" w:name="_Ref193817784"/>
+      <w:bookmarkStart w:id="64" w:name="_Toc206019405"/>
       <w:r>
         <w:t xml:space="preserve">General </w:t>
       </w:r>
@@ -14241,13 +14569,13 @@
       <w:r>
         <w:t>arameters</w:t>
       </w:r>
-      <w:bookmarkEnd w:id="57"/>
       <w:bookmarkEnd w:id="58"/>
       <w:bookmarkEnd w:id="59"/>
       <w:bookmarkEnd w:id="60"/>
       <w:bookmarkEnd w:id="61"/>
       <w:bookmarkEnd w:id="62"/>
       <w:bookmarkEnd w:id="63"/>
+      <w:bookmarkEnd w:id="64"/>
     </w:p>
     <w:p>
       <w:pPr>
@@ -14368,7 +14696,31 @@
         <w:rPr>
           <w:rFonts w:ascii="Courier New" w:hAnsi="Courier New" w:cs="Courier New"/>
         </w:rPr>
-        <w:t xml:space="preserve">     Size of finite energy element in cm-1:                100</w:t>
+        <w:t xml:space="preserve">     </w:t>
+      </w:r>
+      <w:r>
+        <w:rPr>
+          <w:rFonts w:ascii="Courier New" w:hAnsi="Courier New" w:cs="Courier New"/>
+        </w:rPr>
+        <w:t>Bin size</w:t>
+      </w:r>
+      <w:r>
+        <w:rPr>
+          <w:rFonts w:ascii="Courier New" w:hAnsi="Courier New" w:cs="Courier New"/>
+        </w:rPr>
+        <w:t xml:space="preserve"> in cm-1:   </w:t>
+      </w:r>
+      <w:r>
+        <w:rPr>
+          <w:rFonts w:ascii="Courier New" w:hAnsi="Courier New" w:cs="Courier New"/>
+        </w:rPr>
+        <w:t xml:space="preserve">                     </w:t>
+      </w:r>
+      <w:r>
+        <w:rPr>
+          <w:rFonts w:ascii="Courier New" w:hAnsi="Courier New" w:cs="Courier New"/>
+        </w:rPr>
+        <w:t xml:space="preserve">             100</w:t>
       </w:r>
     </w:p>
     <w:p>
@@ -14400,7 +14752,7 @@
       <w:r>
         <w:t xml:space="preserve">Substitute the word </w:t>
       </w:r>
-      <w:bookmarkStart w:id="64" w:name="filename"/>
+      <w:bookmarkStart w:id="65" w:name="filename"/>
       <w:r>
         <w:rPr>
           <w:rFonts w:ascii="Courier" w:hAnsi="Courier" w:cs="Courier"/>
@@ -14408,7 +14760,7 @@
         </w:rPr>
         <w:t>FILENAME</w:t>
       </w:r>
-      <w:bookmarkEnd w:id="64"/>
+      <w:bookmarkEnd w:id="65"/>
       <w:r>
         <w:t xml:space="preserve"> with the name you plan to save the file. During MEM calculations, a file with the name </w:t>
       </w:r>
@@ -14424,6 +14776,7 @@
       <w:r>
         <w:t xml:space="preserve">, and, after usage of the button “Iterative MEM”, a file with the name </w:t>
       </w:r>
+      <w:proofErr w:type="spellStart"/>
       <w:r>
         <w:rPr>
           <w:i/>
@@ -14432,7 +14785,11 @@
         <w:t>filename</w:t>
       </w:r>
       <w:r>
-        <w:t>_checkpoint.rrk are</w:t>
+        <w:t>_checkpoint.rrk</w:t>
+      </w:r>
+      <w:proofErr w:type="spellEnd"/>
+      <w:r>
+        <w:t xml:space="preserve"> are</w:t>
       </w:r>
       <w:r>
         <w:t xml:space="preserve"> generated</w:t>
@@ -14471,7 +14828,7 @@
       <w:r>
         <w:t xml:space="preserve">The </w:t>
       </w:r>
-      <w:bookmarkStart w:id="65" w:name="Frequency_Scale_Factor"/>
+      <w:bookmarkStart w:id="66" w:name="Frequency_Scale_Factor"/>
       <w:r>
         <w:rPr>
           <w:rFonts w:ascii="Courier New" w:hAnsi="Courier New" w:cs="Courier New"/>
@@ -14481,7 +14838,7 @@
       <w:r>
         <w:t xml:space="preserve"> </w:t>
       </w:r>
-      <w:bookmarkEnd w:id="65"/>
+      <w:bookmarkEnd w:id="66"/>
       <w:r>
         <w:t xml:space="preserve">scales vibrational frequencies when reading Gaussian </w:t>
       </w:r>
@@ -14547,7 +14904,7 @@
       <w:r>
         <w:t xml:space="preserve">The </w:t>
       </w:r>
-      <w:bookmarkStart w:id="66" w:name="Energy_range_of_population"/>
+      <w:bookmarkStart w:id="67" w:name="Energy_range_of_population"/>
       <w:r>
         <w:rPr>
           <w:rFonts w:ascii="Courier New" w:hAnsi="Courier New" w:cs="Courier New"/>
@@ -14566,7 +14923,7 @@
         </w:rPr>
         <w:t xml:space="preserve"> </w:t>
       </w:r>
-      <w:bookmarkEnd w:id="66"/>
+      <w:bookmarkEnd w:id="67"/>
       <w:r>
         <w:rPr>
           <w:rFonts w:cstheme="minorHAnsi"/>
@@ -14682,15 +15039,14 @@
         <w:rPr>
           <w:rFonts w:cstheme="minorHAnsi"/>
         </w:rPr>
-        <w:lastRenderedPageBreak/>
         <w:t xml:space="preserve">The </w:t>
       </w:r>
-      <w:bookmarkStart w:id="67" w:name="Size_of_finite_energy_element"/>
-      <w:r>
-        <w:rPr>
-          <w:rFonts w:ascii="Courier New" w:hAnsi="Courier New" w:cs="Courier New"/>
-        </w:rPr>
-        <w:t>Size of finite energy element</w:t>
+      <w:bookmarkStart w:id="68" w:name="Size_of_finite_energy_element"/>
+      <w:r>
+        <w:rPr>
+          <w:rFonts w:ascii="Courier New" w:hAnsi="Courier New" w:cs="Courier New"/>
+        </w:rPr>
+        <w:t>Bin size</w:t>
       </w:r>
       <w:r>
         <w:rPr>
@@ -14698,7 +15054,7 @@
         </w:rPr>
         <w:t xml:space="preserve"> in cm-1</w:t>
       </w:r>
-      <w:bookmarkEnd w:id="67"/>
+      <w:bookmarkEnd w:id="68"/>
       <w:r>
         <w:rPr>
           <w:rFonts w:cstheme="minorHAnsi"/>
@@ -14709,13 +15065,13 @@
         <w:rPr>
           <w:rFonts w:cstheme="minorHAnsi"/>
         </w:rPr>
-        <w:t>bin</w:t>
-      </w:r>
-      <w:r>
-        <w:rPr>
-          <w:rFonts w:cstheme="minorHAnsi"/>
-        </w:rPr>
-        <w:t xml:space="preserve">s, in which the energy range is divided. Smaller </w:t>
+        <w:t>finite energy elements</w:t>
+      </w:r>
+      <w:r>
+        <w:rPr>
+          <w:rFonts w:cstheme="minorHAnsi"/>
+        </w:rPr>
+        <w:t xml:space="preserve">, in which the energy range is divided. Smaller </w:t>
       </w:r>
       <w:r>
         <w:rPr>
@@ -14780,9 +15136,10 @@
         <w:rPr>
           <w:rFonts w:cstheme="minorHAnsi"/>
         </w:rPr>
+        <w:lastRenderedPageBreak/>
         <w:t xml:space="preserve">The </w:t>
       </w:r>
-      <w:bookmarkStart w:id="68" w:name="Energy_quantum_for_BeyerSwinehart"/>
+      <w:bookmarkStart w:id="69" w:name="Energy_quantum_for_BeyerSwinehart"/>
       <w:r>
         <w:rPr>
           <w:rFonts w:ascii="Courier New" w:hAnsi="Courier New" w:cs="Courier New"/>
@@ -14795,7 +15152,7 @@
         </w:rPr>
         <w:t xml:space="preserve"> in cm-1</w:t>
       </w:r>
-      <w:bookmarkEnd w:id="68"/>
+      <w:bookmarkEnd w:id="69"/>
       <w:r>
         <w:rPr>
           <w:rFonts w:cstheme="minorHAnsi"/>
@@ -14878,19 +15235,19 @@
       <w:pPr>
         <w:pStyle w:val="berschrift2"/>
       </w:pPr>
-      <w:bookmarkStart w:id="69" w:name="_Ref193817192"/>
-      <w:bookmarkStart w:id="70" w:name="_Ref193817337"/>
-      <w:bookmarkStart w:id="71" w:name="_Ref193817693"/>
-      <w:bookmarkStart w:id="72" w:name="_Ref193817917"/>
-      <w:bookmarkStart w:id="73" w:name="_Toc195989104"/>
+      <w:bookmarkStart w:id="70" w:name="_Ref193817192"/>
+      <w:bookmarkStart w:id="71" w:name="_Ref193817337"/>
+      <w:bookmarkStart w:id="72" w:name="_Ref193817693"/>
+      <w:bookmarkStart w:id="73" w:name="_Ref193817917"/>
+      <w:bookmarkStart w:id="74" w:name="_Toc206019406"/>
       <w:r>
         <w:t>Reaction channels</w:t>
       </w:r>
-      <w:bookmarkEnd w:id="69"/>
       <w:bookmarkEnd w:id="70"/>
       <w:bookmarkEnd w:id="71"/>
       <w:bookmarkEnd w:id="72"/>
       <w:bookmarkEnd w:id="73"/>
+      <w:bookmarkEnd w:id="74"/>
     </w:p>
     <w:p>
       <w:r>
@@ -15667,7 +16024,6 @@
         <w:rPr>
           <w:b/>
         </w:rPr>
-        <w:lastRenderedPageBreak/>
         <w:t xml:space="preserve">Channels defined from given </w:t>
       </w:r>
       <w:r>
@@ -15702,7 +16058,11 @@
         <w:t>Channel 0 Well 0 TS 0</w:t>
       </w:r>
       <w:r>
-        <w:t>”. Several channels can be defined, each connecting a well with a transition state. The Reaction Channels section could then look for example like this:</w:t>
+        <w:t xml:space="preserve">”. Several channels can be defined, </w:t>
+      </w:r>
+      <w:r>
+        <w:lastRenderedPageBreak/>
+        <w:t>each connecting a well with a transition state. The Reaction Channels section could then look for example like this:</w:t>
       </w:r>
     </w:p>
     <w:p>
@@ -15854,17 +16214,25 @@
       <w:pPr>
         <w:pStyle w:val="berschrift2"/>
       </w:pPr>
-      <w:bookmarkStart w:id="74" w:name="_Ref193818044"/>
-      <w:bookmarkStart w:id="75" w:name="_Ref193818152"/>
-      <w:bookmarkStart w:id="76" w:name="_Ref193819035"/>
-      <w:bookmarkStart w:id="77" w:name="_Toc195989105"/>
-      <w:r>
-        <w:t>Definitions for master equation modeling (MEM)</w:t>
-      </w:r>
-      <w:bookmarkEnd w:id="74"/>
+      <w:bookmarkStart w:id="75" w:name="_Ref193818044"/>
+      <w:bookmarkStart w:id="76" w:name="_Ref193818152"/>
+      <w:bookmarkStart w:id="77" w:name="_Ref193819035"/>
+      <w:bookmarkStart w:id="78" w:name="_Toc206019407"/>
+      <w:r>
+        <w:t xml:space="preserve">Definitions for master equation </w:t>
+      </w:r>
+      <w:proofErr w:type="spellStart"/>
+      <w:r>
+        <w:t>modeling</w:t>
+      </w:r>
+      <w:proofErr w:type="spellEnd"/>
+      <w:r>
+        <w:t xml:space="preserve"> (MEM)</w:t>
+      </w:r>
       <w:bookmarkEnd w:id="75"/>
       <w:bookmarkEnd w:id="76"/>
       <w:bookmarkEnd w:id="77"/>
+      <w:bookmarkEnd w:id="78"/>
     </w:p>
     <w:p/>
     <w:p>
@@ -16017,11 +16385,11 @@
       <w:pPr>
         <w:pStyle w:val="berschrift3"/>
       </w:pPr>
-      <w:bookmarkStart w:id="78" w:name="_Ref193818016"/>
+      <w:bookmarkStart w:id="79" w:name="_Ref193818016"/>
       <w:r>
         <w:t>General MEM parameters</w:t>
       </w:r>
-      <w:bookmarkEnd w:id="78"/>
+      <w:bookmarkEnd w:id="79"/>
     </w:p>
     <w:p>
       <w:r>
@@ -16116,20 +16484,526 @@
         <w:rPr>
           <w:rFonts w:ascii="Courier New" w:hAnsi="Courier New" w:cs="Courier New"/>
         </w:rPr>
-        <w:t xml:space="preserve">       Start temperature in K:                              200</w:t>
-      </w:r>
-    </w:p>
-    <w:p>
-      <w:pPr>
-        <w:rPr>
-          <w:rFonts w:ascii="Courier New" w:hAnsi="Courier New" w:cs="Courier New"/>
-        </w:rPr>
-      </w:pPr>
-      <w:r>
-        <w:rPr>
-          <w:rFonts w:ascii="Courier New" w:hAnsi="Courier New" w:cs="Courier New"/>
-        </w:rPr>
-        <w:t xml:space="preserve">       End temperature in K:                                300</w:t>
+        <w:t xml:space="preserve">       </w:t>
+      </w:r>
+      <w:r>
+        <w:rPr>
+          <w:rFonts w:ascii="Courier New" w:hAnsi="Courier New" w:cs="Courier New"/>
+        </w:rPr>
+        <w:t>Loop starts with</w:t>
+      </w:r>
+      <w:r>
+        <w:rPr>
+          <w:rFonts w:ascii="Courier New" w:hAnsi="Courier New" w:cs="Courier New"/>
+        </w:rPr>
+        <w:t xml:space="preserve"> temperature in K:                   200</w:t>
+      </w:r>
+    </w:p>
+    <w:p>
+      <w:pPr>
+        <w:rPr>
+          <w:rFonts w:ascii="Courier New" w:hAnsi="Courier New" w:cs="Courier New"/>
+        </w:rPr>
+      </w:pPr>
+      <w:r>
+        <w:rPr>
+          <w:rFonts w:ascii="Courier New" w:hAnsi="Courier New" w:cs="Courier New"/>
+        </w:rPr>
+        <w:t xml:space="preserve">       </w:t>
+      </w:r>
+      <w:r>
+        <w:rPr>
+          <w:rFonts w:ascii="Courier New" w:hAnsi="Courier New" w:cs="Courier New"/>
+        </w:rPr>
+        <w:t xml:space="preserve">Loop ends </w:t>
+      </w:r>
+      <w:r>
+        <w:rPr>
+          <w:rFonts w:ascii="Courier New" w:hAnsi="Courier New" w:cs="Courier New"/>
+        </w:rPr>
+        <w:t xml:space="preserve">with </w:t>
+      </w:r>
+      <w:r>
+        <w:rPr>
+          <w:rFonts w:ascii="Courier New" w:hAnsi="Courier New" w:cs="Courier New"/>
+        </w:rPr>
+        <w:t>temperature in K:                     300</w:t>
+      </w:r>
+    </w:p>
+    <w:p>
+      <w:pPr>
+        <w:rPr>
+          <w:rFonts w:ascii="Courier New" w:hAnsi="Courier New" w:cs="Courier New"/>
+        </w:rPr>
+      </w:pPr>
+      <w:r>
+        <w:rPr>
+          <w:rFonts w:ascii="Courier New" w:hAnsi="Courier New" w:cs="Courier New"/>
+        </w:rPr>
+        <w:t xml:space="preserve">       </w:t>
+      </w:r>
+      <w:r>
+        <w:rPr>
+          <w:rFonts w:ascii="Courier New" w:hAnsi="Courier New" w:cs="Courier New"/>
+        </w:rPr>
+        <w:t>Proportion on solid angle of ICR cell window:        0.002</w:t>
+      </w:r>
+    </w:p>
+    <w:p>
+      <w:pPr>
+        <w:rPr>
+          <w:rFonts w:ascii="Courier New" w:hAnsi="Courier New" w:cs="Courier New"/>
+        </w:rPr>
+      </w:pPr>
+      <w:r>
+        <w:rPr>
+          <w:rFonts w:ascii="Courier New" w:hAnsi="Courier New" w:cs="Courier New"/>
+        </w:rPr>
+        <w:t xml:space="preserve">       </w:t>
+      </w:r>
+      <w:r>
+        <w:rPr>
+          <w:rFonts w:ascii="Courier New" w:hAnsi="Courier New" w:cs="Courier New"/>
+        </w:rPr>
+        <w:t>Temperature of ICR cell window</w:t>
+      </w:r>
+      <w:r>
+        <w:rPr>
+          <w:rFonts w:ascii="Courier New" w:hAnsi="Courier New" w:cs="Courier New"/>
+        </w:rPr>
+        <w:t xml:space="preserve"> in K:                 288</w:t>
+      </w:r>
+    </w:p>
+    <w:p/>
+    <w:p>
+      <w:r>
+        <w:t>AWATAR was developed to simulate the blackbody radiation in an ICR cell, where the cell walls can be cooled or warmed to a temperature of interest, except for a small part of the solid angle, which is at room temperature. Typically, experiments are repeated at different temperatures. This experimental setup is reflected in the default settings of the section “</w:t>
+      </w:r>
+      <w:r>
+        <w:rPr>
+          <w:rFonts w:ascii="Courier New" w:hAnsi="Courier New" w:cs="Courier New"/>
+        </w:rPr>
+        <w:t>BIRD parameters</w:t>
+      </w:r>
+      <w:r>
+        <w:t>”. To perform MEM for only one temperature covering the whole solid angle, change the “</w:t>
+      </w:r>
+      <w:r>
+        <w:rPr>
+          <w:rFonts w:ascii="Courier New" w:hAnsi="Courier New" w:cs="Courier New"/>
+        </w:rPr>
+        <w:t>BIRD parameters</w:t>
+      </w:r>
+      <w:r>
+        <w:t>” section as follows:</w:t>
+      </w:r>
+    </w:p>
+    <w:p/>
+    <w:p>
+      <w:pPr>
+        <w:rPr>
+          <w:rFonts w:ascii="Courier New" w:hAnsi="Courier New" w:cs="Courier New"/>
+        </w:rPr>
+      </w:pPr>
+      <w:r>
+        <w:rPr>
+          <w:rFonts w:ascii="Courier New" w:hAnsi="Courier New" w:cs="Courier New"/>
+        </w:rPr>
+        <w:t>;   BIRD parameters:</w:t>
+      </w:r>
+    </w:p>
+    <w:p>
+      <w:pPr>
+        <w:rPr>
+          <w:rFonts w:ascii="Courier New" w:hAnsi="Courier New" w:cs="Courier New"/>
+        </w:rPr>
+      </w:pPr>
+      <w:r>
+        <w:rPr>
+          <w:rFonts w:ascii="Courier New" w:hAnsi="Courier New" w:cs="Courier New"/>
+        </w:rPr>
+        <w:t xml:space="preserve">       </w:t>
+      </w:r>
+      <w:r>
+        <w:rPr>
+          <w:rFonts w:ascii="Courier New" w:hAnsi="Courier New" w:cs="Courier New"/>
+          <w:highlight w:val="yellow"/>
+        </w:rPr>
+        <w:t>Number of temperatures in loop:                      1</w:t>
+      </w:r>
+    </w:p>
+    <w:p>
+      <w:pPr>
+        <w:rPr>
+          <w:rFonts w:ascii="Courier New" w:hAnsi="Courier New" w:cs="Courier New"/>
+        </w:rPr>
+      </w:pPr>
+      <w:r>
+        <w:rPr>
+          <w:rFonts w:ascii="Courier New" w:hAnsi="Courier New" w:cs="Courier New"/>
+        </w:rPr>
+        <w:t xml:space="preserve">       </w:t>
+      </w:r>
+      <w:r>
+        <w:rPr>
+          <w:rFonts w:ascii="Courier New" w:hAnsi="Courier New" w:cs="Courier New"/>
+          <w:highlight w:val="yellow"/>
+        </w:rPr>
+        <w:t>Manual list for temperatures in loop:                x</w:t>
+      </w:r>
+    </w:p>
+    <w:p>
+      <w:pPr>
+        <w:rPr>
+          <w:rFonts w:ascii="Courier New" w:hAnsi="Courier New" w:cs="Courier New"/>
+        </w:rPr>
+      </w:pPr>
+      <w:r>
+        <w:rPr>
+          <w:rFonts w:ascii="Courier New" w:hAnsi="Courier New" w:cs="Courier New"/>
+        </w:rPr>
+        <w:t xml:space="preserve">       </w:t>
+      </w:r>
+      <w:r>
+        <w:rPr>
+          <w:rFonts w:ascii="Courier New" w:hAnsi="Courier New" w:cs="Courier New"/>
+        </w:rPr>
+        <w:t>Loop starts with</w:t>
+      </w:r>
+      <w:r>
+        <w:rPr>
+          <w:rFonts w:ascii="Courier New" w:hAnsi="Courier New" w:cs="Courier New"/>
+        </w:rPr>
+        <w:t xml:space="preserve"> temperature in K:                   200</w:t>
+      </w:r>
+    </w:p>
+    <w:p>
+      <w:pPr>
+        <w:rPr>
+          <w:rFonts w:ascii="Courier New" w:hAnsi="Courier New" w:cs="Courier New"/>
+        </w:rPr>
+      </w:pPr>
+      <w:r>
+        <w:rPr>
+          <w:rFonts w:ascii="Courier New" w:hAnsi="Courier New" w:cs="Courier New"/>
+        </w:rPr>
+        <w:t xml:space="preserve">       Loop ends with temperature in K:                     300</w:t>
+      </w:r>
+    </w:p>
+    <w:p>
+      <w:pPr>
+        <w:rPr>
+          <w:rFonts w:ascii="Courier New" w:hAnsi="Courier New" w:cs="Courier New"/>
+        </w:rPr>
+      </w:pPr>
+      <w:r>
+        <w:rPr>
+          <w:rFonts w:ascii="Courier New" w:hAnsi="Courier New" w:cs="Courier New"/>
+        </w:rPr>
+        <w:t xml:space="preserve">       </w:t>
+      </w:r>
+      <w:r>
+        <w:rPr>
+          <w:rFonts w:ascii="Courier New" w:hAnsi="Courier New" w:cs="Courier New"/>
+          <w:highlight w:val="yellow"/>
+        </w:rPr>
+        <w:t>Proportion on solid angle of ICR cell window:        0</w:t>
+      </w:r>
+    </w:p>
+    <w:p>
+      <w:pPr>
+        <w:rPr>
+          <w:rFonts w:ascii="Courier New" w:hAnsi="Courier New" w:cs="Courier New"/>
+        </w:rPr>
+      </w:pPr>
+      <w:r>
+        <w:rPr>
+          <w:rFonts w:ascii="Courier New" w:hAnsi="Courier New" w:cs="Courier New"/>
+        </w:rPr>
+        <w:t xml:space="preserve">       </w:t>
+      </w:r>
+      <w:r>
+        <w:rPr>
+          <w:rFonts w:ascii="Courier New" w:hAnsi="Courier New" w:cs="Courier New"/>
+        </w:rPr>
+        <w:t>Temperature of ICR cell window</w:t>
+      </w:r>
+      <w:r>
+        <w:rPr>
+          <w:rFonts w:ascii="Courier New" w:hAnsi="Courier New" w:cs="Courier New"/>
+        </w:rPr>
+        <w:t xml:space="preserve"> in K:                 288</w:t>
+      </w:r>
+    </w:p>
+    <w:p/>
+    <w:p>
+      <w:pPr>
+        <w:spacing w:after="0"/>
+        <w:rPr>
+          <w:rFonts w:cstheme="minorHAnsi"/>
+        </w:rPr>
+      </w:pPr>
+      <w:r>
+        <w:lastRenderedPageBreak/>
+        <w:t>whereby x is the temperature of interest in Kelvin. Note, that the semicolon in front of the line “Manual list for temperatures in loop” has been removed.</w:t>
+      </w:r>
+      <w:r>
+        <w:t xml:space="preserve"> </w:t>
+      </w:r>
+      <w:r>
+        <w:rPr>
+          <w:rFonts w:cstheme="minorHAnsi"/>
+        </w:rPr>
+        <w:t xml:space="preserve">The parameters </w:t>
+      </w:r>
+      <w:r>
+        <w:rPr>
+          <w:rFonts w:ascii="Courier New" w:hAnsi="Courier New" w:cs="Courier New"/>
+        </w:rPr>
+        <w:t>Loop starts with</w:t>
+      </w:r>
+      <w:r>
+        <w:rPr>
+          <w:rFonts w:ascii="Courier New" w:hAnsi="Courier New" w:cs="Courier New"/>
+        </w:rPr>
+        <w:t xml:space="preserve"> temperature in K</w:t>
+      </w:r>
+      <w:r>
+        <w:rPr>
+          <w:rFonts w:cstheme="minorHAnsi"/>
+        </w:rPr>
+        <w:t xml:space="preserve"> and </w:t>
+      </w:r>
+      <w:r>
+        <w:rPr>
+          <w:rFonts w:ascii="Courier New" w:hAnsi="Courier New" w:cs="Courier New"/>
+        </w:rPr>
+        <w:t>Loop ends with</w:t>
+      </w:r>
+      <w:r>
+        <w:rPr>
+          <w:rFonts w:ascii="Courier New" w:hAnsi="Courier New" w:cs="Courier New"/>
+        </w:rPr>
+        <w:t xml:space="preserve"> temperature in K</w:t>
+      </w:r>
+      <w:r>
+        <w:rPr>
+          <w:rFonts w:cstheme="minorHAnsi"/>
+        </w:rPr>
+        <w:t xml:space="preserve"> are ignored if the line with the </w:t>
+      </w:r>
+      <w:r>
+        <w:rPr>
+          <w:rFonts w:ascii="Courier New" w:hAnsi="Courier New" w:cs="Courier New"/>
+        </w:rPr>
+        <w:t>Manual list for temperatures in loop</w:t>
+      </w:r>
+      <w:r>
+        <w:rPr>
+          <w:rFonts w:cstheme="minorHAnsi"/>
+        </w:rPr>
+        <w:t xml:space="preserve">  is active.</w:t>
+      </w:r>
+    </w:p>
+    <w:p>
+      <w:pPr>
+        <w:spacing w:after="0"/>
+        <w:rPr>
+          <w:rFonts w:cstheme="minorHAnsi"/>
+        </w:rPr>
+      </w:pPr>
+    </w:p>
+    <w:p>
+      <w:r>
+        <w:t xml:space="preserve">The MEM calculation can also be performed several times in one calculation, varying the environmental temperature. Therefore, augment the </w:t>
+      </w:r>
+      <w:r>
+        <w:rPr>
+          <w:rFonts w:ascii="Courier New" w:hAnsi="Courier New" w:cs="Courier New"/>
+        </w:rPr>
+        <w:t>Number of temperatures in loop</w:t>
+      </w:r>
+      <w:r>
+        <w:t xml:space="preserve"> and list all needed temperatures in the line </w:t>
+      </w:r>
+      <w:r>
+        <w:rPr>
+          <w:rFonts w:ascii="Courier New" w:hAnsi="Courier New" w:cs="Courier New"/>
+        </w:rPr>
+        <w:t>Manual list for temperatures in loop</w:t>
+      </w:r>
+      <w:r>
+        <w:t>, for example:</w:t>
+      </w:r>
+    </w:p>
+    <w:p>
+      <w:pPr>
+        <w:rPr>
+          <w:rFonts w:ascii="Courier New" w:hAnsi="Courier New" w:cs="Courier New"/>
+        </w:rPr>
+      </w:pPr>
+      <w:r>
+        <w:rPr>
+          <w:rFonts w:ascii="Courier New" w:hAnsi="Courier New" w:cs="Courier New"/>
+        </w:rPr>
+        <w:t xml:space="preserve">       Number of temperatures in loop:                      3</w:t>
+      </w:r>
+    </w:p>
+    <w:p>
+      <w:pPr>
+        <w:rPr>
+          <w:rFonts w:ascii="Courier New" w:hAnsi="Courier New" w:cs="Courier New"/>
+        </w:rPr>
+      </w:pPr>
+      <w:r>
+        <w:rPr>
+          <w:rFonts w:ascii="Courier New" w:hAnsi="Courier New" w:cs="Courier New"/>
+        </w:rPr>
+        <w:t xml:space="preserve">       Manual list for temperatures in loop:           200 225 250</w:t>
+      </w:r>
+    </w:p>
+    <w:p>
+      <w:pPr>
+        <w:rPr>
+          <w:rFonts w:cstheme="minorHAnsi"/>
+        </w:rPr>
+      </w:pPr>
+      <w:r>
+        <w:rPr>
+          <w:rFonts w:cstheme="minorHAnsi"/>
+        </w:rPr>
+        <w:t>T</w:t>
+      </w:r>
+      <w:r>
+        <w:rPr>
+          <w:rFonts w:cstheme="minorHAnsi"/>
+        </w:rPr>
+        <w:t xml:space="preserve">he </w:t>
+      </w:r>
+      <w:r>
+        <w:rPr>
+          <w:rFonts w:cstheme="minorHAnsi"/>
+        </w:rPr>
+        <w:t>N</w:t>
+      </w:r>
+      <w:r>
+        <w:rPr>
+          <w:rFonts w:cstheme="minorHAnsi"/>
+        </w:rPr>
+        <w:t>umber of temperatures in loop has to match the numbers of entries in the Manual list for temperatures in loop.</w:t>
+      </w:r>
+    </w:p>
+    <w:p/>
+    <w:p>
+      <w:r>
+        <w:t>Alternatively, AWATAR can calculate several temperatures such, that they are equally spaced in an Arrhenius plot, where the x-axis is the inverse temperature. Therefore, put a semicolon in front of the line “Manual list for temperatures in loop” (as it is the case for the default parameters panel) and use instead the parameters “</w:t>
+      </w:r>
+      <w:r>
+        <w:t>Loop starts with</w:t>
+      </w:r>
+      <w:r>
+        <w:t xml:space="preserve"> temperature in K” and “</w:t>
+      </w:r>
+      <w:r>
+        <w:t>Loop ends with</w:t>
+      </w:r>
+      <w:r>
+        <w:t xml:space="preserve"> temperature in K” to define the temperature range. For example, to calculate 7 datapoints in the range of 250 K to 350 K:</w:t>
+      </w:r>
+    </w:p>
+    <w:p>
+      <w:pPr>
+        <w:rPr>
+          <w:rFonts w:ascii="Courier New" w:hAnsi="Courier New" w:cs="Courier New"/>
+        </w:rPr>
+      </w:pPr>
+      <w:r>
+        <w:rPr>
+          <w:rFonts w:ascii="Courier New" w:hAnsi="Courier New" w:cs="Courier New"/>
+        </w:rPr>
+        <w:t>;   BIRD parameters:</w:t>
+      </w:r>
+    </w:p>
+    <w:p>
+      <w:pPr>
+        <w:rPr>
+          <w:rFonts w:ascii="Courier New" w:hAnsi="Courier New" w:cs="Courier New"/>
+        </w:rPr>
+      </w:pPr>
+      <w:r>
+        <w:rPr>
+          <w:rFonts w:ascii="Courier New" w:hAnsi="Courier New" w:cs="Courier New"/>
+        </w:rPr>
+        <w:t xml:space="preserve">       Number of temperatures in loop:                      7</w:t>
+      </w:r>
+    </w:p>
+    <w:p>
+      <w:pPr>
+        <w:rPr>
+          <w:rFonts w:ascii="Courier New" w:hAnsi="Courier New" w:cs="Courier New"/>
+        </w:rPr>
+      </w:pPr>
+      <w:r>
+        <w:rPr>
+          <w:rFonts w:ascii="Courier New" w:hAnsi="Courier New" w:cs="Courier New"/>
+        </w:rPr>
+        <w:t>;      Manual list for temperatures in loop:     150.00 215.34 250.50</w:t>
+      </w:r>
+    </w:p>
+    <w:p>
+      <w:pPr>
+        <w:rPr>
+          <w:rFonts w:ascii="Courier New" w:hAnsi="Courier New" w:cs="Courier New"/>
+        </w:rPr>
+      </w:pPr>
+      <w:r>
+        <w:rPr>
+          <w:rFonts w:ascii="Courier New" w:hAnsi="Courier New" w:cs="Courier New"/>
+        </w:rPr>
+        <w:t xml:space="preserve">       </w:t>
+      </w:r>
+      <w:r>
+        <w:rPr>
+          <w:rFonts w:ascii="Courier New" w:hAnsi="Courier New" w:cs="Courier New"/>
+        </w:rPr>
+        <w:t>Loop starts with</w:t>
+      </w:r>
+      <w:r>
+        <w:rPr>
+          <w:rFonts w:ascii="Courier New" w:hAnsi="Courier New" w:cs="Courier New"/>
+        </w:rPr>
+        <w:t xml:space="preserve"> temperature in K:                   250</w:t>
+      </w:r>
+    </w:p>
+    <w:p>
+      <w:pPr>
+        <w:rPr>
+          <w:rFonts w:ascii="Courier New" w:hAnsi="Courier New" w:cs="Courier New"/>
+        </w:rPr>
+      </w:pPr>
+      <w:r>
+        <w:rPr>
+          <w:rFonts w:ascii="Courier New" w:hAnsi="Courier New" w:cs="Courier New"/>
+        </w:rPr>
+        <w:t xml:space="preserve">       </w:t>
+      </w:r>
+      <w:r>
+        <w:rPr>
+          <w:rFonts w:ascii="Courier New" w:hAnsi="Courier New" w:cs="Courier New"/>
+        </w:rPr>
+        <w:t>Loop ends with</w:t>
+      </w:r>
+      <w:r>
+        <w:rPr>
+          <w:rFonts w:ascii="Courier New" w:hAnsi="Courier New" w:cs="Courier New"/>
+        </w:rPr>
+        <w:t xml:space="preserve"> temperature in K:                     350</w:t>
+      </w:r>
+    </w:p>
+    <w:p/>
+    <w:p>
+      <w:r>
+        <w:t>The last two parameters of the section “BIRD parameters” can be used to add a part of the solid angle, which is not at the same temperature than the rest. For example,</w:t>
       </w:r>
     </w:p>
     <w:p>
@@ -16155,7 +17029,96 @@
         <w:rPr>
           <w:rFonts w:ascii="Courier New" w:hAnsi="Courier New" w:cs="Courier New"/>
         </w:rPr>
-        <w:t xml:space="preserve">       Room</w:t>
+        <w:t xml:space="preserve">       </w:t>
+      </w:r>
+      <w:r>
+        <w:rPr>
+          <w:rFonts w:ascii="Courier New" w:hAnsi="Courier New" w:cs="Courier New"/>
+        </w:rPr>
+        <w:t>Temperature of ICR cell window</w:t>
+      </w:r>
+      <w:r>
+        <w:rPr>
+          <w:rFonts w:ascii="Courier New" w:hAnsi="Courier New" w:cs="Courier New"/>
+        </w:rPr>
+        <w:t xml:space="preserve"> in K:                 288</w:t>
+      </w:r>
+    </w:p>
+    <w:p>
+      <w:r>
+        <w:t>sets 0.2% of the solid angle to a temperature of 288 K. Note, that this temperature stays the same, if the MEM is performed several times for different environmental temperatures as discussed above.</w:t>
+      </w:r>
+    </w:p>
+    <w:p/>
+    <w:p>
+      <w:r>
+        <w:t xml:space="preserve">The next part of the </w:t>
+      </w:r>
+      <w:r>
+        <w:t>“</w:t>
+      </w:r>
+      <w:r>
+        <w:t>General MEM parameters</w:t>
+      </w:r>
+      <w:r>
+        <w:t>”</w:t>
+      </w:r>
+      <w:r>
+        <w:t xml:space="preserve"> are the </w:t>
+      </w:r>
+      <w:r>
+        <w:t>“</w:t>
+      </w:r>
+      <w:r>
+        <w:t>IRMPD parameters</w:t>
+      </w:r>
+      <w:r>
+        <w:t>”</w:t>
+      </w:r>
+      <w:r>
+        <w:t>: This part looks like this:</w:t>
+      </w:r>
+    </w:p>
+    <w:p>
+      <w:pPr>
+        <w:jc w:val="left"/>
+        <w:rPr>
+          <w:rFonts w:ascii="Courier New" w:hAnsi="Courier New" w:cs="Courier New"/>
+        </w:rPr>
+      </w:pPr>
+      <w:r>
+        <w:rPr>
+          <w:rFonts w:ascii="Courier New" w:hAnsi="Courier New" w:cs="Courier New"/>
+        </w:rPr>
+        <w:t>;  IRMPD parameters:</w:t>
+      </w:r>
+    </w:p>
+    <w:p>
+      <w:pPr>
+        <w:jc w:val="left"/>
+        <w:rPr>
+          <w:rFonts w:ascii="Courier New" w:hAnsi="Courier New" w:cs="Courier New"/>
+        </w:rPr>
+      </w:pPr>
+      <w:r>
+        <w:rPr>
+          <w:rFonts w:ascii="Courier New" w:hAnsi="Courier New" w:cs="Courier New"/>
+        </w:rPr>
+        <w:t xml:space="preserve">       Rate of Photon absorption for Well all in s-1:       0</w:t>
+      </w:r>
+    </w:p>
+    <w:p>
+      <w:pPr>
+        <w:jc w:val="left"/>
+        <w:rPr>
+          <w:rFonts w:ascii="Courier New" w:hAnsi="Courier New" w:cs="Courier New"/>
+        </w:rPr>
+      </w:pPr>
+      <w:r>
+        <w:rPr>
+          <w:rFonts w:ascii="Courier New" w:hAnsi="Courier New" w:cs="Courier New"/>
+        </w:rPr>
+        <w:t>;      Rate of Photon absorption for Well 0 3 7 in s-1:     0</w:t>
       </w:r>
       <w:r>
         <w:rPr>
@@ -16163,582 +17126,286 @@
         </w:rPr>
         <w:t xml:space="preserve"> </w:t>
       </w:r>
-      <w:r>
-        <w:rPr>
-          <w:rFonts w:ascii="Courier New" w:hAnsi="Courier New" w:cs="Courier New"/>
-        </w:rPr>
-        <w:t>temperature in K:                               288</w:t>
-      </w:r>
-    </w:p>
-    <w:p/>
-    <w:p>
-      <w:r>
-        <w:t>AWATAR was developed to simulate the blackbody radiation in an ICR cell, where the cell walls can be cooled or warmed to a temperature of interest, except for a small part of the solid angle, which is at room temperature. Typically, experiments are repeated at different temperatures. This experimental setup is reflected in the default settings of the section “</w:t>
-      </w:r>
-      <w:r>
-        <w:rPr>
-          <w:rFonts w:ascii="Courier New" w:hAnsi="Courier New" w:cs="Courier New"/>
-        </w:rPr>
-        <w:t>BIRD parameters</w:t>
-      </w:r>
-      <w:r>
-        <w:t>”. To perform MEM for only one temperature covering the whole solid angle, change the “</w:t>
-      </w:r>
-      <w:r>
-        <w:rPr>
-          <w:rFonts w:ascii="Courier New" w:hAnsi="Courier New" w:cs="Courier New"/>
-        </w:rPr>
-        <w:t>BIRD parameters</w:t>
-      </w:r>
-      <w:r>
-        <w:t>” section as follows:</w:t>
-      </w:r>
-    </w:p>
-    <w:p/>
-    <w:p>
-      <w:pPr>
-        <w:rPr>
-          <w:rFonts w:ascii="Courier New" w:hAnsi="Courier New" w:cs="Courier New"/>
-        </w:rPr>
-      </w:pPr>
-      <w:r>
-        <w:rPr>
-          <w:rFonts w:ascii="Courier New" w:hAnsi="Courier New" w:cs="Courier New"/>
-        </w:rPr>
-        <w:t>;   BIRD parameters:</w:t>
-      </w:r>
-    </w:p>
-    <w:p>
-      <w:pPr>
-        <w:rPr>
-          <w:rFonts w:ascii="Courier New" w:hAnsi="Courier New" w:cs="Courier New"/>
-        </w:rPr>
-      </w:pPr>
-      <w:r>
-        <w:rPr>
-          <w:rFonts w:ascii="Courier New" w:hAnsi="Courier New" w:cs="Courier New"/>
-        </w:rPr>
-        <w:t xml:space="preserve">       </w:t>
-      </w:r>
-      <w:r>
-        <w:rPr>
-          <w:rFonts w:ascii="Courier New" w:hAnsi="Courier New" w:cs="Courier New"/>
-          <w:highlight w:val="yellow"/>
-        </w:rPr>
-        <w:t>Number of temperatures in loop:                      1</w:t>
-      </w:r>
-    </w:p>
-    <w:p>
-      <w:pPr>
-        <w:rPr>
-          <w:rFonts w:ascii="Courier New" w:hAnsi="Courier New" w:cs="Courier New"/>
-        </w:rPr>
-      </w:pPr>
-      <w:r>
-        <w:rPr>
-          <w:rFonts w:ascii="Courier New" w:hAnsi="Courier New" w:cs="Courier New"/>
-        </w:rPr>
-        <w:t xml:space="preserve">       </w:t>
-      </w:r>
-      <w:r>
-        <w:rPr>
-          <w:rFonts w:ascii="Courier New" w:hAnsi="Courier New" w:cs="Courier New"/>
-          <w:highlight w:val="yellow"/>
-        </w:rPr>
-        <w:t>Manual list for temperatures in loop:                x</w:t>
-      </w:r>
-    </w:p>
-    <w:p>
-      <w:pPr>
-        <w:rPr>
-          <w:rFonts w:ascii="Courier New" w:hAnsi="Courier New" w:cs="Courier New"/>
-        </w:rPr>
-      </w:pPr>
-      <w:r>
-        <w:rPr>
-          <w:rFonts w:ascii="Courier New" w:hAnsi="Courier New" w:cs="Courier New"/>
-        </w:rPr>
-        <w:t xml:space="preserve">       Start temperature in K:                              200</w:t>
-      </w:r>
-    </w:p>
-    <w:p>
-      <w:pPr>
-        <w:rPr>
-          <w:rFonts w:ascii="Courier New" w:hAnsi="Courier New" w:cs="Courier New"/>
-        </w:rPr>
-      </w:pPr>
-      <w:r>
-        <w:rPr>
-          <w:rFonts w:ascii="Courier New" w:hAnsi="Courier New" w:cs="Courier New"/>
-        </w:rPr>
-        <w:t xml:space="preserve">       End temperature in K:                                300</w:t>
-      </w:r>
-    </w:p>
-    <w:p>
-      <w:pPr>
-        <w:rPr>
-          <w:rFonts w:ascii="Courier New" w:hAnsi="Courier New" w:cs="Courier New"/>
-        </w:rPr>
-      </w:pPr>
-      <w:r>
-        <w:rPr>
-          <w:rFonts w:ascii="Courier New" w:hAnsi="Courier New" w:cs="Courier New"/>
-        </w:rPr>
-        <w:t xml:space="preserve">       </w:t>
-      </w:r>
-      <w:r>
-        <w:rPr>
-          <w:rFonts w:ascii="Courier New" w:hAnsi="Courier New" w:cs="Courier New"/>
-          <w:highlight w:val="yellow"/>
-        </w:rPr>
-        <w:t>Proportion on solid angle of ICR cell window:        0</w:t>
-      </w:r>
-    </w:p>
-    <w:p>
-      <w:pPr>
-        <w:rPr>
-          <w:rFonts w:ascii="Courier New" w:hAnsi="Courier New" w:cs="Courier New"/>
-        </w:rPr>
-      </w:pPr>
-      <w:r>
-        <w:rPr>
-          <w:rFonts w:ascii="Courier New" w:hAnsi="Courier New" w:cs="Courier New"/>
-        </w:rPr>
-        <w:lastRenderedPageBreak/>
-        <w:t xml:space="preserve">       Room</w:t>
-      </w:r>
-      <w:r>
-        <w:rPr>
-          <w:rFonts w:ascii="Courier New" w:hAnsi="Courier New" w:cs="Courier New"/>
-        </w:rPr>
+    </w:p>
+    <w:p>
+      <w:pPr>
+        <w:jc w:val="left"/>
+        <w:rPr>
+          <w:rFonts w:ascii="Courier New" w:hAnsi="Courier New" w:cs="Courier New"/>
+        </w:rPr>
+      </w:pPr>
+      <w:r>
+        <w:rPr>
+          <w:rFonts w:ascii="Courier New" w:hAnsi="Courier New" w:cs="Courier New"/>
+        </w:rPr>
+        <w:t xml:space="preserve">   </w:t>
+      </w:r>
+      <w:r>
+        <w:rPr>
+          <w:rFonts w:ascii="Courier New" w:hAnsi="Courier New" w:cs="Courier New"/>
+        </w:rPr>
+        <w:t xml:space="preserve">    </w:t>
+      </w:r>
+      <w:r>
+        <w:rPr>
+          <w:rFonts w:ascii="Courier New" w:hAnsi="Courier New" w:cs="Courier New"/>
+        </w:rPr>
+        <w:t>IRMPD photon energy in cm-1:                         0</w:t>
+      </w:r>
+    </w:p>
+    <w:p>
+      <w:pPr>
+        <w:jc w:val="left"/>
+      </w:pPr>
+    </w:p>
+    <w:p>
+      <w:pPr>
+        <w:jc w:val="left"/>
+      </w:pPr>
+      <w:r>
+        <w:t xml:space="preserve">The default is, that there is no infrared light source included. To model IRMPD, provide </w:t>
+      </w:r>
+      <w:r>
+        <w:t>the photon energy in cm</w:t>
+      </w:r>
+      <w:r>
+        <w:rPr>
+          <w:vertAlign w:val="superscript"/>
+        </w:rPr>
+        <w:t>-1</w:t>
+      </w:r>
+      <w:r>
+        <w:t xml:space="preserve"> and t</w:t>
+      </w:r>
+      <w:r>
+        <w:t>he rate of photon absorption</w:t>
+      </w:r>
+      <w:r>
+        <w:t xml:space="preserve"> in s</w:t>
+      </w:r>
+      <w:r>
+        <w:rPr>
+          <w:vertAlign w:val="superscript"/>
+        </w:rPr>
+        <w:t>-1</w:t>
+      </w:r>
+      <w:r>
         <w:t xml:space="preserve"> </w:t>
       </w:r>
       <w:r>
-        <w:rPr>
-          <w:rFonts w:ascii="Courier New" w:hAnsi="Courier New" w:cs="Courier New"/>
-        </w:rPr>
-        <w:t>temperature in K:                               288</w:t>
-      </w:r>
-    </w:p>
-    <w:p/>
+        <w:t xml:space="preserve">. The rate of photon absorption can be either defined for all wells, using </w:t>
+      </w:r>
+      <w:r>
+        <w:rPr>
+          <w:rFonts w:ascii="Courier New" w:hAnsi="Courier New" w:cs="Courier New"/>
+        </w:rPr>
+        <w:t>Rate of Photon absorption for Well all in s-1</w:t>
+      </w:r>
+      <w:r>
+        <w:rPr>
+          <w:rFonts w:cstheme="minorHAnsi"/>
+        </w:rPr>
+        <w:t>, or well specific, using (if needed several times), the line</w:t>
+      </w:r>
+      <w:r>
+        <w:rPr>
+          <w:rFonts w:cstheme="minorHAnsi"/>
+        </w:rPr>
+        <w:t xml:space="preserve"> </w:t>
+      </w:r>
+      <w:r>
+        <w:rPr>
+          <w:rFonts w:ascii="Courier New" w:hAnsi="Courier New" w:cs="Courier New"/>
+        </w:rPr>
+        <w:t>Rate of Photon absorption for Well 0 3 7 in s-1</w:t>
+      </w:r>
+      <w:r>
+        <w:rPr>
+          <w:rFonts w:cstheme="minorHAnsi"/>
+        </w:rPr>
+        <w:t>. For example:</w:t>
+      </w:r>
+    </w:p>
+    <w:p>
+      <w:pPr>
+        <w:jc w:val="left"/>
+        <w:rPr>
+          <w:rFonts w:ascii="Courier New" w:hAnsi="Courier New" w:cs="Courier New"/>
+        </w:rPr>
+      </w:pPr>
+      <w:r>
+        <w:rPr>
+          <w:rFonts w:ascii="Courier New" w:hAnsi="Courier New" w:cs="Courier New"/>
+        </w:rPr>
+        <w:t xml:space="preserve">      Rate of Photon absorption for Well 0 in s-1:     </w:t>
+      </w:r>
+      <w:r>
+        <w:rPr>
+          <w:rFonts w:ascii="Courier New" w:hAnsi="Courier New" w:cs="Courier New"/>
+        </w:rPr>
+        <w:t>1.3</w:t>
+      </w:r>
+    </w:p>
+    <w:p>
+      <w:pPr>
+        <w:jc w:val="left"/>
+        <w:rPr>
+          <w:rFonts w:ascii="Courier New" w:hAnsi="Courier New" w:cs="Courier New"/>
+        </w:rPr>
+      </w:pPr>
+      <w:r>
+        <w:rPr>
+          <w:rFonts w:ascii="Courier New" w:hAnsi="Courier New" w:cs="Courier New"/>
+        </w:rPr>
+        <w:t xml:space="preserve">      Rate of Photon absorption for Well </w:t>
+      </w:r>
+      <w:r>
+        <w:rPr>
+          <w:rFonts w:ascii="Courier New" w:hAnsi="Courier New" w:cs="Courier New"/>
+        </w:rPr>
+        <w:t>1 2</w:t>
+      </w:r>
+      <w:r>
+        <w:rPr>
+          <w:rFonts w:ascii="Courier New" w:hAnsi="Courier New" w:cs="Courier New"/>
+        </w:rPr>
+        <w:t xml:space="preserve"> in s-1:   </w:t>
+      </w:r>
+      <w:r>
+        <w:rPr>
+          <w:rFonts w:ascii="Courier New" w:hAnsi="Courier New" w:cs="Courier New"/>
+        </w:rPr>
+        <w:t>0.5</w:t>
+      </w:r>
+    </w:p>
+    <w:p>
+      <w:pPr>
+        <w:jc w:val="left"/>
+        <w:rPr>
+          <w:rFonts w:ascii="Courier New" w:hAnsi="Courier New" w:cs="Courier New"/>
+        </w:rPr>
+      </w:pPr>
+      <w:r>
+        <w:rPr>
+          <w:rFonts w:cstheme="minorHAnsi"/>
+        </w:rPr>
+        <w:t>If for one well several rates of photon absorption are defined, only the last one is considered.</w:t>
+      </w:r>
+      <w:r>
+        <w:rPr>
+          <w:rFonts w:ascii="Courier New" w:hAnsi="Courier New" w:cs="Courier New"/>
+        </w:rPr>
+        <w:t xml:space="preserve"> </w:t>
+      </w:r>
+    </w:p>
+    <w:p>
+      <w:pPr>
+        <w:jc w:val="left"/>
+        <w:rPr>
+          <w:rFonts w:ascii="Courier New" w:hAnsi="Courier New" w:cs="Courier New"/>
+        </w:rPr>
+      </w:pPr>
+      <w:r>
+        <w:rPr>
+          <w:rFonts w:ascii="Courier New" w:hAnsi="Courier New" w:cs="Courier New"/>
+        </w:rPr>
+        <w:t xml:space="preserve"> </w:t>
+      </w:r>
+    </w:p>
+    <w:p>
+      <w:pPr>
+        <w:jc w:val="left"/>
+        <w:rPr>
+          <w:rFonts w:cstheme="minorHAnsi"/>
+        </w:rPr>
+      </w:pPr>
+    </w:p>
+    <w:p>
+      <w:pPr>
+        <w:jc w:val="left"/>
+        <w:rPr>
+          <w:rFonts w:cstheme="minorHAnsi"/>
+        </w:rPr>
+      </w:pPr>
+    </w:p>
     <w:p>
       <w:pPr>
         <w:spacing w:after="0"/>
         <w:rPr>
-          <w:rFonts w:cstheme="minorHAnsi"/>
-        </w:rPr>
-      </w:pPr>
-      <w:r>
-        <w:t>whereby x is the temperature of interest in Kelvin. Note, that the semicolon in front of the line “Manual list for temperatures in loop” has been removed.</w:t>
-      </w:r>
-      <w:r>
-        <w:t xml:space="preserve"> </w:t>
-      </w:r>
-      <w:r>
-        <w:rPr>
-          <w:rFonts w:cstheme="minorHAnsi"/>
-        </w:rPr>
-        <w:t xml:space="preserve">The parameters </w:t>
-      </w:r>
-      <w:r>
-        <w:rPr>
-          <w:rFonts w:ascii="Courier New" w:hAnsi="Courier New" w:cs="Courier New"/>
-        </w:rPr>
-        <w:t>Start temperature in K</w:t>
-      </w:r>
-      <w:r>
-        <w:rPr>
-          <w:rFonts w:cstheme="minorHAnsi"/>
-        </w:rPr>
-        <w:t xml:space="preserve"> and </w:t>
-      </w:r>
-      <w:r>
-        <w:rPr>
-          <w:rFonts w:ascii="Courier New" w:hAnsi="Courier New" w:cs="Courier New"/>
-        </w:rPr>
-        <w:t>End temperature in K</w:t>
-      </w:r>
-      <w:r>
-        <w:rPr>
-          <w:rFonts w:cstheme="minorHAnsi"/>
-        </w:rPr>
-        <w:t xml:space="preserve"> are ignored if the line with the </w:t>
-      </w:r>
-      <w:r>
-        <w:rPr>
-          <w:rFonts w:ascii="Courier New" w:hAnsi="Courier New" w:cs="Courier New"/>
-        </w:rPr>
-        <w:t>Manual list for temperatures in loop</w:t>
-      </w:r>
-      <w:r>
-        <w:rPr>
-          <w:rFonts w:cstheme="minorHAnsi"/>
-        </w:rPr>
-        <w:t xml:space="preserve">  is active.</w:t>
-      </w:r>
+          <w:rFonts w:ascii="Courier New" w:hAnsi="Courier New" w:cs="Courier New"/>
+        </w:rPr>
+      </w:pPr>
     </w:p>
     <w:p>
       <w:pPr>
         <w:spacing w:after="0"/>
         <w:rPr>
           <w:rFonts w:cstheme="minorHAnsi"/>
-        </w:rPr>
-      </w:pPr>
-    </w:p>
-    <w:p>
-      <w:r>
-        <w:t xml:space="preserve">The MEM calculation can also be performed several times in one calculation, varying the environmental temperature. Therefore, augment the </w:t>
-      </w:r>
-      <w:r>
-        <w:rPr>
-          <w:rFonts w:ascii="Courier New" w:hAnsi="Courier New" w:cs="Courier New"/>
-        </w:rPr>
-        <w:t>Number of temperatures in loop</w:t>
-      </w:r>
-      <w:r>
-        <w:t xml:space="preserve"> and list all needed temperatures in the line </w:t>
-      </w:r>
-      <w:r>
-        <w:rPr>
-          <w:rFonts w:ascii="Courier New" w:hAnsi="Courier New" w:cs="Courier New"/>
-        </w:rPr>
-        <w:t>Manual list for temperatures in loop</w:t>
-      </w:r>
-      <w:r>
-        <w:t>, for example:</w:t>
-      </w:r>
-    </w:p>
-    <w:p>
-      <w:pPr>
-        <w:rPr>
-          <w:rFonts w:ascii="Courier New" w:hAnsi="Courier New" w:cs="Courier New"/>
-        </w:rPr>
-      </w:pPr>
-      <w:r>
-        <w:rPr>
-          <w:rFonts w:ascii="Courier New" w:hAnsi="Courier New" w:cs="Courier New"/>
-        </w:rPr>
-        <w:t xml:space="preserve">       Number of temperatures in loop:                      3</w:t>
-      </w:r>
-    </w:p>
-    <w:p>
-      <w:pPr>
-        <w:rPr>
-          <w:rFonts w:ascii="Courier New" w:hAnsi="Courier New" w:cs="Courier New"/>
-        </w:rPr>
-      </w:pPr>
-      <w:r>
-        <w:rPr>
-          <w:rFonts w:ascii="Courier New" w:hAnsi="Courier New" w:cs="Courier New"/>
-        </w:rPr>
-        <w:t xml:space="preserve">       Manual list for temperatures in loop:           200 225 250</w:t>
-      </w:r>
-    </w:p>
-    <w:p>
-      <w:pPr>
-        <w:rPr>
-          <w:rFonts w:cstheme="minorHAnsi"/>
-        </w:rPr>
-      </w:pPr>
-      <w:r>
-        <w:rPr>
-          <w:rFonts w:cstheme="minorHAnsi"/>
-        </w:rPr>
-        <w:t>T</w:t>
-      </w:r>
-      <w:r>
-        <w:rPr>
-          <w:rFonts w:cstheme="minorHAnsi"/>
-        </w:rPr>
-        <w:t xml:space="preserve">he </w:t>
-      </w:r>
-      <w:r>
-        <w:rPr>
-          <w:rFonts w:cstheme="minorHAnsi"/>
-        </w:rPr>
-        <w:t>N</w:t>
-      </w:r>
-      <w:r>
-        <w:rPr>
-          <w:rFonts w:cstheme="minorHAnsi"/>
-        </w:rPr>
-        <w:t>umber of temperatures in loop has to match the numbers of entries in the Manual list for temperatures in loop.</w:t>
-      </w:r>
-    </w:p>
-    <w:p/>
-    <w:p>
-      <w:r>
-        <w:t>Alternatively, AWATAR can calculate several temperatures such, that they are equally spaced in an Arrhenius plot, where the x-axis is the inverse temperature. Therefore, put a semicolon in front of the line “Manual list for temperatures in loop” (as it is the case for the default parameters panel) and use instead the parameters “Start temperature in K” and “End temperature in K” to define the temperature range. For example, to calculate 7 datapoints in the range of 250 K to 350 K:</w:t>
-      </w:r>
-    </w:p>
-    <w:p>
-      <w:pPr>
-        <w:rPr>
-          <w:rFonts w:ascii="Courier New" w:hAnsi="Courier New" w:cs="Courier New"/>
-        </w:rPr>
-      </w:pPr>
-      <w:r>
-        <w:rPr>
-          <w:rFonts w:ascii="Courier New" w:hAnsi="Courier New" w:cs="Courier New"/>
-        </w:rPr>
-        <w:t>;   BIRD parameters:</w:t>
-      </w:r>
-    </w:p>
-    <w:p>
-      <w:pPr>
-        <w:rPr>
-          <w:rFonts w:ascii="Courier New" w:hAnsi="Courier New" w:cs="Courier New"/>
-        </w:rPr>
-      </w:pPr>
-      <w:r>
-        <w:rPr>
-          <w:rFonts w:ascii="Courier New" w:hAnsi="Courier New" w:cs="Courier New"/>
-        </w:rPr>
-        <w:t xml:space="preserve">       Number of temperatures in loop:                      7</w:t>
-      </w:r>
-    </w:p>
-    <w:p>
-      <w:pPr>
-        <w:rPr>
-          <w:rFonts w:ascii="Courier New" w:hAnsi="Courier New" w:cs="Courier New"/>
-        </w:rPr>
-      </w:pPr>
-      <w:r>
-        <w:rPr>
-          <w:rFonts w:ascii="Courier New" w:hAnsi="Courier New" w:cs="Courier New"/>
-        </w:rPr>
-        <w:t>;      Manual list for temperatures in loop:     150.00 215.34 250.50</w:t>
-      </w:r>
-    </w:p>
-    <w:p>
-      <w:pPr>
-        <w:rPr>
-          <w:rFonts w:ascii="Courier New" w:hAnsi="Courier New" w:cs="Courier New"/>
-        </w:rPr>
-      </w:pPr>
-      <w:r>
-        <w:rPr>
-          <w:rFonts w:ascii="Courier New" w:hAnsi="Courier New" w:cs="Courier New"/>
-        </w:rPr>
-        <w:t xml:space="preserve">       Start temperature in K:                              250</w:t>
-      </w:r>
-    </w:p>
-    <w:p>
-      <w:pPr>
-        <w:rPr>
-          <w:rFonts w:ascii="Courier New" w:hAnsi="Courier New" w:cs="Courier New"/>
-        </w:rPr>
-      </w:pPr>
-      <w:r>
-        <w:rPr>
-          <w:rFonts w:ascii="Courier New" w:hAnsi="Courier New" w:cs="Courier New"/>
-        </w:rPr>
-        <w:t xml:space="preserve">       End temperature in K:                                350</w:t>
-      </w:r>
-    </w:p>
-    <w:p/>
-    <w:p>
-      <w:r>
-        <w:t>The last two parameters of the section “BIRD parameters” can be used to add a part of the solid angle, which is not at the same temperature than the rest. For example,</w:t>
-      </w:r>
-    </w:p>
-    <w:p>
-      <w:pPr>
-        <w:rPr>
-          <w:rFonts w:ascii="Courier New" w:hAnsi="Courier New" w:cs="Courier New"/>
-        </w:rPr>
-      </w:pPr>
-      <w:r>
-        <w:rPr>
-          <w:rFonts w:ascii="Courier New" w:hAnsi="Courier New" w:cs="Courier New"/>
-        </w:rPr>
-        <w:t xml:space="preserve">       Proportion on solid angle of ICR cell window:        0.002</w:t>
-      </w:r>
-    </w:p>
-    <w:p>
-      <w:pPr>
-        <w:rPr>
-          <w:rFonts w:ascii="Courier New" w:hAnsi="Courier New" w:cs="Courier New"/>
-        </w:rPr>
-      </w:pPr>
-      <w:r>
-        <w:rPr>
-          <w:rFonts w:ascii="Courier New" w:hAnsi="Courier New" w:cs="Courier New"/>
-        </w:rPr>
-        <w:t xml:space="preserve">       Room</w:t>
-      </w:r>
-      <w:r>
-        <w:rPr>
-          <w:rFonts w:ascii="Courier New" w:hAnsi="Courier New" w:cs="Courier New"/>
-        </w:rPr>
-        <w:t xml:space="preserve"> </w:t>
-      </w:r>
-      <w:r>
-        <w:rPr>
-          <w:rFonts w:ascii="Courier New" w:hAnsi="Courier New" w:cs="Courier New"/>
-        </w:rPr>
-        <w:t>temperature in K:                               288</w:t>
-      </w:r>
-    </w:p>
-    <w:p>
-      <w:r>
-        <w:t>sets 0.2% of the solid angle to a temperature of 288 K. Note, that this temperature stays the same, if the MEM is performed several times for different environmental temperatures as discussed above.</w:t>
-      </w:r>
-    </w:p>
-    <w:p/>
-    <w:p>
-      <w:r>
-        <w:t xml:space="preserve">The next part of the </w:t>
-      </w:r>
-      <w:r>
-        <w:t>“</w:t>
-      </w:r>
-      <w:r>
-        <w:t>General MEM parameters</w:t>
-      </w:r>
-      <w:r>
+          <w:color w:val="auto"/>
+        </w:rPr>
+      </w:pPr>
+      <w:r>
+        <w:rPr>
+          <w:rFonts w:cstheme="minorHAnsi"/>
+          <w:color w:val="auto"/>
+        </w:rPr>
+        <w:t>Finally, there is the parameter “</w:t>
+      </w:r>
+      <w:bookmarkStart w:id="80" w:name="Finite_time_step_at_300K"/>
+      <w:r>
+        <w:rPr>
+          <w:rFonts w:ascii="Courier New" w:hAnsi="Courier New" w:cs="Courier New"/>
+          <w:color w:val="auto"/>
+        </w:rPr>
+        <w:t>Finite time step</w:t>
+      </w:r>
+      <w:r>
+        <w:rPr>
+          <w:rFonts w:ascii="Courier New" w:hAnsi="Courier New" w:cs="Courier New"/>
+          <w:color w:val="auto"/>
+        </w:rPr>
+        <w:t xml:space="preserve"> parameter</w:t>
+      </w:r>
+      <w:bookmarkEnd w:id="80"/>
+      <w:r>
+        <w:rPr>
+          <w:rFonts w:cstheme="minorHAnsi"/>
+          <w:color w:val="auto"/>
+        </w:rPr>
         <w:t>”</w:t>
       </w:r>
       <w:r>
-        <w:t xml:space="preserve"> are the </w:t>
-      </w:r>
-      <w:r>
-        <w:t>“</w:t>
-      </w:r>
-      <w:r>
-        <w:t>IRMPD parameters</w:t>
-      </w:r>
-      <w:r>
-        <w:t>”</w:t>
-      </w:r>
-      <w:r>
-        <w:t>: This part looks like this:</w:t>
-      </w:r>
-    </w:p>
-    <w:p>
-      <w:pPr>
-        <w:rPr>
-          <w:rFonts w:ascii="Courier New" w:hAnsi="Courier New" w:cs="Courier New"/>
-        </w:rPr>
-      </w:pPr>
-      <w:r>
-        <w:rPr>
-          <w:rFonts w:ascii="Courier New" w:hAnsi="Courier New" w:cs="Courier New"/>
-        </w:rPr>
-        <w:t>;  IRMPD parameters:</w:t>
-      </w:r>
-    </w:p>
-    <w:p>
-      <w:pPr>
-        <w:rPr>
-          <w:rFonts w:ascii="Courier New" w:hAnsi="Courier New" w:cs="Courier New"/>
-        </w:rPr>
-      </w:pPr>
-      <w:r>
-        <w:rPr>
-          <w:rFonts w:ascii="Courier New" w:hAnsi="Courier New" w:cs="Courier New"/>
-        </w:rPr>
-        <w:t xml:space="preserve">       Rate of photon absorption in s-1:                    0</w:t>
-      </w:r>
-    </w:p>
-    <w:p>
-      <w:pPr>
-        <w:rPr>
-          <w:rFonts w:ascii="Courier New" w:hAnsi="Courier New" w:cs="Courier New"/>
-        </w:rPr>
-      </w:pPr>
-      <w:r>
-        <w:rPr>
-          <w:rFonts w:ascii="Courier New" w:hAnsi="Courier New" w:cs="Courier New"/>
-        </w:rPr>
-        <w:t xml:space="preserve">       IRMPD photon energy in cm-1:                         0</w:t>
-      </w:r>
-    </w:p>
-    <w:p>
-      <w:r>
-        <w:t>The default is, that there is no infrared light source included. To model IRMPD, provide the rate of photon absorption</w:t>
-      </w:r>
-      <w:r>
-        <w:t xml:space="preserve"> in s</w:t>
-      </w:r>
-      <w:r>
-        <w:rPr>
-          <w:vertAlign w:val="superscript"/>
-        </w:rPr>
-        <w:t>-1</w:t>
-      </w:r>
-      <w:r>
-        <w:t xml:space="preserve"> and the photon energy in cm</w:t>
-      </w:r>
-      <w:r>
-        <w:rPr>
-          <w:vertAlign w:val="superscript"/>
-        </w:rPr>
-        <w:t>-1</w:t>
-      </w:r>
-      <w:r>
-        <w:t>.</w:t>
+        <w:rPr>
+          <w:rFonts w:cstheme="minorHAnsi"/>
+          <w:color w:val="auto"/>
+        </w:rPr>
+        <w:t>:</w:t>
       </w:r>
     </w:p>
     <w:p>
       <w:pPr>
         <w:spacing w:after="0"/>
         <w:rPr>
-          <w:rFonts w:ascii="Courier New" w:hAnsi="Courier New" w:cs="Courier New"/>
-        </w:rPr>
-      </w:pPr>
-    </w:p>
-    <w:p>
-      <w:pPr>
-        <w:spacing w:after="0"/>
-        <w:rPr>
-          <w:rFonts w:cstheme="minorHAnsi"/>
-          <w:color w:val="auto"/>
-        </w:rPr>
-      </w:pPr>
-      <w:r>
-        <w:rPr>
-          <w:rFonts w:cstheme="minorHAnsi"/>
-          <w:color w:val="auto"/>
-        </w:rPr>
-        <w:t>Finally, there is the parameter “</w:t>
-      </w:r>
-      <w:bookmarkStart w:id="79" w:name="Finite_time_step_at_300K"/>
-      <w:r>
-        <w:rPr>
-          <w:rFonts w:ascii="Courier New" w:hAnsi="Courier New" w:cs="Courier New"/>
-          <w:color w:val="auto"/>
-        </w:rPr>
-        <w:t>Finite time step at 300 K</w:t>
-      </w:r>
-      <w:bookmarkEnd w:id="79"/>
-      <w:r>
-        <w:rPr>
-          <w:rFonts w:cstheme="minorHAnsi"/>
-          <w:color w:val="auto"/>
-        </w:rPr>
-        <w:t>”</w:t>
-      </w:r>
-      <w:r>
-        <w:rPr>
-          <w:rFonts w:cstheme="minorHAnsi"/>
-          <w:color w:val="auto"/>
-        </w:rPr>
-        <w:t>:</w:t>
-      </w:r>
-    </w:p>
-    <w:p>
-      <w:pPr>
-        <w:spacing w:after="0"/>
-        <w:rPr>
-          <w:rFonts w:cstheme="minorHAnsi"/>
-        </w:rPr>
-      </w:pPr>
-      <w:r>
-        <w:rPr>
-          <w:rFonts w:ascii="Courier New" w:hAnsi="Courier New" w:cs="Courier New"/>
-        </w:rPr>
-        <w:t xml:space="preserve">   Finite time step at 300 K:                               0.00001         </w:t>
+          <w:rFonts w:cstheme="minorHAnsi"/>
+        </w:rPr>
+      </w:pPr>
+      <w:r>
+        <w:rPr>
+          <w:rFonts w:ascii="Courier New" w:hAnsi="Courier New" w:cs="Courier New"/>
+        </w:rPr>
+        <w:t xml:space="preserve">   Finite time step </w:t>
+      </w:r>
+      <w:r>
+        <w:rPr>
+          <w:rFonts w:ascii="Courier New" w:hAnsi="Courier New" w:cs="Courier New"/>
+        </w:rPr>
+        <w:t>parameter</w:t>
+      </w:r>
+      <w:r>
+        <w:rPr>
+          <w:rFonts w:ascii="Courier New" w:hAnsi="Courier New" w:cs="Courier New"/>
+        </w:rPr>
+        <w:t xml:space="preserve">:                          0.00001         </w:t>
       </w:r>
     </w:p>
     <w:p>
@@ -16865,7 +17532,23 @@
           <w:rFonts w:cstheme="minorHAnsi"/>
           <w:color w:val="auto"/>
         </w:rPr>
-        <w:t>, i. e.</w:t>
+        <w:t xml:space="preserve">, </w:t>
+      </w:r>
+      <w:proofErr w:type="spellStart"/>
+      <w:r>
+        <w:rPr>
+          <w:rFonts w:cstheme="minorHAnsi"/>
+          <w:color w:val="auto"/>
+        </w:rPr>
+        <w:t>i</w:t>
+      </w:r>
+      <w:proofErr w:type="spellEnd"/>
+      <w:r>
+        <w:rPr>
+          <w:rFonts w:cstheme="minorHAnsi"/>
+          <w:color w:val="auto"/>
+        </w:rPr>
+        <w:t>. e.</w:t>
       </w:r>
       <w:r>
         <w:rPr>
@@ -16928,7 +17611,14 @@
           <w:rFonts w:ascii="Courier New" w:hAnsi="Courier New" w:cs="Courier New"/>
           <w:color w:val="auto"/>
         </w:rPr>
-        <w:t>Finite time step at 300 K</w:t>
+        <w:t xml:space="preserve">Finite time step </w:t>
+      </w:r>
+      <w:r>
+        <w:rPr>
+          <w:rFonts w:ascii="Courier New" w:hAnsi="Courier New" w:cs="Courier New"/>
+          <w:color w:val="auto"/>
+        </w:rPr>
+        <w:t>parameter</w:t>
       </w:r>
       <w:r>
         <w:rPr>
@@ -16942,16 +17632,9 @@
           <w:rFonts w:cstheme="minorHAnsi"/>
           <w:color w:val="auto"/>
         </w:rPr>
-        <w:t xml:space="preserve">  </w:t>
-      </w:r>
-      <w:r>
-        <w:rPr>
-          <w:rFonts w:cstheme="minorHAnsi"/>
-          <w:color w:val="auto"/>
-        </w:rPr>
-        <w:t xml:space="preserve"> should be </w:t>
-      </w:r>
-      <w:commentRangeStart w:id="80"/>
+        <w:t xml:space="preserve">should be </w:t>
+      </w:r>
+      <w:commentRangeStart w:id="81"/>
       <w:r>
         <w:rPr>
           <w:rFonts w:cstheme="minorHAnsi"/>
@@ -16959,12 +17642,12 @@
         </w:rPr>
         <w:t>as small as possible</w:t>
       </w:r>
-      <w:commentRangeEnd w:id="80"/>
+      <w:commentRangeEnd w:id="81"/>
       <w:r>
         <w:rPr>
           <w:rStyle w:val="Kommentarzeichen"/>
         </w:rPr>
-        <w:commentReference w:id="80"/>
+        <w:commentReference w:id="81"/>
       </w:r>
       <w:r>
         <w:rPr>
@@ -17053,15 +17736,7 @@
           <w:rFonts w:cstheme="minorHAnsi"/>
           <w:color w:val="auto"/>
         </w:rPr>
-        <w:t xml:space="preserve">This can be done manually, </w:t>
-      </w:r>
-      <w:r>
-        <w:rPr>
-          <w:rFonts w:cstheme="minorHAnsi"/>
-          <w:color w:val="auto"/>
-        </w:rPr>
-        <w:lastRenderedPageBreak/>
-        <w:t xml:space="preserve">by using the parameter </w:t>
+        <w:t xml:space="preserve">This can be done manually, by using the parameter </w:t>
       </w:r>
       <w:r>
         <w:rPr>
@@ -17075,7 +17750,14 @@
           <w:rFonts w:ascii="Courier New" w:hAnsi="Courier New" w:cs="Courier New"/>
           <w:color w:val="auto"/>
         </w:rPr>
-        <w:t>Finite time step at 300 K</w:t>
+        <w:t xml:space="preserve">Finite time step </w:t>
+      </w:r>
+      <w:r>
+        <w:rPr>
+          <w:rFonts w:ascii="Courier New" w:hAnsi="Courier New" w:cs="Courier New"/>
+          <w:color w:val="auto"/>
+        </w:rPr>
+        <w:t>parameter</w:t>
       </w:r>
       <w:r>
         <w:rPr>
@@ -17145,21 +17827,35 @@
           <w:rFonts w:ascii="Courier New" w:hAnsi="Courier New" w:cs="Courier New"/>
           <w:color w:val="auto"/>
         </w:rPr>
-        <w:t>Finite time step at 300 K</w:t>
-      </w:r>
-      <w:r>
-        <w:rPr>
-          <w:rFonts w:cstheme="minorHAnsi"/>
-          <w:color w:val="auto"/>
-        </w:rPr>
-        <w:t xml:space="preserve">” </w:t>
-      </w:r>
-      <w:r>
-        <w:rPr>
-          <w:rFonts w:cstheme="minorHAnsi"/>
-          <w:color w:val="auto"/>
-        </w:rPr>
-        <w:t xml:space="preserve">  defines the finite time step for an environmental temperature of 300 K, </w:t>
+        <w:t xml:space="preserve">Finite time step </w:t>
+      </w:r>
+      <w:r>
+        <w:rPr>
+          <w:rFonts w:ascii="Courier New" w:hAnsi="Courier New" w:cs="Courier New"/>
+          <w:color w:val="auto"/>
+        </w:rPr>
+        <w:t>parameter</w:t>
+      </w:r>
+      <w:r>
+        <w:rPr>
+          <w:rFonts w:cstheme="minorHAnsi"/>
+          <w:color w:val="auto"/>
+        </w:rPr>
+        <w:t>”</w:t>
+      </w:r>
+      <w:r>
+        <w:rPr>
+          <w:rFonts w:cstheme="minorHAnsi"/>
+          <w:color w:val="auto"/>
+        </w:rPr>
+        <w:t xml:space="preserve"> </w:t>
+      </w:r>
+      <w:r>
+        <w:rPr>
+          <w:rFonts w:cstheme="minorHAnsi"/>
+          <w:color w:val="auto"/>
+        </w:rPr>
+        <w:t xml:space="preserve">is for real time MEM equal to the finite time step </w:t>
       </w:r>
       <w:r>
         <w:rPr>
@@ -17174,23 +17870,29 @@
         <w:rPr>
           <w:rFonts w:cstheme="minorHAnsi"/>
           <w:color w:val="auto"/>
-          <w:vertAlign w:val="subscript"/>
-        </w:rPr>
-        <w:t>300K</w:t>
-      </w:r>
-      <w:r>
-        <w:rPr>
-          <w:rFonts w:cstheme="minorHAnsi"/>
-          <w:color w:val="auto"/>
-        </w:rPr>
-        <w:t xml:space="preserve">. </w:t>
-      </w:r>
-      <w:r>
-        <w:rPr>
-          <w:rFonts w:cstheme="minorHAnsi"/>
-          <w:color w:val="auto"/>
-        </w:rPr>
-        <w:t>For real time MEM, this time step is used for all environmental temperatures. For iterative MEM however</w:t>
+        </w:rPr>
+        <w:t xml:space="preserve"> for all temperatures. </w:t>
+      </w:r>
+      <w:r>
+        <w:rPr>
+          <w:rFonts w:cstheme="minorHAnsi"/>
+          <w:color w:val="auto"/>
+        </w:rPr>
+        <w:t xml:space="preserve">For </w:t>
+      </w:r>
+      <w:r>
+        <w:rPr>
+          <w:rFonts w:cstheme="minorHAnsi"/>
+          <w:color w:val="auto"/>
+        </w:rPr>
+        <w:t>steady state</w:t>
+      </w:r>
+      <w:r>
+        <w:rPr>
+          <w:rFonts w:cstheme="minorHAnsi"/>
+          <w:color w:val="auto"/>
+        </w:rPr>
+        <w:t xml:space="preserve"> MEM however</w:t>
       </w:r>
       <w:r>
         <w:rPr>
@@ -17211,7 +17913,49 @@
           <w:rFonts w:cstheme="minorHAnsi"/>
           <w:color w:val="auto"/>
         </w:rPr>
-        <w:t xml:space="preserve">AWATAR adapts the used finite time step </w:t>
+        <w:t xml:space="preserve">the </w:t>
+      </w:r>
+      <w:r>
+        <w:rPr>
+          <w:rFonts w:cstheme="minorHAnsi"/>
+          <w:color w:val="auto"/>
+        </w:rPr>
+        <w:t>“</w:t>
+      </w:r>
+      <w:r>
+        <w:rPr>
+          <w:rFonts w:ascii="Courier New" w:hAnsi="Courier New" w:cs="Courier New"/>
+          <w:color w:val="auto"/>
+        </w:rPr>
+        <w:t xml:space="preserve">Finite time step </w:t>
+      </w:r>
+      <w:r>
+        <w:rPr>
+          <w:rFonts w:ascii="Courier New" w:hAnsi="Courier New" w:cs="Courier New"/>
+          <w:color w:val="auto"/>
+        </w:rPr>
+        <w:t>parameter</w:t>
+      </w:r>
+      <w:r>
+        <w:rPr>
+          <w:rFonts w:cstheme="minorHAnsi"/>
+          <w:color w:val="auto"/>
+        </w:rPr>
+        <w:t xml:space="preserve">” </w:t>
+      </w:r>
+      <w:r>
+        <w:rPr>
+          <w:rFonts w:cstheme="minorHAnsi"/>
+          <w:color w:val="auto"/>
+        </w:rPr>
+        <w:t>is</w:t>
+      </w:r>
+      <w:r>
+        <w:rPr>
+          <w:rFonts w:cstheme="minorHAnsi"/>
+          <w:color w:val="auto"/>
+        </w:rPr>
+        <w:t xml:space="preserve"> the finite time step for an environmental temperature of 300 K, </w:t>
       </w:r>
       <w:r>
         <w:rPr>
@@ -17226,17 +17970,71 @@
         <w:rPr>
           <w:rFonts w:cstheme="minorHAnsi"/>
           <w:color w:val="auto"/>
-        </w:rPr>
-        <w:t xml:space="preserve"> to the used environmental temperature t</w:t>
-      </w:r>
-      <w:r>
-        <w:rPr>
-          <w:rFonts w:cstheme="minorHAnsi"/>
-          <w:color w:val="auto"/>
           <w:vertAlign w:val="subscript"/>
         </w:rPr>
+        <w:t>300K</w:t>
+      </w:r>
+      <w:r>
+        <w:rPr>
+          <w:rFonts w:cstheme="minorHAnsi"/>
+          <w:color w:val="auto"/>
+        </w:rPr>
+        <w:t xml:space="preserve">. </w:t>
+      </w:r>
+      <w:r>
+        <w:rPr>
+          <w:rFonts w:cstheme="minorHAnsi"/>
+          <w:color w:val="auto"/>
+        </w:rPr>
+        <w:t>AWATAR</w:t>
+      </w:r>
+      <w:r>
+        <w:rPr>
+          <w:rFonts w:cstheme="minorHAnsi"/>
+          <w:color w:val="auto"/>
+        </w:rPr>
+        <w:t xml:space="preserve"> then</w:t>
+      </w:r>
+      <w:r>
+        <w:rPr>
+          <w:rFonts w:cstheme="minorHAnsi"/>
+          <w:color w:val="auto"/>
+        </w:rPr>
+        <w:t xml:space="preserve"> adapts the used finite time step </w:t>
+      </w:r>
+      <w:r>
+        <w:rPr>
+          <w:rFonts w:cstheme="minorHAnsi"/>
+          <w:i/>
+          <w:iCs/>
+          <w:color w:val="auto"/>
+        </w:rPr>
+        <w:t>dt</w:t>
+      </w:r>
+      <w:r>
+        <w:rPr>
+          <w:rFonts w:cstheme="minorHAnsi"/>
+          <w:color w:val="auto"/>
+        </w:rPr>
+        <w:t xml:space="preserve"> to the used environmental temperature </w:t>
+      </w:r>
+      <w:proofErr w:type="spellStart"/>
+      <w:r>
+        <w:rPr>
+          <w:rFonts w:cstheme="minorHAnsi"/>
+          <w:color w:val="auto"/>
+        </w:rPr>
+        <w:t>t</w:t>
+      </w:r>
+      <w:r>
+        <w:rPr>
+          <w:rFonts w:cstheme="minorHAnsi"/>
+          <w:color w:val="auto"/>
+          <w:vertAlign w:val="subscript"/>
+        </w:rPr>
         <w:t>amb</w:t>
       </w:r>
+      <w:proofErr w:type="spellEnd"/>
       <w:r>
         <w:rPr>
           <w:rFonts w:cstheme="minorHAnsi"/>
@@ -17420,11 +18218,11 @@
       <w:pPr>
         <w:pStyle w:val="berschrift3"/>
       </w:pPr>
-      <w:bookmarkStart w:id="81" w:name="_Ref193818129"/>
+      <w:bookmarkStart w:id="82" w:name="_Ref193818129"/>
       <w:r>
         <w:t>Real time MEM parameters</w:t>
       </w:r>
-      <w:bookmarkEnd w:id="81"/>
+      <w:bookmarkEnd w:id="82"/>
     </w:p>
     <w:p>
       <w:r>
@@ -17552,14 +18350,14 @@
       <w:r>
         <w:t>For the performance of real time MEM, the parameter “</w:t>
       </w:r>
-      <w:bookmarkStart w:id="82" w:name="Run_MEM_in_real_time"/>
+      <w:bookmarkStart w:id="83" w:name="Run_MEM_in_real_time"/>
       <w:r>
         <w:rPr>
           <w:rFonts w:ascii="Courier New" w:hAnsi="Courier New" w:cs="Courier New"/>
         </w:rPr>
         <w:t>Run MEM in real time</w:t>
       </w:r>
-      <w:bookmarkEnd w:id="82"/>
+      <w:bookmarkEnd w:id="83"/>
       <w:r>
         <w:t>” has to be set to YES. If the steady state of a population should be calculated (</w:t>
       </w:r>
@@ -17814,14 +18612,15 @@
       <w:pPr>
         <w:pStyle w:val="berschrift3"/>
       </w:pPr>
-      <w:bookmarkStart w:id="83" w:name="_Ref193818999"/>
-      <w:r>
+      <w:bookmarkStart w:id="84" w:name="_Ref193818999"/>
+      <w:r>
+        <w:lastRenderedPageBreak/>
         <w:t>Steady state</w:t>
       </w:r>
       <w:r>
         <w:t xml:space="preserve"> MEM parameters</w:t>
       </w:r>
-      <w:bookmarkEnd w:id="83"/>
+      <w:bookmarkEnd w:id="84"/>
     </w:p>
     <w:p>
       <w:pPr>
@@ -17920,14 +18719,14 @@
         </w:rPr>
         <w:t xml:space="preserve">       </w:t>
       </w:r>
-      <w:bookmarkStart w:id="84" w:name="Minimum_time_step_at_300K"/>
+      <w:bookmarkStart w:id="85" w:name="Minimum_time_step_at_300K"/>
       <w:r>
         <w:rPr>
           <w:rFonts w:ascii="Courier New" w:hAnsi="Courier New" w:cs="Courier New"/>
         </w:rPr>
         <w:t>Minimum time step at 300 K</w:t>
       </w:r>
-      <w:bookmarkEnd w:id="84"/>
+      <w:bookmarkEnd w:id="85"/>
       <w:r>
         <w:rPr>
           <w:rFonts w:ascii="Courier New" w:hAnsi="Courier New" w:cs="Courier New"/>
@@ -17960,14 +18759,14 @@
         </w:rPr>
         <w:t xml:space="preserve">       </w:t>
       </w:r>
-      <w:bookmarkStart w:id="85" w:name="Minimum_number_of_iterations"/>
+      <w:bookmarkStart w:id="86" w:name="Minimum_number_of_iterations"/>
       <w:r>
         <w:rPr>
           <w:rFonts w:ascii="Courier New" w:hAnsi="Courier New" w:cs="Courier New"/>
         </w:rPr>
         <w:t>Minimum number of iterations</w:t>
       </w:r>
-      <w:bookmarkEnd w:id="85"/>
+      <w:bookmarkEnd w:id="86"/>
       <w:r>
         <w:rPr>
           <w:rFonts w:ascii="Courier New" w:hAnsi="Courier New" w:cs="Courier New"/>
@@ -17988,14 +18787,14 @@
         </w:rPr>
         <w:t xml:space="preserve">       </w:t>
       </w:r>
-      <w:bookmarkStart w:id="86" w:name="Convergence_parameter"/>
+      <w:bookmarkStart w:id="87" w:name="Convergence_parameter"/>
       <w:r>
         <w:rPr>
           <w:rFonts w:ascii="Courier New" w:hAnsi="Courier New" w:cs="Courier New"/>
         </w:rPr>
         <w:t>Convergence parameter</w:t>
       </w:r>
-      <w:bookmarkEnd w:id="86"/>
+      <w:bookmarkEnd w:id="87"/>
       <w:r>
         <w:rPr>
           <w:rFonts w:ascii="Courier New" w:hAnsi="Courier New" w:cs="Courier New"/>
@@ -18078,14 +18877,7 @@
         <w:rPr>
           <w:rFonts w:cstheme="minorHAnsi"/>
         </w:rPr>
-        <w:t xml:space="preserve">while the </w:t>
-      </w:r>
-      <w:r>
-        <w:rPr>
-          <w:rFonts w:cstheme="minorHAnsi"/>
-        </w:rPr>
-        <w:lastRenderedPageBreak/>
-        <w:t>“</w:t>
+        <w:t>while the “</w:t>
       </w:r>
       <w:r>
         <w:rPr>
@@ -18591,15 +19383,15 @@
       <w:pPr>
         <w:pStyle w:val="berschrift2"/>
       </w:pPr>
-      <w:bookmarkStart w:id="87" w:name="_Ref193816271"/>
-      <w:bookmarkStart w:id="88" w:name="_Ref193816395"/>
-      <w:bookmarkStart w:id="89" w:name="_Toc195989106"/>
+      <w:bookmarkStart w:id="88" w:name="_Ref193816271"/>
+      <w:bookmarkStart w:id="89" w:name="_Ref193816395"/>
+      <w:bookmarkStart w:id="90" w:name="_Toc206019408"/>
       <w:r>
         <w:t>Fit parameters</w:t>
       </w:r>
-      <w:bookmarkEnd w:id="87"/>
       <w:bookmarkEnd w:id="88"/>
       <w:bookmarkEnd w:id="89"/>
+      <w:bookmarkEnd w:id="90"/>
     </w:p>
     <w:p/>
     <w:p>
@@ -18832,6 +19624,7 @@
         <w:rPr>
           <w:rFonts w:ascii="Courier New" w:hAnsi="Courier New" w:cs="Courier New"/>
         </w:rPr>
+        <w:lastRenderedPageBreak/>
         <w:t xml:space="preserve">;      Increase degeneracy of: TS 0, TS 3, TS 24 by factor: 1.0  </w:t>
       </w:r>
     </w:p>
@@ -18904,14 +19697,7 @@
         <w:rPr>
           <w:rFonts w:cstheme="minorHAnsi"/>
         </w:rPr>
-        <w:t xml:space="preserve"> the energy defined by the panels of the respective transition states. All transition states defined by this line (here “TS 0”, “TS 1” and “TS 7”, have an energy (including  </w:t>
-      </w:r>
-      <w:r>
-        <w:rPr>
-          <w:rFonts w:cstheme="minorHAnsi"/>
-        </w:rPr>
-        <w:lastRenderedPageBreak/>
-        <w:t>zero point energy) of 3750.5 cm</w:t>
+        <w:t xml:space="preserve"> the energy defined by the panels of the respective transition states. All transition states defined by this line (here “TS 0”, “TS 1” and “TS 7”, have an energy (including  zero point energy) of 3750.5 cm</w:t>
       </w:r>
       <w:r>
         <w:rPr>
@@ -19178,14 +19964,14 @@
       <w:r>
         <w:t>The parameter “</w:t>
       </w:r>
-      <w:bookmarkStart w:id="90" w:name="Scaling_of_IR_intensities"/>
+      <w:bookmarkStart w:id="91" w:name="Scaling_of_IR_intensities"/>
       <w:r>
         <w:rPr>
           <w:rFonts w:ascii="Courier New" w:hAnsi="Courier New" w:cs="Courier New"/>
         </w:rPr>
         <w:t>Scaling of IR intensities</w:t>
       </w:r>
-      <w:bookmarkEnd w:id="90"/>
+      <w:bookmarkEnd w:id="91"/>
       <w:r>
         <w:t>” scales the used infrared intensities for all vibrational modes of all wells with the provide</w:t>
       </w:r>
@@ -19339,6 +20125,7 @@
         <w:rPr>
           <w:rFonts w:ascii="Courier New" w:hAnsi="Courier New" w:cs="Courier New"/>
         </w:rPr>
+        <w:lastRenderedPageBreak/>
         <w:t>TS-Degeneracy-</w:t>
       </w:r>
       <w:r>
@@ -19469,7 +20256,6 @@
         <w:rPr>
           <w:rFonts w:ascii="Courier New" w:hAnsi="Courier New" w:cs="Courier New"/>
         </w:rPr>
-        <w:lastRenderedPageBreak/>
         <w:t>Increase degeneracy of: TS 0              by factor: 0.5</w:t>
       </w:r>
     </w:p>
@@ -19519,11 +20305,11 @@
         <w:pStyle w:val="berschrift1"/>
         <w:spacing w:before="100" w:beforeAutospacing="1" w:after="100" w:afterAutospacing="1"/>
       </w:pPr>
-      <w:bookmarkStart w:id="91" w:name="_Toc195989107"/>
+      <w:bookmarkStart w:id="92" w:name="_Toc206019409"/>
       <w:r>
         <w:t>Acknowledgements</w:t>
       </w:r>
-      <w:bookmarkEnd w:id="91"/>
+      <w:bookmarkEnd w:id="92"/>
     </w:p>
     <w:p>
       <w:pPr>
@@ -19566,11 +20352,11 @@
           <w:r>
             <w:fldChar w:fldCharType="separate"/>
           </w:r>
-          <w:bookmarkStart w:id="92" w:name="_Toc195989108"/>
+          <w:bookmarkStart w:id="93" w:name="_Toc206019410"/>
           <w:r>
             <w:t>References</w:t>
           </w:r>
-          <w:bookmarkEnd w:id="92"/>
+          <w:bookmarkEnd w:id="93"/>
         </w:p>
         <w:p>
           <w:pPr>
@@ -19579,11 +20365,11 @@
           <w:r>
             <w:t xml:space="preserve">(1) </w:t>
           </w:r>
-          <w:bookmarkStart w:id="93" w:name="_CTVL0012c8a91b8cf0642288755978d5c87b7a8"/>
+          <w:bookmarkStart w:id="94" w:name="_CTVL0012c8a91b8cf0642288755978d5c87b7a8"/>
           <w:r>
             <w:t>Salzburger, M.; Ončák, M.; van der Linde, C.; Beyer, M. K. Simplified Multiple-Well Approach for the Master Equation Modeling of Blackbody Infrared Radiative Dissociation of Hydrated Carbonate Radical Anions.</w:t>
           </w:r>
-          <w:bookmarkEnd w:id="93"/>
+          <w:bookmarkEnd w:id="94"/>
           <w:r>
             <w:t xml:space="preserve"> </w:t>
           </w:r>
@@ -19622,11 +20408,11 @@
           <w:r>
             <w:t xml:space="preserve">(2) </w:t>
           </w:r>
-          <w:bookmarkStart w:id="94" w:name="_CTVL001e76c89cac6e54cb79f400cb880afd43e"/>
+          <w:bookmarkStart w:id="95" w:name="_CTVL001e76c89cac6e54cb79f400cb880afd43e"/>
           <w:r>
             <w:t>Salzburger, M.; Hütter, M.; van der Linde, C.; Ončák, M.; Beyer, M. K. Master equation modeling of blackbody infrared radiative dissociation (BIRD) of hydrated peroxycarbonate radical anions.</w:t>
           </w:r>
-          <w:bookmarkEnd w:id="94"/>
+          <w:bookmarkEnd w:id="95"/>
           <w:r>
             <w:t xml:space="preserve"> </w:t>
           </w:r>
@@ -19665,11 +20451,11 @@
           <w:r>
             <w:t xml:space="preserve">(3) </w:t>
           </w:r>
-          <w:bookmarkStart w:id="95" w:name="_CTVL0019a96eaa494b84cef8e952c09b2cf4dd1"/>
+          <w:bookmarkStart w:id="96" w:name="_CTVL0019a96eaa494b84cef8e952c09b2cf4dd1"/>
           <w:r>
             <w:t>Hütter, M.; Schöpfer, G.; Salzburger, M.; Beyer, M. K.; Ončák, M. Master equation modeling of water dissociation in small ionic water clusters: A</w:t>
           </w:r>
-          <w:bookmarkEnd w:id="95"/>
+          <w:bookmarkEnd w:id="96"/>
           <w:r>
             <w:t>g</w:t>
           </w:r>
@@ -19745,11 +20531,11 @@
           <w:r>
             <w:t xml:space="preserve">(4) </w:t>
           </w:r>
-          <w:bookmarkStart w:id="96" w:name="_CTVL001919e96e83c8f49beb6645d125c76fd3e"/>
+          <w:bookmarkStart w:id="97" w:name="_CTVL001919e96e83c8f49beb6645d125c76fd3e"/>
           <w:r>
             <w:t>Hartmann, J. C.; Madlener, S. J.; van der Linde, C.; Ončák, M.; Beyer, M. K. Magic Cluster Sizes of Cationic and Anionic Sodium Cloride Clusters Explained by Statistical Modelling of the Complete Phase Space.</w:t>
           </w:r>
-          <w:bookmarkEnd w:id="96"/>
+          <w:bookmarkEnd w:id="97"/>
           <w:r>
             <w:t xml:space="preserve"> </w:t>
           </w:r>
@@ -19788,12 +20574,12 @@
           <w:r>
             <w:t xml:space="preserve">(5) </w:t>
           </w:r>
-          <w:bookmarkStart w:id="97" w:name="_CTVL001d8923df2ec7b4381a25e557b062d3600"/>
+          <w:bookmarkStart w:id="98" w:name="_CTVL001d8923df2ec7b4381a25e557b062d3600"/>
           <w:r>
             <w:t>NIST Standard Reference Database 101. Precomputed vibrational scaling factors. https://​cccbdb.nist.gov​/​vibscalejustx.asp (accessed April 17, 2025).</w:t>
           </w:r>
         </w:p>
-        <w:bookmarkEnd w:id="97"/>
+        <w:bookmarkEnd w:id="98"/>
         <w:p>
           <w:pPr>
             <w:pStyle w:val="CitaviBibliographyEntry"/>
@@ -19801,11 +20587,11 @@
           <w:r>
             <w:t xml:space="preserve">(6) </w:t>
           </w:r>
-          <w:bookmarkStart w:id="98" w:name="_CTVL001b542a43c6aa740998b40af4712c4ff92"/>
+          <w:bookmarkStart w:id="99" w:name="_CTVL001b542a43c6aa740998b40af4712c4ff92"/>
           <w:r>
             <w:t>Beyer, T.; Swinehart, D. F. Algorithm 448: Number of Multiply-Restricted Partitions [A1].</w:t>
           </w:r>
-          <w:bookmarkEnd w:id="98"/>
+          <w:bookmarkEnd w:id="99"/>
           <w:r>
             <w:t xml:space="preserve"> </w:t>
           </w:r>
@@ -19844,11 +20630,11 @@
           <w:r>
             <w:t xml:space="preserve">(7) </w:t>
           </w:r>
-          <w:bookmarkStart w:id="99" w:name="_CTVL0014b8065bd3f0749c2864763d1ef06becf"/>
+          <w:bookmarkStart w:id="100" w:name="_CTVL0014b8065bd3f0749c2864763d1ef06becf"/>
           <w:r>
             <w:t>Gilbert, R. G.; Smith, S. C.</w:t>
           </w:r>
-          <w:bookmarkEnd w:id="99"/>
+          <w:bookmarkEnd w:id="100"/>
           <w:r>
             <w:t xml:space="preserve"> </w:t>
           </w:r>
@@ -19927,7 +20713,7 @@
       </w:r>
     </w:p>
   </w:comment>
-  <w:comment w:id="29" w:author="Magdalena Salzburger" w:date="2025-03-17T20:13:00Z" w:initials="MS">
+  <w:comment w:id="2" w:author="Magdalena Salzburger" w:date="2025-08-13T21:18:00Z" w:initials="MS">
     <w:p>
       <w:pPr>
         <w:pStyle w:val="Kommentartext"/>
@@ -19940,11 +20726,14 @@
         <w:annotationRef/>
       </w:r>
       <w:r>
-        <w:t>Evtl weglassen?</w:t>
+        <w:rPr>
+          <w:color w:val="000000"/>
+        </w:rPr>
+        <w:t>Außerdem Einheit von Channel 0 im results panel von Realtime MEM entfernt, mehrere Parameter umbenannt, und Wellabhängige photon absorption rate.</w:t>
       </w:r>
     </w:p>
   </w:comment>
-  <w:comment w:id="38" w:author="Magdalena Salzburger" w:date="2025-03-03T20:28:00Z" w:initials="MS">
+  <w:comment w:id="30" w:author="Magdalena Salzburger" w:date="2025-03-17T20:13:00Z" w:initials="MS">
     <w:p>
       <w:pPr>
         <w:pStyle w:val="Kommentartext"/>
@@ -19957,11 +20746,11 @@
         <w:annotationRef/>
       </w:r>
       <w:r>
-        <w:t>Diese Erklärung besser weglassen? Klingt gar nicht professionell ;-P</w:t>
+        <w:t>Evtl weglassen?</w:t>
       </w:r>
     </w:p>
   </w:comment>
-  <w:comment w:id="39" w:author="Magdalena Salzburger" w:date="2025-04-19T19:40:00Z" w:initials="MS">
+  <w:comment w:id="39" w:author="Magdalena Salzburger" w:date="2025-03-03T20:28:00Z" w:initials="MS">
     <w:p>
       <w:pPr>
         <w:pStyle w:val="Kommentartext"/>
@@ -19974,11 +20763,11 @@
         <w:annotationRef/>
       </w:r>
       <w:r>
-        <w:t>Wie verweist man da am besten drauf?</w:t>
+        <w:t>Diese Erklärung besser weglassen? Klingt gar nicht professionell ;-P</w:t>
       </w:r>
     </w:p>
   </w:comment>
-  <w:comment w:id="44" w:author="Magdalena Salzburger" w:date="2025-03-03T20:28:00Z" w:initials="MS">
+  <w:comment w:id="40" w:author="Magdalena Salzburger" w:date="2025-04-19T19:40:00Z" w:initials="MS">
     <w:p>
       <w:pPr>
         <w:pStyle w:val="Kommentartext"/>
@@ -19991,11 +20780,28 @@
         <w:annotationRef/>
       </w:r>
       <w:r>
+        <w:t>Wie verweist man da am besten drauf?</w:t>
+      </w:r>
+    </w:p>
+  </w:comment>
+  <w:comment w:id="45" w:author="Magdalena Salzburger" w:date="2025-03-03T20:28:00Z" w:initials="MS">
+    <w:p>
+      <w:pPr>
+        <w:pStyle w:val="Kommentartext"/>
+        <w:jc w:val="left"/>
+      </w:pPr>
+      <w:r>
+        <w:rPr>
+          <w:rStyle w:val="Kommentarzeichen"/>
+        </w:rPr>
+        <w:annotationRef/>
+      </w:r>
+      <w:r>
         <w:t>Diese Erklärung besser weglassen? Klingt gar nicht professionell ;-P</w:t>
       </w:r>
     </w:p>
   </w:comment>
-  <w:comment w:id="80" w:author="Magdalena Salzburger" w:date="2025-03-03T12:23:00Z" w:initials="MS">
+  <w:comment w:id="81" w:author="Magdalena Salzburger" w:date="2025-03-03T12:23:00Z" w:initials="MS">
     <w:p>
       <w:pPr>
         <w:pStyle w:val="Kommentartext"/>
@@ -20019,6 +20825,7 @@
 <w15:commentsEx xmlns:wpc="http://schemas.microsoft.com/office/word/2010/wordprocessingCanvas" xmlns:cx="http://schemas.microsoft.com/office/drawing/2014/chartex" xmlns:cx1="http://schemas.microsoft.com/office/drawing/2015/9/8/chartex" xmlns:cx2="http://schemas.microsoft.com/office/drawing/2015/10/21/chartex" xmlns:cx3="http://schemas.microsoft.com/office/drawing/2016/5/9/chartex" xmlns:cx4="http://schemas.microsoft.com/office/drawing/2016/5/10/chartex" xmlns:cx5="http://schemas.microsoft.com/office/drawing/2016/5/11/chartex" xmlns:cx6="http://schemas.microsoft.com/office/drawing/2016/5/12/chartex" xmlns:cx7="http://schemas.microsoft.com/office/drawing/2016/5/13/chartex" xmlns:cx8="http://schemas.microsoft.com/office/drawing/2016/5/14/chartex" xmlns:mc="http://schemas.openxmlformats.org/markup-compatibility/2006" xmlns:aink="http://schemas.microsoft.com/office/drawing/2016/ink" xmlns:am3d="http://schemas.microsoft.com/office/drawing/2017/model3d" xmlns:o="urn:schemas-microsoft-com:office:office" xmlns:oel="http://schemas.microsoft.com/office/2019/extlst" xmlns:r="http://schemas.openxmlformats.org/officeDocument/2006/relationships" xmlns:m="http://schemas.openxmlformats.org/officeDocument/2006/math" xmlns:v="urn:schemas-microsoft-com:vml" xmlns:wp14="http://schemas.microsoft.com/office/word/2010/wordprocessingDrawing" xmlns:wp="http://schemas.openxmlformats.org/drawingml/2006/wordprocessingDrawing" xmlns:w10="urn:schemas-microsoft-com:office:word" xmlns:w="http://schemas.openxmlformats.org/wordprocessingml/2006/main" xmlns:w14="http://schemas.microsoft.com/office/word/2010/wordml" xmlns:w15="http://schemas.microsoft.com/office/word/2012/wordml" xmlns:w16cex="http://schemas.microsoft.com/office/word/2018/wordml/cex" xmlns:w16cid="http://schemas.microsoft.com/office/word/2016/wordml/cid" xmlns:w16="http://schemas.microsoft.com/office/word/2018/wordml" xmlns:w16du="http://schemas.microsoft.com/office/word/2023/wordml/word16du" xmlns:w16sdtdh="http://schemas.microsoft.com/office/word/2020/wordml/sdtdatahash" xmlns:w16sdtfl="http://schemas.microsoft.com/office/word/2024/wordml/sdtformatlock" xmlns:w16se="http://schemas.microsoft.com/office/word/2015/wordml/symex" xmlns:wpg="http://schemas.microsoft.com/office/word/2010/wordprocessingGroup" xmlns:wpi="http://schemas.microsoft.com/office/word/2010/wordprocessingInk" xmlns:wne="http://schemas.microsoft.com/office/word/2006/wordml" xmlns:wps="http://schemas.microsoft.com/office/word/2010/wordprocessingShape" mc:Ignorable="w14 w15 w16se w16cid w16 w16cex w16sdtdh w16sdtfl w16du wp14">
   <w15:commentEx w15:paraId="16EB4FA1" w15:done="0"/>
   <w15:commentEx w15:paraId="0F222517" w15:done="0"/>
+  <w15:commentEx w15:paraId="1D6D8268" w15:paraIdParent="0F222517" w15:done="0"/>
   <w15:commentEx w15:paraId="5C7A54E3" w15:done="0"/>
   <w15:commentEx w15:paraId="2C8DE544" w15:done="0"/>
   <w15:commentEx w15:paraId="2C67D335" w15:done="0"/>
@@ -20031,6 +20838,7 @@
 <w16cex:commentsExtensible xmlns:wpc="http://schemas.microsoft.com/office/word/2010/wordprocessingCanvas" xmlns:cx="http://schemas.microsoft.com/office/drawing/2014/chartex" xmlns:cx1="http://schemas.microsoft.com/office/drawing/2015/9/8/chartex" xmlns:cx2="http://schemas.microsoft.com/office/drawing/2015/10/21/chartex" xmlns:cx3="http://schemas.microsoft.com/office/drawing/2016/5/9/chartex" xmlns:cx4="http://schemas.microsoft.com/office/drawing/2016/5/10/chartex" xmlns:cx5="http://schemas.microsoft.com/office/drawing/2016/5/11/chartex" xmlns:cx6="http://schemas.microsoft.com/office/drawing/2016/5/12/chartex" xmlns:cx7="http://schemas.microsoft.com/office/drawing/2016/5/13/chartex" xmlns:cx8="http://schemas.microsoft.com/office/drawing/2016/5/14/chartex" xmlns:cr="http://schemas.microsoft.com/office/comments/2020/reactions" xmlns:mc="http://schemas.openxmlformats.org/markup-compatibility/2006" xmlns:aink="http://schemas.microsoft.com/office/drawing/2016/ink" xmlns:am3d="http://schemas.microsoft.com/office/drawing/2017/model3d" xmlns:o="urn:schemas-microsoft-com:office:office" xmlns:oel="http://schemas.microsoft.com/office/2019/extlst" xmlns:r="http://schemas.openxmlformats.org/officeDocument/2006/relationships" xmlns:m="http://schemas.openxmlformats.org/officeDocument/2006/math" xmlns:v="urn:schemas-microsoft-com:vml" xmlns:wp14="http://schemas.microsoft.com/office/word/2010/wordprocessingDrawing" xmlns:wp="http://schemas.openxmlformats.org/drawingml/2006/wordprocessingDrawing" xmlns:w10="urn:schemas-microsoft-com:office:word" xmlns:w="http://schemas.openxmlformats.org/wordprocessingml/2006/main" xmlns:w14="http://schemas.microsoft.com/office/word/2010/wordml" xmlns:w15="http://schemas.microsoft.com/office/word/2012/wordml" xmlns:w16cex="http://schemas.microsoft.com/office/word/2018/wordml/cex" xmlns:w16cid="http://schemas.microsoft.com/office/word/2016/wordml/cid" xmlns:w16="http://schemas.microsoft.com/office/word/2018/wordml" xmlns:w16du="http://schemas.microsoft.com/office/word/2023/wordml/word16du" xmlns:w16sdtdh="http://schemas.microsoft.com/office/word/2020/wordml/sdtdatahash" xmlns:w16sdtfl="http://schemas.microsoft.com/office/word/2024/wordml/sdtformatlock" xmlns:w16se="http://schemas.microsoft.com/office/word/2015/wordml/symex" xmlns:wpg="http://schemas.microsoft.com/office/word/2010/wordprocessingGroup" xmlns:wpi="http://schemas.microsoft.com/office/word/2010/wordprocessingInk" xmlns:wne="http://schemas.microsoft.com/office/word/2006/wordml" xmlns:wps="http://schemas.microsoft.com/office/word/2010/wordprocessingShape" mc:Ignorable="w14 w15 w16se w16cid w16 w16cex w16sdtdh w16sdtfl cr w16du wp14">
   <w16cex:commentExtensible w16cex:durableId="4B49DCCE" w16cex:dateUtc="2025-04-17T15:16:00Z"/>
   <w16cex:commentExtensible w16cex:durableId="122EE63D" w16cex:dateUtc="2025-05-03T18:15:00Z"/>
+  <w16cex:commentExtensible w16cex:durableId="4A5E032A" w16cex:dateUtc="2025-08-13T19:18:00Z"/>
   <w16cex:commentExtensible w16cex:durableId="1EDE161D" w16cex:dateUtc="2025-03-17T19:13:00Z"/>
   <w16cex:commentExtensible w16cex:durableId="0C23AA47" w16cex:dateUtc="2025-03-03T19:28:00Z"/>
   <w16cex:commentExtensible w16cex:durableId="3A7E817E" w16cex:dateUtc="2025-04-19T17:40:00Z"/>
@@ -20043,6 +20851,7 @@
 <w16cid:commentsIds xmlns:wpc="http://schemas.microsoft.com/office/word/2010/wordprocessingCanvas" xmlns:cx="http://schemas.microsoft.com/office/drawing/2014/chartex" xmlns:cx1="http://schemas.microsoft.com/office/drawing/2015/9/8/chartex" xmlns:cx2="http://schemas.microsoft.com/office/drawing/2015/10/21/chartex" xmlns:cx3="http://schemas.microsoft.com/office/drawing/2016/5/9/chartex" xmlns:cx4="http://schemas.microsoft.com/office/drawing/2016/5/10/chartex" xmlns:cx5="http://schemas.microsoft.com/office/drawing/2016/5/11/chartex" xmlns:cx6="http://schemas.microsoft.com/office/drawing/2016/5/12/chartex" xmlns:cx7="http://schemas.microsoft.com/office/drawing/2016/5/13/chartex" xmlns:cx8="http://schemas.microsoft.com/office/drawing/2016/5/14/chartex" xmlns:mc="http://schemas.openxmlformats.org/markup-compatibility/2006" xmlns:aink="http://schemas.microsoft.com/office/drawing/2016/ink" xmlns:am3d="http://schemas.microsoft.com/office/drawing/2017/model3d" xmlns:o="urn:schemas-microsoft-com:office:office" xmlns:oel="http://schemas.microsoft.com/office/2019/extlst" xmlns:r="http://schemas.openxmlformats.org/officeDocument/2006/relationships" xmlns:m="http://schemas.openxmlformats.org/officeDocument/2006/math" xmlns:v="urn:schemas-microsoft-com:vml" xmlns:wp14="http://schemas.microsoft.com/office/word/2010/wordprocessingDrawing" xmlns:wp="http://schemas.openxmlformats.org/drawingml/2006/wordprocessingDrawing" xmlns:w10="urn:schemas-microsoft-com:office:word" xmlns:w="http://schemas.openxmlformats.org/wordprocessingml/2006/main" xmlns:w14="http://schemas.microsoft.com/office/word/2010/wordml" xmlns:w15="http://schemas.microsoft.com/office/word/2012/wordml" xmlns:w16cex="http://schemas.microsoft.com/office/word/2018/wordml/cex" xmlns:w16cid="http://schemas.microsoft.com/office/word/2016/wordml/cid" xmlns:w16="http://schemas.microsoft.com/office/word/2018/wordml" xmlns:w16du="http://schemas.microsoft.com/office/word/2023/wordml/word16du" xmlns:w16sdtdh="http://schemas.microsoft.com/office/word/2020/wordml/sdtdatahash" xmlns:w16sdtfl="http://schemas.microsoft.com/office/word/2024/wordml/sdtformatlock" xmlns:w16se="http://schemas.microsoft.com/office/word/2015/wordml/symex" xmlns:wpg="http://schemas.microsoft.com/office/word/2010/wordprocessingGroup" xmlns:wpi="http://schemas.microsoft.com/office/word/2010/wordprocessingInk" xmlns:wne="http://schemas.microsoft.com/office/word/2006/wordml" xmlns:wps="http://schemas.microsoft.com/office/word/2010/wordprocessingShape" mc:Ignorable="w14 w15 w16se w16cid w16 w16cex w16sdtdh w16sdtfl w16du wp14">
   <w16cid:commentId w16cid:paraId="16EB4FA1" w16cid:durableId="4B49DCCE"/>
   <w16cid:commentId w16cid:paraId="0F222517" w16cid:durableId="122EE63D"/>
+  <w16cid:commentId w16cid:paraId="1D6D8268" w16cid:durableId="4A5E032A"/>
   <w16cid:commentId w16cid:paraId="5C7A54E3" w16cid:durableId="1EDE161D"/>
   <w16cid:commentId w16cid:paraId="2C8DE544" w16cid:durableId="0C23AA47"/>
   <w16cid:commentId w16cid:paraId="2C67D335" w16cid:durableId="3A7E817E"/>
@@ -23112,7 +23921,7 @@
   <w:style w:type="paragraph" w:default="1" w:styleId="Standard">
     <w:name w:val="Normal"/>
     <w:qFormat/>
-    <w:rsid w:val="00B77134"/>
+    <w:rsid w:val="00EB6F21"/>
     <w:pPr>
       <w:spacing w:after="40" w:line="240" w:lineRule="auto"/>
       <w:jc w:val="both"/>
@@ -24376,6 +25185,7 @@
     <w:rsid w:val="00020D88"/>
     <w:rsid w:val="0003635F"/>
     <w:rsid w:val="000439F7"/>
+    <w:rsid w:val="00054D08"/>
     <w:rsid w:val="00064184"/>
     <w:rsid w:val="000748B0"/>
     <w:rsid w:val="000863D7"/>
@@ -24391,6 +25201,7 @@
     <w:rsid w:val="0020301E"/>
     <w:rsid w:val="00203C1E"/>
     <w:rsid w:val="00232293"/>
+    <w:rsid w:val="00247F94"/>
     <w:rsid w:val="002507E2"/>
     <w:rsid w:val="002561B8"/>
     <w:rsid w:val="00261AE8"/>
@@ -24494,6 +25305,7 @@
     <w:rsid w:val="00EE39D8"/>
     <w:rsid w:val="00F42C61"/>
     <w:rsid w:val="00F6306D"/>
+    <w:rsid w:val="00F64CAF"/>
     <w:rsid w:val="00F651D4"/>
     <w:rsid w:val="00F66D27"/>
     <w:rsid w:val="00FB715F"/>

</xml_diff>